<commit_message>
Add filter ablation results (12 images) to notes
Co-Authored-By: Claude Sonnet 5.5 <noreply@anthropic.com>
Claude-Session: https://claude.ai/code/session_01T6gEewJ8YaCdmnsfS34RJd
</commit_message>
<xml_diff>
--- a/results/NOTES_FINAL.docx
+++ b/results/NOTES_FINAL.docx
@@ -1619,6 +1619,1536 @@
         <w:t>حفظ التكرارات الخام ومعامل التباين، وإضافة نص الحدود.</w:t>
       </w:r>
     </w:p>
+    <w:p>
+      <w:pPr>
+        <w:pStyle w:val="Heading1"/>
+        <w:bidi/>
+      </w:pPr>
+      <w:r>
+        <w:rPr>
+          <w:rtl/>
+        </w:rPr>
+        <w:t>8. تجربة الإزالة (Ablation) للفلتر</w:t>
+      </w:r>
+    </w:p>
+    <w:tbl>
+      <w:tblPr>
+        <w:tblStyle w:val="TableGrid"/>
+        <w:tblW w:type="auto" w:w="0"/>
+        <w:tblLook w:firstColumn="1" w:firstRow="1" w:lastColumn="0" w:lastRow="0" w:noHBand="0" w:noVBand="1" w:val="04A0"/>
+      </w:tblPr>
+      <w:tblGrid>
+        <w:gridCol w:w="864"/>
+        <w:gridCol w:w="864"/>
+        <w:gridCol w:w="864"/>
+        <w:gridCol w:w="864"/>
+        <w:gridCol w:w="864"/>
+        <w:gridCol w:w="864"/>
+        <w:gridCol w:w="864"/>
+        <w:gridCol w:w="864"/>
+        <w:gridCol w:w="864"/>
+        <w:gridCol w:w="864"/>
+      </w:tblGrid>
+      <w:tr>
+        <w:tc>
+          <w:tcPr>
+            <w:tcW w:type="dxa" w:w="864"/>
+          </w:tcPr>
+          <w:p>
+            <w:r>
+              <w:t>الصورة</w:t>
+            </w:r>
+          </w:p>
+        </w:tc>
+        <w:tc>
+          <w:tcPr>
+            <w:tcW w:type="dxa" w:w="864"/>
+          </w:tcPr>
+          <w:p>
+            <w:r>
+              <w:t>CR</w:t>
+            </w:r>
+          </w:p>
+        </w:tc>
+        <w:tc>
+          <w:tcPr>
+            <w:tcW w:type="dxa" w:w="864"/>
+          </w:tcPr>
+          <w:p>
+            <w:r>
+              <w:t>MSE بدون</w:t>
+            </w:r>
+          </w:p>
+        </w:tc>
+        <w:tc>
+          <w:tcPr>
+            <w:tcW w:type="dxa" w:w="864"/>
+          </w:tcPr>
+          <w:p>
+            <w:r>
+              <w:t>MSE مع</w:t>
+            </w:r>
+          </w:p>
+        </w:tc>
+        <w:tc>
+          <w:tcPr>
+            <w:tcW w:type="dxa" w:w="864"/>
+          </w:tcPr>
+          <w:p>
+            <w:r>
+              <w:t>PSNR بدون</w:t>
+            </w:r>
+          </w:p>
+        </w:tc>
+        <w:tc>
+          <w:tcPr>
+            <w:tcW w:type="dxa" w:w="864"/>
+          </w:tcPr>
+          <w:p>
+            <w:r>
+              <w:t>PSNR مع</w:t>
+            </w:r>
+          </w:p>
+        </w:tc>
+        <w:tc>
+          <w:tcPr>
+            <w:tcW w:type="dxa" w:w="864"/>
+          </w:tcPr>
+          <w:p>
+            <w:r>
+              <w:t>فرق PSNR</w:t>
+            </w:r>
+          </w:p>
+        </w:tc>
+        <w:tc>
+          <w:tcPr>
+            <w:tcW w:type="dxa" w:w="864"/>
+          </w:tcPr>
+          <w:p>
+            <w:r>
+              <w:t>SSIM بدون</w:t>
+            </w:r>
+          </w:p>
+        </w:tc>
+        <w:tc>
+          <w:tcPr>
+            <w:tcW w:type="dxa" w:w="864"/>
+          </w:tcPr>
+          <w:p>
+            <w:r>
+              <w:t>SSIM مع</w:t>
+            </w:r>
+          </w:p>
+        </w:tc>
+        <w:tc>
+          <w:tcPr>
+            <w:tcW w:type="dxa" w:w="864"/>
+          </w:tcPr>
+          <w:p>
+            <w:r>
+              <w:t>فرق SSIM</w:t>
+            </w:r>
+          </w:p>
+        </w:tc>
+      </w:tr>
+      <w:tr>
+        <w:tc>
+          <w:tcPr>
+            <w:tcW w:type="dxa" w:w="864"/>
+          </w:tcPr>
+          <w:p>
+            <w:r>
+              <w:t>Lena</w:t>
+            </w:r>
+          </w:p>
+        </w:tc>
+        <w:tc>
+          <w:tcPr>
+            <w:tcW w:type="dxa" w:w="864"/>
+          </w:tcPr>
+          <w:p>
+            <w:r>
+              <w:t>23.50</w:t>
+            </w:r>
+          </w:p>
+        </w:tc>
+        <w:tc>
+          <w:tcPr>
+            <w:tcW w:type="dxa" w:w="864"/>
+          </w:tcPr>
+          <w:p>
+            <w:r>
+              <w:t>70.13</w:t>
+            </w:r>
+          </w:p>
+        </w:tc>
+        <w:tc>
+          <w:tcPr>
+            <w:tcW w:type="dxa" w:w="864"/>
+          </w:tcPr>
+          <w:p>
+            <w:r>
+              <w:t>58.77</w:t>
+            </w:r>
+          </w:p>
+        </w:tc>
+        <w:tc>
+          <w:tcPr>
+            <w:tcW w:type="dxa" w:w="864"/>
+          </w:tcPr>
+          <w:p>
+            <w:r>
+              <w:t>29.67</w:t>
+            </w:r>
+          </w:p>
+        </w:tc>
+        <w:tc>
+          <w:tcPr>
+            <w:tcW w:type="dxa" w:w="864"/>
+          </w:tcPr>
+          <w:p>
+            <w:r>
+              <w:t>30.44</w:t>
+            </w:r>
+          </w:p>
+        </w:tc>
+        <w:tc>
+          <w:tcPr>
+            <w:tcW w:type="dxa" w:w="864"/>
+          </w:tcPr>
+          <w:p>
+            <w:r>
+              <w:t>0.77</w:t>
+            </w:r>
+          </w:p>
+        </w:tc>
+        <w:tc>
+          <w:tcPr>
+            <w:tcW w:type="dxa" w:w="864"/>
+          </w:tcPr>
+          <w:p>
+            <w:r>
+              <w:t>0.8190</w:t>
+            </w:r>
+          </w:p>
+        </w:tc>
+        <w:tc>
+          <w:tcPr>
+            <w:tcW w:type="dxa" w:w="864"/>
+          </w:tcPr>
+          <w:p>
+            <w:r>
+              <w:t>0.8431</w:t>
+            </w:r>
+          </w:p>
+        </w:tc>
+        <w:tc>
+          <w:tcPr>
+            <w:tcW w:type="dxa" w:w="864"/>
+          </w:tcPr>
+          <w:p>
+            <w:r>
+              <w:t>0.0241</w:t>
+            </w:r>
+          </w:p>
+        </w:tc>
+      </w:tr>
+      <w:tr>
+        <w:tc>
+          <w:tcPr>
+            <w:tcW w:type="dxa" w:w="864"/>
+          </w:tcPr>
+          <w:p>
+            <w:r>
+              <w:t>Boat</w:t>
+            </w:r>
+          </w:p>
+        </w:tc>
+        <w:tc>
+          <w:tcPr>
+            <w:tcW w:type="dxa" w:w="864"/>
+          </w:tcPr>
+          <w:p>
+            <w:r>
+              <w:t>26.54</w:t>
+            </w:r>
+          </w:p>
+        </w:tc>
+        <w:tc>
+          <w:tcPr>
+            <w:tcW w:type="dxa" w:w="864"/>
+          </w:tcPr>
+          <w:p>
+            <w:r>
+              <w:t>79.88</w:t>
+            </w:r>
+          </w:p>
+        </w:tc>
+        <w:tc>
+          <w:tcPr>
+            <w:tcW w:type="dxa" w:w="864"/>
+          </w:tcPr>
+          <w:p>
+            <w:r>
+              <w:t>70.46</w:t>
+            </w:r>
+          </w:p>
+        </w:tc>
+        <w:tc>
+          <w:tcPr>
+            <w:tcW w:type="dxa" w:w="864"/>
+          </w:tcPr>
+          <w:p>
+            <w:r>
+              <w:t>29.11</w:t>
+            </w:r>
+          </w:p>
+        </w:tc>
+        <w:tc>
+          <w:tcPr>
+            <w:tcW w:type="dxa" w:w="864"/>
+          </w:tcPr>
+          <w:p>
+            <w:r>
+              <w:t>29.65</w:t>
+            </w:r>
+          </w:p>
+        </w:tc>
+        <w:tc>
+          <w:tcPr>
+            <w:tcW w:type="dxa" w:w="864"/>
+          </w:tcPr>
+          <w:p>
+            <w:r>
+              <w:t>0.54</w:t>
+            </w:r>
+          </w:p>
+        </w:tc>
+        <w:tc>
+          <w:tcPr>
+            <w:tcW w:type="dxa" w:w="864"/>
+          </w:tcPr>
+          <w:p>
+            <w:r>
+              <w:t>0.8394</w:t>
+            </w:r>
+          </w:p>
+        </w:tc>
+        <w:tc>
+          <w:tcPr>
+            <w:tcW w:type="dxa" w:w="864"/>
+          </w:tcPr>
+          <w:p>
+            <w:r>
+              <w:t>0.8522</w:t>
+            </w:r>
+          </w:p>
+        </w:tc>
+        <w:tc>
+          <w:tcPr>
+            <w:tcW w:type="dxa" w:w="864"/>
+          </w:tcPr>
+          <w:p>
+            <w:r>
+              <w:t>0.0128</w:t>
+            </w:r>
+          </w:p>
+        </w:tc>
+      </w:tr>
+      <w:tr>
+        <w:tc>
+          <w:tcPr>
+            <w:tcW w:type="dxa" w:w="864"/>
+          </w:tcPr>
+          <w:p>
+            <w:r>
+              <w:t>Cameraman</w:t>
+            </w:r>
+          </w:p>
+        </w:tc>
+        <w:tc>
+          <w:tcPr>
+            <w:tcW w:type="dxa" w:w="864"/>
+          </w:tcPr>
+          <w:p>
+            <w:r>
+              <w:t>28.88</w:t>
+            </w:r>
+          </w:p>
+        </w:tc>
+        <w:tc>
+          <w:tcPr>
+            <w:tcW w:type="dxa" w:w="864"/>
+          </w:tcPr>
+          <w:p>
+            <w:r>
+              <w:t>68.84</w:t>
+            </w:r>
+          </w:p>
+        </w:tc>
+        <w:tc>
+          <w:tcPr>
+            <w:tcW w:type="dxa" w:w="864"/>
+          </w:tcPr>
+          <w:p>
+            <w:r>
+              <w:t>56.66</w:t>
+            </w:r>
+          </w:p>
+        </w:tc>
+        <w:tc>
+          <w:tcPr>
+            <w:tcW w:type="dxa" w:w="864"/>
+          </w:tcPr>
+          <w:p>
+            <w:r>
+              <w:t>29.75</w:t>
+            </w:r>
+          </w:p>
+        </w:tc>
+        <w:tc>
+          <w:tcPr>
+            <w:tcW w:type="dxa" w:w="864"/>
+          </w:tcPr>
+          <w:p>
+            <w:r>
+              <w:t>30.60</w:t>
+            </w:r>
+          </w:p>
+        </w:tc>
+        <w:tc>
+          <w:tcPr>
+            <w:tcW w:type="dxa" w:w="864"/>
+          </w:tcPr>
+          <w:p>
+            <w:r>
+              <w:t>0.85</w:t>
+            </w:r>
+          </w:p>
+        </w:tc>
+        <w:tc>
+          <w:tcPr>
+            <w:tcW w:type="dxa" w:w="864"/>
+          </w:tcPr>
+          <w:p>
+            <w:r>
+              <w:t>0.8855</w:t>
+            </w:r>
+          </w:p>
+        </w:tc>
+        <w:tc>
+          <w:tcPr>
+            <w:tcW w:type="dxa" w:w="864"/>
+          </w:tcPr>
+          <w:p>
+            <w:r>
+              <w:t>0.9031</w:t>
+            </w:r>
+          </w:p>
+        </w:tc>
+        <w:tc>
+          <w:tcPr>
+            <w:tcW w:type="dxa" w:w="864"/>
+          </w:tcPr>
+          <w:p>
+            <w:r>
+              <w:t>0.0176</w:t>
+            </w:r>
+          </w:p>
+        </w:tc>
+      </w:tr>
+      <w:tr>
+        <w:tc>
+          <w:tcPr>
+            <w:tcW w:type="dxa" w:w="864"/>
+          </w:tcPr>
+          <w:p>
+            <w:r>
+              <w:t>Peppers</w:t>
+            </w:r>
+          </w:p>
+        </w:tc>
+        <w:tc>
+          <w:tcPr>
+            <w:tcW w:type="dxa" w:w="864"/>
+          </w:tcPr>
+          <w:p>
+            <w:r>
+              <w:t>24.75</w:t>
+            </w:r>
+          </w:p>
+        </w:tc>
+        <w:tc>
+          <w:tcPr>
+            <w:tcW w:type="dxa" w:w="864"/>
+          </w:tcPr>
+          <w:p>
+            <w:r>
+              <w:t>74.47</w:t>
+            </w:r>
+          </w:p>
+        </w:tc>
+        <w:tc>
+          <w:tcPr>
+            <w:tcW w:type="dxa" w:w="864"/>
+          </w:tcPr>
+          <w:p>
+            <w:r>
+              <w:t>61.51</w:t>
+            </w:r>
+          </w:p>
+        </w:tc>
+        <w:tc>
+          <w:tcPr>
+            <w:tcW w:type="dxa" w:w="864"/>
+          </w:tcPr>
+          <w:p>
+            <w:r>
+              <w:t>29.41</w:t>
+            </w:r>
+          </w:p>
+        </w:tc>
+        <w:tc>
+          <w:tcPr>
+            <w:tcW w:type="dxa" w:w="864"/>
+          </w:tcPr>
+          <w:p>
+            <w:r>
+              <w:t>30.24</w:t>
+            </w:r>
+          </w:p>
+        </w:tc>
+        <w:tc>
+          <w:tcPr>
+            <w:tcW w:type="dxa" w:w="864"/>
+          </w:tcPr>
+          <w:p>
+            <w:r>
+              <w:t>0.83</w:t>
+            </w:r>
+          </w:p>
+        </w:tc>
+        <w:tc>
+          <w:tcPr>
+            <w:tcW w:type="dxa" w:w="864"/>
+          </w:tcPr>
+          <w:p>
+            <w:r>
+              <w:t>0.7624</w:t>
+            </w:r>
+          </w:p>
+        </w:tc>
+        <w:tc>
+          <w:tcPr>
+            <w:tcW w:type="dxa" w:w="864"/>
+          </w:tcPr>
+          <w:p>
+            <w:r>
+              <w:t>0.7875</w:t>
+            </w:r>
+          </w:p>
+        </w:tc>
+        <w:tc>
+          <w:tcPr>
+            <w:tcW w:type="dxa" w:w="864"/>
+          </w:tcPr>
+          <w:p>
+            <w:r>
+              <w:t>0.0251</w:t>
+            </w:r>
+          </w:p>
+        </w:tc>
+      </w:tr>
+      <w:tr>
+        <w:tc>
+          <w:tcPr>
+            <w:tcW w:type="dxa" w:w="864"/>
+          </w:tcPr>
+          <w:p>
+            <w:r>
+              <w:t>Chest_X-ray</w:t>
+            </w:r>
+          </w:p>
+        </w:tc>
+        <w:tc>
+          <w:tcPr>
+            <w:tcW w:type="dxa" w:w="864"/>
+          </w:tcPr>
+          <w:p>
+            <w:r>
+              <w:t>23.39</w:t>
+            </w:r>
+          </w:p>
+        </w:tc>
+        <w:tc>
+          <w:tcPr>
+            <w:tcW w:type="dxa" w:w="864"/>
+          </w:tcPr>
+          <w:p>
+            <w:r>
+              <w:t>32.08</w:t>
+            </w:r>
+          </w:p>
+        </w:tc>
+        <w:tc>
+          <w:tcPr>
+            <w:tcW w:type="dxa" w:w="864"/>
+          </w:tcPr>
+          <w:p>
+            <w:r>
+              <w:t>25.05</w:t>
+            </w:r>
+          </w:p>
+        </w:tc>
+        <w:tc>
+          <w:tcPr>
+            <w:tcW w:type="dxa" w:w="864"/>
+          </w:tcPr>
+          <w:p>
+            <w:r>
+              <w:t>33.07</w:t>
+            </w:r>
+          </w:p>
+        </w:tc>
+        <w:tc>
+          <w:tcPr>
+            <w:tcW w:type="dxa" w:w="864"/>
+          </w:tcPr>
+          <w:p>
+            <w:r>
+              <w:t>34.14</w:t>
+            </w:r>
+          </w:p>
+        </w:tc>
+        <w:tc>
+          <w:tcPr>
+            <w:tcW w:type="dxa" w:w="864"/>
+          </w:tcPr>
+          <w:p>
+            <w:r>
+              <w:t>1.07</w:t>
+            </w:r>
+          </w:p>
+        </w:tc>
+        <w:tc>
+          <w:tcPr>
+            <w:tcW w:type="dxa" w:w="864"/>
+          </w:tcPr>
+          <w:p>
+            <w:r>
+              <w:t>0.8559</w:t>
+            </w:r>
+          </w:p>
+        </w:tc>
+        <w:tc>
+          <w:tcPr>
+            <w:tcW w:type="dxa" w:w="864"/>
+          </w:tcPr>
+          <w:p>
+            <w:r>
+              <w:t>0.8890</w:t>
+            </w:r>
+          </w:p>
+        </w:tc>
+        <w:tc>
+          <w:tcPr>
+            <w:tcW w:type="dxa" w:w="864"/>
+          </w:tcPr>
+          <w:p>
+            <w:r>
+              <w:t>0.0331</w:t>
+            </w:r>
+          </w:p>
+        </w:tc>
+      </w:tr>
+      <w:tr>
+        <w:tc>
+          <w:tcPr>
+            <w:tcW w:type="dxa" w:w="864"/>
+          </w:tcPr>
+          <w:p>
+            <w:r>
+              <w:t>Mammogram</w:t>
+            </w:r>
+          </w:p>
+        </w:tc>
+        <w:tc>
+          <w:tcPr>
+            <w:tcW w:type="dxa" w:w="864"/>
+          </w:tcPr>
+          <w:p>
+            <w:r>
+              <w:t>31.56</w:t>
+            </w:r>
+          </w:p>
+        </w:tc>
+        <w:tc>
+          <w:tcPr>
+            <w:tcW w:type="dxa" w:w="864"/>
+          </w:tcPr>
+          <w:p>
+            <w:r>
+              <w:t>18.33</w:t>
+            </w:r>
+          </w:p>
+        </w:tc>
+        <w:tc>
+          <w:tcPr>
+            <w:tcW w:type="dxa" w:w="864"/>
+          </w:tcPr>
+          <w:p>
+            <w:r>
+              <w:t>13.81</w:t>
+            </w:r>
+          </w:p>
+        </w:tc>
+        <w:tc>
+          <w:tcPr>
+            <w:tcW w:type="dxa" w:w="864"/>
+          </w:tcPr>
+          <w:p>
+            <w:r>
+              <w:t>35.50</w:t>
+            </w:r>
+          </w:p>
+        </w:tc>
+        <w:tc>
+          <w:tcPr>
+            <w:tcW w:type="dxa" w:w="864"/>
+          </w:tcPr>
+          <w:p>
+            <w:r>
+              <w:t>36.73</w:t>
+            </w:r>
+          </w:p>
+        </w:tc>
+        <w:tc>
+          <w:tcPr>
+            <w:tcW w:type="dxa" w:w="864"/>
+          </w:tcPr>
+          <w:p>
+            <w:r>
+              <w:t>1.23</w:t>
+            </w:r>
+          </w:p>
+        </w:tc>
+        <w:tc>
+          <w:tcPr>
+            <w:tcW w:type="dxa" w:w="864"/>
+          </w:tcPr>
+          <w:p>
+            <w:r>
+              <w:t>0.9129</w:t>
+            </w:r>
+          </w:p>
+        </w:tc>
+        <w:tc>
+          <w:tcPr>
+            <w:tcW w:type="dxa" w:w="864"/>
+          </w:tcPr>
+          <w:p>
+            <w:r>
+              <w:t>0.9392</w:t>
+            </w:r>
+          </w:p>
+        </w:tc>
+        <w:tc>
+          <w:tcPr>
+            <w:tcW w:type="dxa" w:w="864"/>
+          </w:tcPr>
+          <w:p>
+            <w:r>
+              <w:t>0.0263</w:t>
+            </w:r>
+          </w:p>
+        </w:tc>
+      </w:tr>
+      <w:tr>
+        <w:tc>
+          <w:tcPr>
+            <w:tcW w:type="dxa" w:w="864"/>
+          </w:tcPr>
+          <w:p>
+            <w:r>
+              <w:t>Lung_CT</w:t>
+            </w:r>
+          </w:p>
+        </w:tc>
+        <w:tc>
+          <w:tcPr>
+            <w:tcW w:type="dxa" w:w="864"/>
+          </w:tcPr>
+          <w:p>
+            <w:r>
+              <w:t>24.63</w:t>
+            </w:r>
+          </w:p>
+        </w:tc>
+        <w:tc>
+          <w:tcPr>
+            <w:tcW w:type="dxa" w:w="864"/>
+          </w:tcPr>
+          <w:p>
+            <w:r>
+              <w:t>103.37</w:t>
+            </w:r>
+          </w:p>
+        </w:tc>
+        <w:tc>
+          <w:tcPr>
+            <w:tcW w:type="dxa" w:w="864"/>
+          </w:tcPr>
+          <w:p>
+            <w:r>
+              <w:t>83.81</w:t>
+            </w:r>
+          </w:p>
+        </w:tc>
+        <w:tc>
+          <w:tcPr>
+            <w:tcW w:type="dxa" w:w="864"/>
+          </w:tcPr>
+          <w:p>
+            <w:r>
+              <w:t>27.99</w:t>
+            </w:r>
+          </w:p>
+        </w:tc>
+        <w:tc>
+          <w:tcPr>
+            <w:tcW w:type="dxa" w:w="864"/>
+          </w:tcPr>
+          <w:p>
+            <w:r>
+              <w:t>28.90</w:t>
+            </w:r>
+          </w:p>
+        </w:tc>
+        <w:tc>
+          <w:tcPr>
+            <w:tcW w:type="dxa" w:w="864"/>
+          </w:tcPr>
+          <w:p>
+            <w:r>
+              <w:t>0.91</w:t>
+            </w:r>
+          </w:p>
+        </w:tc>
+        <w:tc>
+          <w:tcPr>
+            <w:tcW w:type="dxa" w:w="864"/>
+          </w:tcPr>
+          <w:p>
+            <w:r>
+              <w:t>0.8462</w:t>
+            </w:r>
+          </w:p>
+        </w:tc>
+        <w:tc>
+          <w:tcPr>
+            <w:tcW w:type="dxa" w:w="864"/>
+          </w:tcPr>
+          <w:p>
+            <w:r>
+              <w:t>0.8666</w:t>
+            </w:r>
+          </w:p>
+        </w:tc>
+        <w:tc>
+          <w:tcPr>
+            <w:tcW w:type="dxa" w:w="864"/>
+          </w:tcPr>
+          <w:p>
+            <w:r>
+              <w:t>0.0204</w:t>
+            </w:r>
+          </w:p>
+        </w:tc>
+      </w:tr>
+      <w:tr>
+        <w:tc>
+          <w:tcPr>
+            <w:tcW w:type="dxa" w:w="864"/>
+          </w:tcPr>
+          <w:p>
+            <w:r>
+              <w:t>Brain_MRI</w:t>
+            </w:r>
+          </w:p>
+        </w:tc>
+        <w:tc>
+          <w:tcPr>
+            <w:tcW w:type="dxa" w:w="864"/>
+          </w:tcPr>
+          <w:p>
+            <w:r>
+              <w:t>33.49</w:t>
+            </w:r>
+          </w:p>
+        </w:tc>
+        <w:tc>
+          <w:tcPr>
+            <w:tcW w:type="dxa" w:w="864"/>
+          </w:tcPr>
+          <w:p>
+            <w:r>
+              <w:t>29.99</w:t>
+            </w:r>
+          </w:p>
+        </w:tc>
+        <w:tc>
+          <w:tcPr>
+            <w:tcW w:type="dxa" w:w="864"/>
+          </w:tcPr>
+          <w:p>
+            <w:r>
+              <w:t>23.08</w:t>
+            </w:r>
+          </w:p>
+        </w:tc>
+        <w:tc>
+          <w:tcPr>
+            <w:tcW w:type="dxa" w:w="864"/>
+          </w:tcPr>
+          <w:p>
+            <w:r>
+              <w:t>33.36</w:t>
+            </w:r>
+          </w:p>
+        </w:tc>
+        <w:tc>
+          <w:tcPr>
+            <w:tcW w:type="dxa" w:w="864"/>
+          </w:tcPr>
+          <w:p>
+            <w:r>
+              <w:t>34.50</w:t>
+            </w:r>
+          </w:p>
+        </w:tc>
+        <w:tc>
+          <w:tcPr>
+            <w:tcW w:type="dxa" w:w="864"/>
+          </w:tcPr>
+          <w:p>
+            <w:r>
+              <w:t>1.14</w:t>
+            </w:r>
+          </w:p>
+        </w:tc>
+        <w:tc>
+          <w:tcPr>
+            <w:tcW w:type="dxa" w:w="864"/>
+          </w:tcPr>
+          <w:p>
+            <w:r>
+              <w:t>0.9347</w:t>
+            </w:r>
+          </w:p>
+        </w:tc>
+        <w:tc>
+          <w:tcPr>
+            <w:tcW w:type="dxa" w:w="864"/>
+          </w:tcPr>
+          <w:p>
+            <w:r>
+              <w:t>0.9474</w:t>
+            </w:r>
+          </w:p>
+        </w:tc>
+        <w:tc>
+          <w:tcPr>
+            <w:tcW w:type="dxa" w:w="864"/>
+          </w:tcPr>
+          <w:p>
+            <w:r>
+              <w:t>0.0127</w:t>
+            </w:r>
+          </w:p>
+        </w:tc>
+      </w:tr>
+      <w:tr>
+        <w:tc>
+          <w:tcPr>
+            <w:tcW w:type="dxa" w:w="864"/>
+          </w:tcPr>
+          <w:p>
+            <w:r>
+              <w:t>Lena_Color</w:t>
+            </w:r>
+          </w:p>
+        </w:tc>
+        <w:tc>
+          <w:tcPr>
+            <w:tcW w:type="dxa" w:w="864"/>
+          </w:tcPr>
+          <w:p>
+            <w:r>
+              <w:t>24.00</w:t>
+            </w:r>
+          </w:p>
+        </w:tc>
+        <w:tc>
+          <w:tcPr>
+            <w:tcW w:type="dxa" w:w="864"/>
+          </w:tcPr>
+          <w:p>
+            <w:r>
+              <w:t>83.60</w:t>
+            </w:r>
+          </w:p>
+        </w:tc>
+        <w:tc>
+          <w:tcPr>
+            <w:tcW w:type="dxa" w:w="864"/>
+          </w:tcPr>
+          <w:p>
+            <w:r>
+              <w:t>75.25</w:t>
+            </w:r>
+          </w:p>
+        </w:tc>
+        <w:tc>
+          <w:tcPr>
+            <w:tcW w:type="dxa" w:w="864"/>
+          </w:tcPr>
+          <w:p>
+            <w:r>
+              <w:t>28.91</w:t>
+            </w:r>
+          </w:p>
+        </w:tc>
+        <w:tc>
+          <w:tcPr>
+            <w:tcW w:type="dxa" w:w="864"/>
+          </w:tcPr>
+          <w:p>
+            <w:r>
+              <w:t>29.37</w:t>
+            </w:r>
+          </w:p>
+        </w:tc>
+        <w:tc>
+          <w:tcPr>
+            <w:tcW w:type="dxa" w:w="864"/>
+          </w:tcPr>
+          <w:p>
+            <w:r>
+              <w:t>0.46</w:t>
+            </w:r>
+          </w:p>
+        </w:tc>
+        <w:tc>
+          <w:tcPr>
+            <w:tcW w:type="dxa" w:w="864"/>
+          </w:tcPr>
+          <w:p>
+            <w:r>
+              <w:t>0.7594</w:t>
+            </w:r>
+          </w:p>
+        </w:tc>
+        <w:tc>
+          <w:tcPr>
+            <w:tcW w:type="dxa" w:w="864"/>
+          </w:tcPr>
+          <w:p>
+            <w:r>
+              <w:t>0.7733</w:t>
+            </w:r>
+          </w:p>
+        </w:tc>
+        <w:tc>
+          <w:tcPr>
+            <w:tcW w:type="dxa" w:w="864"/>
+          </w:tcPr>
+          <w:p>
+            <w:r>
+              <w:t>0.0139</w:t>
+            </w:r>
+          </w:p>
+        </w:tc>
+      </w:tr>
+      <w:tr>
+        <w:tc>
+          <w:tcPr>
+            <w:tcW w:type="dxa" w:w="864"/>
+          </w:tcPr>
+          <w:p>
+            <w:r>
+              <w:t>Retina</w:t>
+            </w:r>
+          </w:p>
+        </w:tc>
+        <w:tc>
+          <w:tcPr>
+            <w:tcW w:type="dxa" w:w="864"/>
+          </w:tcPr>
+          <w:p>
+            <w:r>
+              <w:t>34.07</w:t>
+            </w:r>
+          </w:p>
+        </w:tc>
+        <w:tc>
+          <w:tcPr>
+            <w:tcW w:type="dxa" w:w="864"/>
+          </w:tcPr>
+          <w:p>
+            <w:r>
+              <w:t>7.30</w:t>
+            </w:r>
+          </w:p>
+        </w:tc>
+        <w:tc>
+          <w:tcPr>
+            <w:tcW w:type="dxa" w:w="864"/>
+          </w:tcPr>
+          <w:p>
+            <w:r>
+              <w:t>5.97</w:t>
+            </w:r>
+          </w:p>
+        </w:tc>
+        <w:tc>
+          <w:tcPr>
+            <w:tcW w:type="dxa" w:w="864"/>
+          </w:tcPr>
+          <w:p>
+            <w:r>
+              <w:t>39.50</w:t>
+            </w:r>
+          </w:p>
+        </w:tc>
+        <w:tc>
+          <w:tcPr>
+            <w:tcW w:type="dxa" w:w="864"/>
+          </w:tcPr>
+          <w:p>
+            <w:r>
+              <w:t>40.37</w:t>
+            </w:r>
+          </w:p>
+        </w:tc>
+        <w:tc>
+          <w:tcPr>
+            <w:tcW w:type="dxa" w:w="864"/>
+          </w:tcPr>
+          <w:p>
+            <w:r>
+              <w:t>0.87</w:t>
+            </w:r>
+          </w:p>
+        </w:tc>
+        <w:tc>
+          <w:tcPr>
+            <w:tcW w:type="dxa" w:w="864"/>
+          </w:tcPr>
+          <w:p>
+            <w:r>
+              <w:t>0.9466</w:t>
+            </w:r>
+          </w:p>
+        </w:tc>
+        <w:tc>
+          <w:tcPr>
+            <w:tcW w:type="dxa" w:w="864"/>
+          </w:tcPr>
+          <w:p>
+            <w:r>
+              <w:t>0.9541</w:t>
+            </w:r>
+          </w:p>
+        </w:tc>
+        <w:tc>
+          <w:tcPr>
+            <w:tcW w:type="dxa" w:w="864"/>
+          </w:tcPr>
+          <w:p>
+            <w:r>
+              <w:t>0.0075</w:t>
+            </w:r>
+          </w:p>
+        </w:tc>
+      </w:tr>
+      <w:tr>
+        <w:tc>
+          <w:tcPr>
+            <w:tcW w:type="dxa" w:w="864"/>
+          </w:tcPr>
+          <w:p>
+            <w:r>
+              <w:t>PET_Axial</w:t>
+            </w:r>
+          </w:p>
+        </w:tc>
+        <w:tc>
+          <w:tcPr>
+            <w:tcW w:type="dxa" w:w="864"/>
+          </w:tcPr>
+          <w:p>
+            <w:r>
+              <w:t>25.05</w:t>
+            </w:r>
+          </w:p>
+        </w:tc>
+        <w:tc>
+          <w:tcPr>
+            <w:tcW w:type="dxa" w:w="864"/>
+          </w:tcPr>
+          <w:p>
+            <w:r>
+              <w:t>125.48</w:t>
+            </w:r>
+          </w:p>
+        </w:tc>
+        <w:tc>
+          <w:tcPr>
+            <w:tcW w:type="dxa" w:w="864"/>
+          </w:tcPr>
+          <w:p>
+            <w:r>
+              <w:t>94.94</w:t>
+            </w:r>
+          </w:p>
+        </w:tc>
+        <w:tc>
+          <w:tcPr>
+            <w:tcW w:type="dxa" w:w="864"/>
+          </w:tcPr>
+          <w:p>
+            <w:r>
+              <w:t>27.14</w:t>
+            </w:r>
+          </w:p>
+        </w:tc>
+        <w:tc>
+          <w:tcPr>
+            <w:tcW w:type="dxa" w:w="864"/>
+          </w:tcPr>
+          <w:p>
+            <w:r>
+              <w:t>28.36</w:t>
+            </w:r>
+          </w:p>
+        </w:tc>
+        <w:tc>
+          <w:tcPr>
+            <w:tcW w:type="dxa" w:w="864"/>
+          </w:tcPr>
+          <w:p>
+            <w:r>
+              <w:t>1.22</w:t>
+            </w:r>
+          </w:p>
+        </w:tc>
+        <w:tc>
+          <w:tcPr>
+            <w:tcW w:type="dxa" w:w="864"/>
+          </w:tcPr>
+          <w:p>
+            <w:r>
+              <w:t>0.8529</w:t>
+            </w:r>
+          </w:p>
+        </w:tc>
+        <w:tc>
+          <w:tcPr>
+            <w:tcW w:type="dxa" w:w="864"/>
+          </w:tcPr>
+          <w:p>
+            <w:r>
+              <w:t>0.8793</w:t>
+            </w:r>
+          </w:p>
+        </w:tc>
+        <w:tc>
+          <w:tcPr>
+            <w:tcW w:type="dxa" w:w="864"/>
+          </w:tcPr>
+          <w:p>
+            <w:r>
+              <w:t>0.0264</w:t>
+            </w:r>
+          </w:p>
+        </w:tc>
+      </w:tr>
+      <w:tr>
+        <w:tc>
+          <w:tcPr>
+            <w:tcW w:type="dxa" w:w="864"/>
+          </w:tcPr>
+          <w:p>
+            <w:r>
+              <w:t>PET_Sagittal</w:t>
+            </w:r>
+          </w:p>
+        </w:tc>
+        <w:tc>
+          <w:tcPr>
+            <w:tcW w:type="dxa" w:w="864"/>
+          </w:tcPr>
+          <w:p>
+            <w:r>
+              <w:t>22.24</w:t>
+            </w:r>
+          </w:p>
+        </w:tc>
+        <w:tc>
+          <w:tcPr>
+            <w:tcW w:type="dxa" w:w="864"/>
+          </w:tcPr>
+          <w:p>
+            <w:r>
+              <w:t>80.09</w:t>
+            </w:r>
+          </w:p>
+        </w:tc>
+        <w:tc>
+          <w:tcPr>
+            <w:tcW w:type="dxa" w:w="864"/>
+          </w:tcPr>
+          <w:p>
+            <w:r>
+              <w:t>53.82</w:t>
+            </w:r>
+          </w:p>
+        </w:tc>
+        <w:tc>
+          <w:tcPr>
+            <w:tcW w:type="dxa" w:w="864"/>
+          </w:tcPr>
+          <w:p>
+            <w:r>
+              <w:t>29.10</w:t>
+            </w:r>
+          </w:p>
+        </w:tc>
+        <w:tc>
+          <w:tcPr>
+            <w:tcW w:type="dxa" w:w="864"/>
+          </w:tcPr>
+          <w:p>
+            <w:r>
+              <w:t>30.82</w:t>
+            </w:r>
+          </w:p>
+        </w:tc>
+        <w:tc>
+          <w:tcPr>
+            <w:tcW w:type="dxa" w:w="864"/>
+          </w:tcPr>
+          <w:p>
+            <w:r>
+              <w:t>1.72</w:t>
+            </w:r>
+          </w:p>
+        </w:tc>
+        <w:tc>
+          <w:tcPr>
+            <w:tcW w:type="dxa" w:w="864"/>
+          </w:tcPr>
+          <w:p>
+            <w:r>
+              <w:t>0.8604</w:t>
+            </w:r>
+          </w:p>
+        </w:tc>
+        <w:tc>
+          <w:tcPr>
+            <w:tcW w:type="dxa" w:w="864"/>
+          </w:tcPr>
+          <w:p>
+            <w:r>
+              <w:t>0.8995</w:t>
+            </w:r>
+          </w:p>
+        </w:tc>
+        <w:tc>
+          <w:tcPr>
+            <w:tcW w:type="dxa" w:w="864"/>
+          </w:tcPr>
+          <w:p>
+            <w:r>
+              <w:t>0.0391</w:t>
+            </w:r>
+          </w:p>
+        </w:tc>
+      </w:tr>
+      <w:tr>
+        <w:tc>
+          <w:tcPr>
+            <w:tcW w:type="dxa" w:w="864"/>
+          </w:tcPr>
+          <w:p>
+            <w:r>
+              <w:t>المعدل</w:t>
+            </w:r>
+          </w:p>
+        </w:tc>
+        <w:tc>
+          <w:tcPr>
+            <w:tcW w:type="dxa" w:w="864"/>
+          </w:tcPr>
+          <w:p>
+            <w:r/>
+          </w:p>
+        </w:tc>
+        <w:tc>
+          <w:tcPr>
+            <w:tcW w:type="dxa" w:w="864"/>
+          </w:tcPr>
+          <w:p>
+            <w:r>
+              <w:t>64.46</w:t>
+            </w:r>
+          </w:p>
+        </w:tc>
+        <w:tc>
+          <w:tcPr>
+            <w:tcW w:type="dxa" w:w="864"/>
+          </w:tcPr>
+          <w:p>
+            <w:r>
+              <w:t>51.93</w:t>
+            </w:r>
+          </w:p>
+        </w:tc>
+        <w:tc>
+          <w:tcPr>
+            <w:tcW w:type="dxa" w:w="864"/>
+          </w:tcPr>
+          <w:p>
+            <w:r>
+              <w:t>31.04</w:t>
+            </w:r>
+          </w:p>
+        </w:tc>
+        <w:tc>
+          <w:tcPr>
+            <w:tcW w:type="dxa" w:w="864"/>
+          </w:tcPr>
+          <w:p>
+            <w:r>
+              <w:t>32.01</w:t>
+            </w:r>
+          </w:p>
+        </w:tc>
+        <w:tc>
+          <w:tcPr>
+            <w:tcW w:type="dxa" w:w="864"/>
+          </w:tcPr>
+          <w:p>
+            <w:r>
+              <w:t>0.97</w:t>
+            </w:r>
+          </w:p>
+        </w:tc>
+        <w:tc>
+          <w:tcPr>
+            <w:tcW w:type="dxa" w:w="864"/>
+          </w:tcPr>
+          <w:p>
+            <w:r>
+              <w:t>0.8563</w:t>
+            </w:r>
+          </w:p>
+        </w:tc>
+        <w:tc>
+          <w:tcPr>
+            <w:tcW w:type="dxa" w:w="864"/>
+          </w:tcPr>
+          <w:p>
+            <w:r>
+              <w:t>0.8779</w:t>
+            </w:r>
+          </w:p>
+        </w:tc>
+        <w:tc>
+          <w:tcPr>
+            <w:tcW w:type="dxa" w:w="864"/>
+          </w:tcPr>
+          <w:p>
+            <w:r>
+              <w:t>0.0216</w:t>
+            </w:r>
+          </w:p>
+        </w:tc>
+      </w:tr>
+    </w:tbl>
+    <w:p/>
+    <w:p>
+      <w:pPr>
+        <w:pStyle w:val="ListBullet"/>
+        <w:bidi/>
+      </w:pPr>
+      <w:r>
+        <w:rPr>
+          <w:rtl/>
+        </w:rPr>
+        <w:t>الطريقة: نسخة sem_v3f/pam_v4f مع المتغير APPLY_FILTER=0؛ الضغط وCR ثابتان، يتغير فقط الصورة التي تُقاس الجودة عليها. المتسلسل والمتوازي متطابقان بالوضعين.</w:t>
+      </w:r>
+    </w:p>
+    <w:p>
+      <w:pPr>
+        <w:pStyle w:val="ListBullet"/>
+        <w:bidi/>
+      </w:pPr>
+      <w:r>
+        <w:rPr>
+          <w:rtl/>
+        </w:rPr>
+        <w:t>الفلتر حسّن PSNR وSSIM في الصور الـ12 كلها: PSNR من +0.46 إلى +1.72 dB (معدل +0.97)، SSIM معدل +0.0216، MSE ينخفض 10–33%.</w:t>
+      </w:r>
+    </w:p>
+    <w:p>
+      <w:pPr>
+        <w:pStyle w:val="ListBullet"/>
+        <w:bidi/>
+      </w:pPr>
+      <w:r>
+        <w:rPr>
+          <w:rtl/>
+        </w:rPr>
+        <w:t>أكبر كسب: PET Sagittal (+1.72 dB) وChest X-ray وPET Axial؛ أصغر كسب: Lena الملونة (+0.46) وBoat (+0.54).</w:t>
+      </w:r>
+    </w:p>
+    <w:p>
+      <w:pPr>
+        <w:pStyle w:val="ListBullet"/>
+        <w:bidi/>
+      </w:pPr>
+      <w:r>
+        <w:rPr>
+          <w:rtl/>
+        </w:rPr>
+        <w:t>الصور الملونة المنخفضة التشوه (Retina) تستفيد أقل في SSIM (+0.0075) لأن الخطأ فيها أصلاً صغير.</w:t>
+      </w:r>
+    </w:p>
+    <w:p>
+      <w:pPr>
+        <w:pStyle w:val="ListBullet"/>
+        <w:bidi/>
+      </w:pPr>
+      <w:r>
+        <w:rPr>
+          <w:rtl/>
+        </w:rPr>
+        <w:t>تنبيه: هذه مقاييس PSNR/SSIM التي تكافئ التنعيم؛ التحسن لا يعني بالضرورة جودة بصرية أفضل. لذلك اخترنا alpha=0.4 وليس أقوى.</w:t>
+      </w:r>
+    </w:p>
+    <w:p>
+      <w:pPr>
+        <w:pStyle w:val="ListBullet"/>
+        <w:bidi/>
+      </w:pPr>
+      <w:r>
+        <w:rPr>
+          <w:rtl/>
+        </w:rPr>
+        <w:t>تنبيه: المعاملات اختيرت على نفس عائلة الصور، فالنتيجة تقدير متفائل قليلاً؛ التحقق المتقاطع leave-one-out ما زال مفتوحاً.</w:t>
+      </w:r>
+    </w:p>
     <w:sectPr>
       <w:pgSz w:w="12240" w:h="15840"/>
       <w:pgMar w:top="1440" w:right="1800" w:bottom="1440" w:left="1800" w:header="720" w:footer="720" w:gutter="0"/>

</xml_diff>

<commit_message>
Add final v4 timing campaign (12 images) and update notes
Co-Authored-By: Claude Sonnet 5.5 <noreply@anthropic.com>
Claude-Session: https://claude.ai/code/session_01T6gEewJ8YaCdmnsfS34RJd
</commit_message>
<xml_diff>
--- a/results/NOTES_FINAL.docx
+++ b/results/NOTES_FINAL.docx
@@ -1340,7 +1340,7 @@
         <w:rPr>
           <w:rtl/>
         </w:rPr>
-        <w:t>أرقام الحملة النهائية بـ v4 (12 صورة) معلّقة حتى يُشغَّل run_timing_12.sh؛ هذا الملف لا يعتمد على أي رقم لم يُقَس.</w:t>
+        <w:t>الحملة النهائية بـ v4 (12 صورة) أُنجزت؛ نتائجها في القسم 9 وهي المعتمدة، وتحل محل أرقام v3s السابقة.</w:t>
       </w:r>
     </w:p>
     <w:p>
@@ -1568,7 +1568,7 @@
         <w:rPr>
           <w:rtl/>
         </w:rPr>
-        <w:t>تشغيل الحملة النهائية لـ v4 وتوليد الجدول النهائي (مطلوب منك).</w:t>
+        <w:t>(أُنجز) الحملة النهائية لـ v4 — القسم 9.</w:t>
       </w:r>
     </w:p>
     <w:p>
@@ -3147,6 +3147,607 @@
           <w:rtl/>
         </w:rPr>
         <w:t>تنبيه: المعاملات اختيرت على نفس عائلة الصور، فالنتيجة تقدير متفائل قليلاً؛ التحقق المتقاطع leave-one-out ما زال مفتوحاً.</w:t>
+      </w:r>
+    </w:p>
+    <w:p>
+      <w:pPr>
+        <w:pStyle w:val="Heading1"/>
+        <w:bidi/>
+      </w:pPr>
+      <w:r>
+        <w:rPr>
+          <w:rtl/>
+        </w:rPr>
+        <w:t>9. حملة التوقيت النهائية (sem_v3 + pam_v4)</w:t>
+      </w:r>
+    </w:p>
+    <w:p>
+      <w:r>
+        <w:t>المعدلات على الصور الـ12 (8 رمادية + 4 ملونة)، وسيط 5 تكرارات لكل حالة، البروتوكول كامل (شاحن، performance، تثبيت النوى).</w:t>
+      </w:r>
+    </w:p>
+    <w:tbl>
+      <w:tblPr>
+        <w:tblStyle w:val="TableGrid"/>
+        <w:tblW w:type="auto" w:w="0"/>
+        <w:tblLook w:firstColumn="1" w:firstRow="1" w:lastColumn="0" w:lastRow="0" w:noHBand="0" w:noVBand="1" w:val="04A0"/>
+      </w:tblPr>
+      <w:tblGrid>
+        <w:gridCol w:w="1440"/>
+        <w:gridCol w:w="1440"/>
+        <w:gridCol w:w="1440"/>
+        <w:gridCol w:w="1440"/>
+        <w:gridCol w:w="1440"/>
+        <w:gridCol w:w="1440"/>
+      </w:tblGrid>
+      <w:tr>
+        <w:tc>
+          <w:tcPr>
+            <w:tcW w:type="dxa" w:w="1440"/>
+          </w:tcPr>
+          <w:p>
+            <w:r>
+              <w:t>np</w:t>
+            </w:r>
+          </w:p>
+        </w:tc>
+        <w:tc>
+          <w:tcPr>
+            <w:tcW w:type="dxa" w:w="1440"/>
+          </w:tcPr>
+          <w:p>
+            <w:r>
+              <w:t>تسارع LBG (رمادي)</w:t>
+            </w:r>
+          </w:p>
+        </w:tc>
+        <w:tc>
+          <w:tcPr>
+            <w:tcW w:type="dxa" w:w="1440"/>
+          </w:tcPr>
+          <w:p>
+            <w:r>
+              <w:t>تسارع LBG (ملون)</w:t>
+            </w:r>
+          </w:p>
+        </w:tc>
+        <w:tc>
+          <w:tcPr>
+            <w:tcW w:type="dxa" w:w="1440"/>
+          </w:tcPr>
+          <w:p>
+            <w:r>
+              <w:t>كفاءة %</w:t>
+            </w:r>
+          </w:p>
+        </w:tc>
+        <w:tc>
+          <w:tcPr>
+            <w:tcW w:type="dxa" w:w="1440"/>
+          </w:tcPr>
+          <w:p>
+            <w:r>
+              <w:t>تسارع Total (رمادي)</w:t>
+            </w:r>
+          </w:p>
+        </w:tc>
+        <w:tc>
+          <w:tcPr>
+            <w:tcW w:type="dxa" w:w="1440"/>
+          </w:tcPr>
+          <w:p>
+            <w:r>
+              <w:t>تسارع Total (ملون)</w:t>
+            </w:r>
+          </w:p>
+        </w:tc>
+      </w:tr>
+      <w:tr>
+        <w:tc>
+          <w:tcPr>
+            <w:tcW w:type="dxa" w:w="1440"/>
+          </w:tcPr>
+          <w:p>
+            <w:r>
+              <w:t>2</w:t>
+            </w:r>
+          </w:p>
+        </w:tc>
+        <w:tc>
+          <w:tcPr>
+            <w:tcW w:type="dxa" w:w="1440"/>
+          </w:tcPr>
+          <w:p>
+            <w:r>
+              <w:t>1.92</w:t>
+            </w:r>
+          </w:p>
+        </w:tc>
+        <w:tc>
+          <w:tcPr>
+            <w:tcW w:type="dxa" w:w="1440"/>
+          </w:tcPr>
+          <w:p>
+            <w:r>
+              <w:t>1.92</w:t>
+            </w:r>
+          </w:p>
+        </w:tc>
+        <w:tc>
+          <w:tcPr>
+            <w:tcW w:type="dxa" w:w="1440"/>
+          </w:tcPr>
+          <w:p>
+            <w:r>
+              <w:t>96</w:t>
+            </w:r>
+          </w:p>
+        </w:tc>
+        <w:tc>
+          <w:tcPr>
+            <w:tcW w:type="dxa" w:w="1440"/>
+          </w:tcPr>
+          <w:p>
+            <w:r>
+              <w:t>1.72</w:t>
+            </w:r>
+          </w:p>
+        </w:tc>
+        <w:tc>
+          <w:tcPr>
+            <w:tcW w:type="dxa" w:w="1440"/>
+          </w:tcPr>
+          <w:p>
+            <w:r>
+              <w:t>1.81</w:t>
+            </w:r>
+          </w:p>
+        </w:tc>
+      </w:tr>
+      <w:tr>
+        <w:tc>
+          <w:tcPr>
+            <w:tcW w:type="dxa" w:w="1440"/>
+          </w:tcPr>
+          <w:p>
+            <w:r>
+              <w:t>4</w:t>
+            </w:r>
+          </w:p>
+        </w:tc>
+        <w:tc>
+          <w:tcPr>
+            <w:tcW w:type="dxa" w:w="1440"/>
+          </w:tcPr>
+          <w:p>
+            <w:r>
+              <w:t>3.75</w:t>
+            </w:r>
+          </w:p>
+        </w:tc>
+        <w:tc>
+          <w:tcPr>
+            <w:tcW w:type="dxa" w:w="1440"/>
+          </w:tcPr>
+          <w:p>
+            <w:r>
+              <w:t>3.77</w:t>
+            </w:r>
+          </w:p>
+        </w:tc>
+        <w:tc>
+          <w:tcPr>
+            <w:tcW w:type="dxa" w:w="1440"/>
+          </w:tcPr>
+          <w:p>
+            <w:r>
+              <w:t>94</w:t>
+            </w:r>
+          </w:p>
+        </w:tc>
+        <w:tc>
+          <w:tcPr>
+            <w:tcW w:type="dxa" w:w="1440"/>
+          </w:tcPr>
+          <w:p>
+            <w:r>
+              <w:t>2.82</w:t>
+            </w:r>
+          </w:p>
+        </w:tc>
+        <w:tc>
+          <w:tcPr>
+            <w:tcW w:type="dxa" w:w="1440"/>
+          </w:tcPr>
+          <w:p>
+            <w:r>
+              <w:t>3.20</w:t>
+            </w:r>
+          </w:p>
+        </w:tc>
+      </w:tr>
+      <w:tr>
+        <w:tc>
+          <w:tcPr>
+            <w:tcW w:type="dxa" w:w="1440"/>
+          </w:tcPr>
+          <w:p>
+            <w:r>
+              <w:t>6</w:t>
+            </w:r>
+          </w:p>
+        </w:tc>
+        <w:tc>
+          <w:tcPr>
+            <w:tcW w:type="dxa" w:w="1440"/>
+          </w:tcPr>
+          <w:p>
+            <w:r>
+              <w:t>5.37</w:t>
+            </w:r>
+          </w:p>
+        </w:tc>
+        <w:tc>
+          <w:tcPr>
+            <w:tcW w:type="dxa" w:w="1440"/>
+          </w:tcPr>
+          <w:p>
+            <w:r>
+              <w:t>5.36</w:t>
+            </w:r>
+          </w:p>
+        </w:tc>
+        <w:tc>
+          <w:tcPr>
+            <w:tcW w:type="dxa" w:w="1440"/>
+          </w:tcPr>
+          <w:p>
+            <w:r>
+              <w:t>89</w:t>
+            </w:r>
+          </w:p>
+        </w:tc>
+        <w:tc>
+          <w:tcPr>
+            <w:tcW w:type="dxa" w:w="1440"/>
+          </w:tcPr>
+          <w:p>
+            <w:r>
+              <w:t>3.48</w:t>
+            </w:r>
+          </w:p>
+        </w:tc>
+        <w:tc>
+          <w:tcPr>
+            <w:tcW w:type="dxa" w:w="1440"/>
+          </w:tcPr>
+          <w:p>
+            <w:r>
+              <w:t>4.16</w:t>
+            </w:r>
+          </w:p>
+        </w:tc>
+      </w:tr>
+      <w:tr>
+        <w:tc>
+          <w:tcPr>
+            <w:tcW w:type="dxa" w:w="1440"/>
+          </w:tcPr>
+          <w:p>
+            <w:r>
+              <w:t>8</w:t>
+            </w:r>
+          </w:p>
+        </w:tc>
+        <w:tc>
+          <w:tcPr>
+            <w:tcW w:type="dxa" w:w="1440"/>
+          </w:tcPr>
+          <w:p>
+            <w:r>
+              <w:t>6.28</w:t>
+            </w:r>
+          </w:p>
+        </w:tc>
+        <w:tc>
+          <w:tcPr>
+            <w:tcW w:type="dxa" w:w="1440"/>
+          </w:tcPr>
+          <w:p>
+            <w:r>
+              <w:t>6.26</w:t>
+            </w:r>
+          </w:p>
+        </w:tc>
+        <w:tc>
+          <w:tcPr>
+            <w:tcW w:type="dxa" w:w="1440"/>
+          </w:tcPr>
+          <w:p>
+            <w:r>
+              <w:t>78</w:t>
+            </w:r>
+          </w:p>
+        </w:tc>
+        <w:tc>
+          <w:tcPr>
+            <w:tcW w:type="dxa" w:w="1440"/>
+          </w:tcPr>
+          <w:p>
+            <w:r>
+              <w:t>3.67</w:t>
+            </w:r>
+          </w:p>
+        </w:tc>
+        <w:tc>
+          <w:tcPr>
+            <w:tcW w:type="dxa" w:w="1440"/>
+          </w:tcPr>
+          <w:p>
+            <w:r>
+              <w:t>4.47</w:t>
+            </w:r>
+          </w:p>
+        </w:tc>
+      </w:tr>
+      <w:tr>
+        <w:tc>
+          <w:tcPr>
+            <w:tcW w:type="dxa" w:w="1440"/>
+          </w:tcPr>
+          <w:p>
+            <w:r>
+              <w:t>10</w:t>
+            </w:r>
+          </w:p>
+        </w:tc>
+        <w:tc>
+          <w:tcPr>
+            <w:tcW w:type="dxa" w:w="1440"/>
+          </w:tcPr>
+          <w:p>
+            <w:r>
+              <w:t>7.32</w:t>
+            </w:r>
+          </w:p>
+        </w:tc>
+        <w:tc>
+          <w:tcPr>
+            <w:tcW w:type="dxa" w:w="1440"/>
+          </w:tcPr>
+          <w:p>
+            <w:r>
+              <w:t>7.31</w:t>
+            </w:r>
+          </w:p>
+        </w:tc>
+        <w:tc>
+          <w:tcPr>
+            <w:tcW w:type="dxa" w:w="1440"/>
+          </w:tcPr>
+          <w:p>
+            <w:r>
+              <w:t>73</w:t>
+            </w:r>
+          </w:p>
+        </w:tc>
+        <w:tc>
+          <w:tcPr>
+            <w:tcW w:type="dxa" w:w="1440"/>
+          </w:tcPr>
+          <w:p>
+            <w:r>
+              <w:t>4.00</w:t>
+            </w:r>
+          </w:p>
+        </w:tc>
+        <w:tc>
+          <w:tcPr>
+            <w:tcW w:type="dxa" w:w="1440"/>
+          </w:tcPr>
+          <w:p>
+            <w:r>
+              <w:t>4.99</w:t>
+            </w:r>
+          </w:p>
+        </w:tc>
+      </w:tr>
+      <w:tr>
+        <w:tc>
+          <w:tcPr>
+            <w:tcW w:type="dxa" w:w="1440"/>
+          </w:tcPr>
+          <w:p>
+            <w:r>
+              <w:t>12</w:t>
+            </w:r>
+          </w:p>
+        </w:tc>
+        <w:tc>
+          <w:tcPr>
+            <w:tcW w:type="dxa" w:w="1440"/>
+          </w:tcPr>
+          <w:p>
+            <w:r>
+              <w:t>8.18</w:t>
+            </w:r>
+          </w:p>
+        </w:tc>
+        <w:tc>
+          <w:tcPr>
+            <w:tcW w:type="dxa" w:w="1440"/>
+          </w:tcPr>
+          <w:p>
+            <w:r>
+              <w:t>8.18</w:t>
+            </w:r>
+          </w:p>
+        </w:tc>
+        <w:tc>
+          <w:tcPr>
+            <w:tcW w:type="dxa" w:w="1440"/>
+          </w:tcPr>
+          <w:p>
+            <w:r>
+              <w:t>68</w:t>
+            </w:r>
+          </w:p>
+        </w:tc>
+        <w:tc>
+          <w:tcPr>
+            <w:tcW w:type="dxa" w:w="1440"/>
+          </w:tcPr>
+          <w:p>
+            <w:r>
+              <w:t>4.23</w:t>
+            </w:r>
+          </w:p>
+        </w:tc>
+        <w:tc>
+          <w:tcPr>
+            <w:tcW w:type="dxa" w:w="1440"/>
+          </w:tcPr>
+          <w:p>
+            <w:r>
+              <w:t>5.40</w:t>
+            </w:r>
+          </w:p>
+        </w:tc>
+      </w:tr>
+      <w:tr>
+        <w:tc>
+          <w:tcPr>
+            <w:tcW w:type="dxa" w:w="1440"/>
+          </w:tcPr>
+          <w:p>
+            <w:r>
+              <w:t>14</w:t>
+            </w:r>
+          </w:p>
+        </w:tc>
+        <w:tc>
+          <w:tcPr>
+            <w:tcW w:type="dxa" w:w="1440"/>
+          </w:tcPr>
+          <w:p>
+            <w:r>
+              <w:t>9.13</w:t>
+            </w:r>
+          </w:p>
+        </w:tc>
+        <w:tc>
+          <w:tcPr>
+            <w:tcW w:type="dxa" w:w="1440"/>
+          </w:tcPr>
+          <w:p>
+            <w:r>
+              <w:t>9.09</w:t>
+            </w:r>
+          </w:p>
+        </w:tc>
+        <w:tc>
+          <w:tcPr>
+            <w:tcW w:type="dxa" w:w="1440"/>
+          </w:tcPr>
+          <w:p>
+            <w:r>
+              <w:t>65</w:t>
+            </w:r>
+          </w:p>
+        </w:tc>
+        <w:tc>
+          <w:tcPr>
+            <w:tcW w:type="dxa" w:w="1440"/>
+          </w:tcPr>
+          <w:p>
+            <w:r>
+              <w:t>4.45</w:t>
+            </w:r>
+          </w:p>
+        </w:tc>
+        <w:tc>
+          <w:tcPr>
+            <w:tcW w:type="dxa" w:w="1440"/>
+          </w:tcPr>
+          <w:p>
+            <w:r>
+              <w:t>5.79</w:t>
+            </w:r>
+          </w:p>
+        </w:tc>
+      </w:tr>
+    </w:tbl>
+    <w:p/>
+    <w:p>
+      <w:pPr>
+        <w:pStyle w:val="ListBullet"/>
+        <w:bidi/>
+      </w:pPr>
+      <w:r>
+        <w:rPr>
+          <w:rtl/>
+        </w:rPr>
+        <w:t>تسارع LBG عند np=14: 9.03–9.18 على كل الصور (معدل 9.12)، قريب من الحد النظري ≈9.3 للمعالج الهجين. التباين بين الصور صغير جداً (±0.1) لأن الحمل متناسب مع عدد التكرارات.</w:t>
+      </w:r>
+    </w:p>
+    <w:p>
+      <w:pPr>
+        <w:pStyle w:val="ListBullet"/>
+        <w:bidi/>
+      </w:pPr>
+      <w:r>
+        <w:rPr>
+          <w:rtl/>
+        </w:rPr>
+        <w:t>عدد تكرارات LBG ثابت في كل np ومطابق للمتسلسل في كل الصور (160، 151، 155، 132، 125، 98، 197، 142؛ ملونة 476، 493، 495، 502)، فالتسارع الحقيقي ولا يخلطه اختلاف التكرارات.</w:t>
+      </w:r>
+    </w:p>
+    <w:p>
+      <w:pPr>
+        <w:pStyle w:val="ListBullet"/>
+        <w:bidi/>
+      </w:pPr>
+      <w:r>
+        <w:rPr>
+          <w:rtl/>
+        </w:rPr>
+        <w:t>الكفاءة: 96% عند np=2 و94% عند np=4 و89% عند np=6 (نوى P فقط)، ثم تهبط إلى 78% عند np=8 و65% عند np=14 بسبب نوى E الأبطأ (نسبة ≈1.56) وليس بسبب الخوارزمية.</w:t>
+      </w:r>
+    </w:p>
+    <w:p>
+      <w:pPr>
+        <w:pStyle w:val="ListBullet"/>
+        <w:bidi/>
+      </w:pPr>
+      <w:r>
+        <w:rPr>
+          <w:rtl/>
+        </w:rPr>
+        <w:t>تسارع Total عند np=14: رمادي 4.45 (4.17–4.76)، ملون 5.79 (5.65–5.91). أقل من تسارع LBG لأن القراءة وترميز Huffman والفلتر والكتابة متسلسلة.</w:t>
+      </w:r>
+    </w:p>
+    <w:p>
+      <w:pPr>
+        <w:pStyle w:val="ListBullet"/>
+        <w:bidi/>
+      </w:pPr>
+      <w:r>
+        <w:rPr>
+          <w:rtl/>
+        </w:rPr>
+        <w:t>الصور الأصغر زمناً (Mammogram) تعطي Total أقل لأن حصة الجزء المتسلسل أكبر.</w:t>
+      </w:r>
+    </w:p>
+    <w:p>
+      <w:pPr>
+        <w:pStyle w:val="ListBullet"/>
+        <w:bidi/>
+      </w:pPr>
+      <w:r>
+        <w:rPr>
+          <w:rtl/>
+        </w:rPr>
+        <w:t>البيانات الخام: results/timing_v4.csv.</w:t>
       </w:r>
     </w:p>
     <w:sectPr>

</xml_diff>

<commit_message>
Add per-image timing tables to notes and v4 workbook; drop outdated v3 timing files
Co-Authored-By: Claude Sonnet 5.5 <noreply@anthropic.com>
Claude-Session: https://claude.ai/code/session_01T6gEewJ8YaCdmnsfS34RJd
</commit_message>
<xml_diff>
--- a/results/NOTES_FINAL.docx
+++ b/results/NOTES_FINAL.docx
@@ -3750,6 +3750,3992 @@
         <w:t>البيانات الخام: results/timing_v4.csv.</w:t>
       </w:r>
     </w:p>
+    <w:p>
+      <w:pPr>
+        <w:pStyle w:val="Heading1"/>
+        <w:bidi/>
+      </w:pPr>
+      <w:r>
+        <w:rPr>
+          <w:rtl/>
+        </w:rPr>
+        <w:t>10. جداول التوقيت التفصيلية لكل صورة (النسخة النهائية)</w:t>
+      </w:r>
+    </w:p>
+    <w:p>
+      <w:r>
+        <w:rPr>
+          <w:b/>
+        </w:rPr>
+        <w:t>تسارع LBG</w:t>
+      </w:r>
+    </w:p>
+    <w:tbl>
+      <w:tblPr>
+        <w:tblStyle w:val="TableGrid"/>
+        <w:tblW w:type="auto" w:w="0"/>
+        <w:tblLook w:firstColumn="1" w:firstRow="1" w:lastColumn="0" w:lastRow="0" w:noHBand="0" w:noVBand="1" w:val="04A0"/>
+      </w:tblPr>
+      <w:tblGrid>
+        <w:gridCol w:w="1080"/>
+        <w:gridCol w:w="1080"/>
+        <w:gridCol w:w="1080"/>
+        <w:gridCol w:w="1080"/>
+        <w:gridCol w:w="1080"/>
+        <w:gridCol w:w="1080"/>
+        <w:gridCol w:w="1080"/>
+        <w:gridCol w:w="1080"/>
+      </w:tblGrid>
+      <w:tr>
+        <w:tc>
+          <w:tcPr>
+            <w:tcW w:type="dxa" w:w="1080"/>
+          </w:tcPr>
+          <w:p>
+            <w:r>
+              <w:t>الصورة</w:t>
+            </w:r>
+          </w:p>
+        </w:tc>
+        <w:tc>
+          <w:tcPr>
+            <w:tcW w:type="dxa" w:w="1080"/>
+          </w:tcPr>
+          <w:p>
+            <w:r>
+              <w:t>np=2</w:t>
+            </w:r>
+          </w:p>
+        </w:tc>
+        <w:tc>
+          <w:tcPr>
+            <w:tcW w:type="dxa" w:w="1080"/>
+          </w:tcPr>
+          <w:p>
+            <w:r>
+              <w:t>np=4</w:t>
+            </w:r>
+          </w:p>
+        </w:tc>
+        <w:tc>
+          <w:tcPr>
+            <w:tcW w:type="dxa" w:w="1080"/>
+          </w:tcPr>
+          <w:p>
+            <w:r>
+              <w:t>np=6</w:t>
+            </w:r>
+          </w:p>
+        </w:tc>
+        <w:tc>
+          <w:tcPr>
+            <w:tcW w:type="dxa" w:w="1080"/>
+          </w:tcPr>
+          <w:p>
+            <w:r>
+              <w:t>np=8</w:t>
+            </w:r>
+          </w:p>
+        </w:tc>
+        <w:tc>
+          <w:tcPr>
+            <w:tcW w:type="dxa" w:w="1080"/>
+          </w:tcPr>
+          <w:p>
+            <w:r>
+              <w:t>np=10</w:t>
+            </w:r>
+          </w:p>
+        </w:tc>
+        <w:tc>
+          <w:tcPr>
+            <w:tcW w:type="dxa" w:w="1080"/>
+          </w:tcPr>
+          <w:p>
+            <w:r>
+              <w:t>np=12</w:t>
+            </w:r>
+          </w:p>
+        </w:tc>
+        <w:tc>
+          <w:tcPr>
+            <w:tcW w:type="dxa" w:w="1080"/>
+          </w:tcPr>
+          <w:p>
+            <w:r>
+              <w:t>np=14</w:t>
+            </w:r>
+          </w:p>
+        </w:tc>
+      </w:tr>
+      <w:tr>
+        <w:tc>
+          <w:tcPr>
+            <w:tcW w:type="dxa" w:w="1080"/>
+          </w:tcPr>
+          <w:p>
+            <w:r>
+              <w:t>gray</w:t>
+            </w:r>
+          </w:p>
+        </w:tc>
+        <w:tc>
+          <w:tcPr>
+            <w:tcW w:type="dxa" w:w="1080"/>
+          </w:tcPr>
+          <w:p>
+            <w:r>
+              <w:t>1.92</w:t>
+            </w:r>
+          </w:p>
+        </w:tc>
+        <w:tc>
+          <w:tcPr>
+            <w:tcW w:type="dxa" w:w="1080"/>
+          </w:tcPr>
+          <w:p>
+            <w:r>
+              <w:t>3.74</w:t>
+            </w:r>
+          </w:p>
+        </w:tc>
+        <w:tc>
+          <w:tcPr>
+            <w:tcW w:type="dxa" w:w="1080"/>
+          </w:tcPr>
+          <w:p>
+            <w:r>
+              <w:t>5.35</w:t>
+            </w:r>
+          </w:p>
+        </w:tc>
+        <w:tc>
+          <w:tcPr>
+            <w:tcW w:type="dxa" w:w="1080"/>
+          </w:tcPr>
+          <w:p>
+            <w:r>
+              <w:t>6.27</w:t>
+            </w:r>
+          </w:p>
+        </w:tc>
+        <w:tc>
+          <w:tcPr>
+            <w:tcW w:type="dxa" w:w="1080"/>
+          </w:tcPr>
+          <w:p>
+            <w:r>
+              <w:t>7.31</w:t>
+            </w:r>
+          </w:p>
+        </w:tc>
+        <w:tc>
+          <w:tcPr>
+            <w:tcW w:type="dxa" w:w="1080"/>
+          </w:tcPr>
+          <w:p>
+            <w:r>
+              <w:t>8.17</w:t>
+            </w:r>
+          </w:p>
+        </w:tc>
+        <w:tc>
+          <w:tcPr>
+            <w:tcW w:type="dxa" w:w="1080"/>
+          </w:tcPr>
+          <w:p>
+            <w:r>
+              <w:t>9.16</w:t>
+            </w:r>
+          </w:p>
+        </w:tc>
+      </w:tr>
+      <w:tr>
+        <w:tc>
+          <w:tcPr>
+            <w:tcW w:type="dxa" w:w="1080"/>
+          </w:tcPr>
+          <w:p>
+            <w:r>
+              <w:t>boat_img</w:t>
+            </w:r>
+          </w:p>
+        </w:tc>
+        <w:tc>
+          <w:tcPr>
+            <w:tcW w:type="dxa" w:w="1080"/>
+          </w:tcPr>
+          <w:p>
+            <w:r>
+              <w:t>1.92</w:t>
+            </w:r>
+          </w:p>
+        </w:tc>
+        <w:tc>
+          <w:tcPr>
+            <w:tcW w:type="dxa" w:w="1080"/>
+          </w:tcPr>
+          <w:p>
+            <w:r>
+              <w:t>3.75</w:t>
+            </w:r>
+          </w:p>
+        </w:tc>
+        <w:tc>
+          <w:tcPr>
+            <w:tcW w:type="dxa" w:w="1080"/>
+          </w:tcPr>
+          <w:p>
+            <w:r>
+              <w:t>5.39</w:t>
+            </w:r>
+          </w:p>
+        </w:tc>
+        <w:tc>
+          <w:tcPr>
+            <w:tcW w:type="dxa" w:w="1080"/>
+          </w:tcPr>
+          <w:p>
+            <w:r>
+              <w:t>6.28</w:t>
+            </w:r>
+          </w:p>
+        </w:tc>
+        <w:tc>
+          <w:tcPr>
+            <w:tcW w:type="dxa" w:w="1080"/>
+          </w:tcPr>
+          <w:p>
+            <w:r>
+              <w:t>7.32</w:t>
+            </w:r>
+          </w:p>
+        </w:tc>
+        <w:tc>
+          <w:tcPr>
+            <w:tcW w:type="dxa" w:w="1080"/>
+          </w:tcPr>
+          <w:p>
+            <w:r>
+              <w:t>8.18</w:t>
+            </w:r>
+          </w:p>
+        </w:tc>
+        <w:tc>
+          <w:tcPr>
+            <w:tcW w:type="dxa" w:w="1080"/>
+          </w:tcPr>
+          <w:p>
+            <w:r>
+              <w:t>9.07</w:t>
+            </w:r>
+          </w:p>
+        </w:tc>
+      </w:tr>
+      <w:tr>
+        <w:tc>
+          <w:tcPr>
+            <w:tcW w:type="dxa" w:w="1080"/>
+          </w:tcPr>
+          <w:p>
+            <w:r>
+              <w:t>cameraman_img</w:t>
+            </w:r>
+          </w:p>
+        </w:tc>
+        <w:tc>
+          <w:tcPr>
+            <w:tcW w:type="dxa" w:w="1080"/>
+          </w:tcPr>
+          <w:p>
+            <w:r>
+              <w:t>1.93</w:t>
+            </w:r>
+          </w:p>
+        </w:tc>
+        <w:tc>
+          <w:tcPr>
+            <w:tcW w:type="dxa" w:w="1080"/>
+          </w:tcPr>
+          <w:p>
+            <w:r>
+              <w:t>3.73</w:t>
+            </w:r>
+          </w:p>
+        </w:tc>
+        <w:tc>
+          <w:tcPr>
+            <w:tcW w:type="dxa" w:w="1080"/>
+          </w:tcPr>
+          <w:p>
+            <w:r>
+              <w:t>5.38</w:t>
+            </w:r>
+          </w:p>
+        </w:tc>
+        <w:tc>
+          <w:tcPr>
+            <w:tcW w:type="dxa" w:w="1080"/>
+          </w:tcPr>
+          <w:p>
+            <w:r>
+              <w:t>6.26</w:t>
+            </w:r>
+          </w:p>
+        </w:tc>
+        <w:tc>
+          <w:tcPr>
+            <w:tcW w:type="dxa" w:w="1080"/>
+          </w:tcPr>
+          <w:p>
+            <w:r>
+              <w:t>7.30</w:t>
+            </w:r>
+          </w:p>
+        </w:tc>
+        <w:tc>
+          <w:tcPr>
+            <w:tcW w:type="dxa" w:w="1080"/>
+          </w:tcPr>
+          <w:p>
+            <w:r>
+              <w:t>8.19</w:t>
+            </w:r>
+          </w:p>
+        </w:tc>
+        <w:tc>
+          <w:tcPr>
+            <w:tcW w:type="dxa" w:w="1080"/>
+          </w:tcPr>
+          <w:p>
+            <w:r>
+              <w:t>9.06</w:t>
+            </w:r>
+          </w:p>
+        </w:tc>
+      </w:tr>
+      <w:tr>
+        <w:tc>
+          <w:tcPr>
+            <w:tcW w:type="dxa" w:w="1080"/>
+          </w:tcPr>
+          <w:p>
+            <w:r>
+              <w:t>peppers_img</w:t>
+            </w:r>
+          </w:p>
+        </w:tc>
+        <w:tc>
+          <w:tcPr>
+            <w:tcW w:type="dxa" w:w="1080"/>
+          </w:tcPr>
+          <w:p>
+            <w:r>
+              <w:t>1.92</w:t>
+            </w:r>
+          </w:p>
+        </w:tc>
+        <w:tc>
+          <w:tcPr>
+            <w:tcW w:type="dxa" w:w="1080"/>
+          </w:tcPr>
+          <w:p>
+            <w:r>
+              <w:t>3.76</w:t>
+            </w:r>
+          </w:p>
+        </w:tc>
+        <w:tc>
+          <w:tcPr>
+            <w:tcW w:type="dxa" w:w="1080"/>
+          </w:tcPr>
+          <w:p>
+            <w:r>
+              <w:t>5.38</w:t>
+            </w:r>
+          </w:p>
+        </w:tc>
+        <w:tc>
+          <w:tcPr>
+            <w:tcW w:type="dxa" w:w="1080"/>
+          </w:tcPr>
+          <w:p>
+            <w:r>
+              <w:t>6.31</w:t>
+            </w:r>
+          </w:p>
+        </w:tc>
+        <w:tc>
+          <w:tcPr>
+            <w:tcW w:type="dxa" w:w="1080"/>
+          </w:tcPr>
+          <w:p>
+            <w:r>
+              <w:t>7.33</w:t>
+            </w:r>
+          </w:p>
+        </w:tc>
+        <w:tc>
+          <w:tcPr>
+            <w:tcW w:type="dxa" w:w="1080"/>
+          </w:tcPr>
+          <w:p>
+            <w:r>
+              <w:t>8.19</w:t>
+            </w:r>
+          </w:p>
+        </w:tc>
+        <w:tc>
+          <w:tcPr>
+            <w:tcW w:type="dxa" w:w="1080"/>
+          </w:tcPr>
+          <w:p>
+            <w:r>
+              <w:t>9.18</w:t>
+            </w:r>
+          </w:p>
+        </w:tc>
+      </w:tr>
+      <w:tr>
+        <w:tc>
+          <w:tcPr>
+            <w:tcW w:type="dxa" w:w="1080"/>
+          </w:tcPr>
+          <w:p>
+            <w:r>
+              <w:t>chest_xray2_img</w:t>
+            </w:r>
+          </w:p>
+        </w:tc>
+        <w:tc>
+          <w:tcPr>
+            <w:tcW w:type="dxa" w:w="1080"/>
+          </w:tcPr>
+          <w:p>
+            <w:r>
+              <w:t>1.92</w:t>
+            </w:r>
+          </w:p>
+        </w:tc>
+        <w:tc>
+          <w:tcPr>
+            <w:tcW w:type="dxa" w:w="1080"/>
+          </w:tcPr>
+          <w:p>
+            <w:r>
+              <w:t>3.77</w:t>
+            </w:r>
+          </w:p>
+        </w:tc>
+        <w:tc>
+          <w:tcPr>
+            <w:tcW w:type="dxa" w:w="1080"/>
+          </w:tcPr>
+          <w:p>
+            <w:r>
+              <w:t>5.37</w:t>
+            </w:r>
+          </w:p>
+        </w:tc>
+        <w:tc>
+          <w:tcPr>
+            <w:tcW w:type="dxa" w:w="1080"/>
+          </w:tcPr>
+          <w:p>
+            <w:r>
+              <w:t>6.28</w:t>
+            </w:r>
+          </w:p>
+        </w:tc>
+        <w:tc>
+          <w:tcPr>
+            <w:tcW w:type="dxa" w:w="1080"/>
+          </w:tcPr>
+          <w:p>
+            <w:r>
+              <w:t>7.28</w:t>
+            </w:r>
+          </w:p>
+        </w:tc>
+        <w:tc>
+          <w:tcPr>
+            <w:tcW w:type="dxa" w:w="1080"/>
+          </w:tcPr>
+          <w:p>
+            <w:r>
+              <w:t>8.15</w:t>
+            </w:r>
+          </w:p>
+        </w:tc>
+        <w:tc>
+          <w:tcPr>
+            <w:tcW w:type="dxa" w:w="1080"/>
+          </w:tcPr>
+          <w:p>
+            <w:r>
+              <w:t>9.07</w:t>
+            </w:r>
+          </w:p>
+        </w:tc>
+      </w:tr>
+      <w:tr>
+        <w:tc>
+          <w:tcPr>
+            <w:tcW w:type="dxa" w:w="1080"/>
+          </w:tcPr>
+          <w:p>
+            <w:r>
+              <w:t>mammo2_img</w:t>
+            </w:r>
+          </w:p>
+        </w:tc>
+        <w:tc>
+          <w:tcPr>
+            <w:tcW w:type="dxa" w:w="1080"/>
+          </w:tcPr>
+          <w:p>
+            <w:r>
+              <w:t>1.92</w:t>
+            </w:r>
+          </w:p>
+        </w:tc>
+        <w:tc>
+          <w:tcPr>
+            <w:tcW w:type="dxa" w:w="1080"/>
+          </w:tcPr>
+          <w:p>
+            <w:r>
+              <w:t>3.76</w:t>
+            </w:r>
+          </w:p>
+        </w:tc>
+        <w:tc>
+          <w:tcPr>
+            <w:tcW w:type="dxa" w:w="1080"/>
+          </w:tcPr>
+          <w:p>
+            <w:r>
+              <w:t>5.38</w:t>
+            </w:r>
+          </w:p>
+        </w:tc>
+        <w:tc>
+          <w:tcPr>
+            <w:tcW w:type="dxa" w:w="1080"/>
+          </w:tcPr>
+          <w:p>
+            <w:r>
+              <w:t>6.28</w:t>
+            </w:r>
+          </w:p>
+        </w:tc>
+        <w:tc>
+          <w:tcPr>
+            <w:tcW w:type="dxa" w:w="1080"/>
+          </w:tcPr>
+          <w:p>
+            <w:r>
+              <w:t>7.32</w:t>
+            </w:r>
+          </w:p>
+        </w:tc>
+        <w:tc>
+          <w:tcPr>
+            <w:tcW w:type="dxa" w:w="1080"/>
+          </w:tcPr>
+          <w:p>
+            <w:r>
+              <w:t>8.18</w:t>
+            </w:r>
+          </w:p>
+        </w:tc>
+        <w:tc>
+          <w:tcPr>
+            <w:tcW w:type="dxa" w:w="1080"/>
+          </w:tcPr>
+          <w:p>
+            <w:r>
+              <w:t>9.15</w:t>
+            </w:r>
+          </w:p>
+        </w:tc>
+      </w:tr>
+      <w:tr>
+        <w:tc>
+          <w:tcPr>
+            <w:tcW w:type="dxa" w:w="1080"/>
+          </w:tcPr>
+          <w:p>
+            <w:r>
+              <w:t>lung_ct2_img</w:t>
+            </w:r>
+          </w:p>
+        </w:tc>
+        <w:tc>
+          <w:tcPr>
+            <w:tcW w:type="dxa" w:w="1080"/>
+          </w:tcPr>
+          <w:p>
+            <w:r>
+              <w:t>1.92</w:t>
+            </w:r>
+          </w:p>
+        </w:tc>
+        <w:tc>
+          <w:tcPr>
+            <w:tcW w:type="dxa" w:w="1080"/>
+          </w:tcPr>
+          <w:p>
+            <w:r>
+              <w:t>3.74</w:t>
+            </w:r>
+          </w:p>
+        </w:tc>
+        <w:tc>
+          <w:tcPr>
+            <w:tcW w:type="dxa" w:w="1080"/>
+          </w:tcPr>
+          <w:p>
+            <w:r>
+              <w:t>5.37</w:t>
+            </w:r>
+          </w:p>
+        </w:tc>
+        <w:tc>
+          <w:tcPr>
+            <w:tcW w:type="dxa" w:w="1080"/>
+          </w:tcPr>
+          <w:p>
+            <w:r>
+              <w:t>6.24</w:t>
+            </w:r>
+          </w:p>
+        </w:tc>
+        <w:tc>
+          <w:tcPr>
+            <w:tcW w:type="dxa" w:w="1080"/>
+          </w:tcPr>
+          <w:p>
+            <w:r>
+              <w:t>7.33</w:t>
+            </w:r>
+          </w:p>
+        </w:tc>
+        <w:tc>
+          <w:tcPr>
+            <w:tcW w:type="dxa" w:w="1080"/>
+          </w:tcPr>
+          <w:p>
+            <w:r>
+              <w:t>8.17</w:t>
+            </w:r>
+          </w:p>
+        </w:tc>
+        <w:tc>
+          <w:tcPr>
+            <w:tcW w:type="dxa" w:w="1080"/>
+          </w:tcPr>
+          <w:p>
+            <w:r>
+              <w:t>9.15</w:t>
+            </w:r>
+          </w:p>
+        </w:tc>
+      </w:tr>
+      <w:tr>
+        <w:tc>
+          <w:tcPr>
+            <w:tcW w:type="dxa" w:w="1080"/>
+          </w:tcPr>
+          <w:p>
+            <w:r>
+              <w:t>brain_mri2_img</w:t>
+            </w:r>
+          </w:p>
+        </w:tc>
+        <w:tc>
+          <w:tcPr>
+            <w:tcW w:type="dxa" w:w="1080"/>
+          </w:tcPr>
+          <w:p>
+            <w:r>
+              <w:t>1.92</w:t>
+            </w:r>
+          </w:p>
+        </w:tc>
+        <w:tc>
+          <w:tcPr>
+            <w:tcW w:type="dxa" w:w="1080"/>
+          </w:tcPr>
+          <w:p>
+            <w:r>
+              <w:t>3.77</w:t>
+            </w:r>
+          </w:p>
+        </w:tc>
+        <w:tc>
+          <w:tcPr>
+            <w:tcW w:type="dxa" w:w="1080"/>
+          </w:tcPr>
+          <w:p>
+            <w:r>
+              <w:t>5.34</w:t>
+            </w:r>
+          </w:p>
+        </w:tc>
+        <w:tc>
+          <w:tcPr>
+            <w:tcW w:type="dxa" w:w="1080"/>
+          </w:tcPr>
+          <w:p>
+            <w:r>
+              <w:t>6.30</w:t>
+            </w:r>
+          </w:p>
+        </w:tc>
+        <w:tc>
+          <w:tcPr>
+            <w:tcW w:type="dxa" w:w="1080"/>
+          </w:tcPr>
+          <w:p>
+            <w:r>
+              <w:t>7.34</w:t>
+            </w:r>
+          </w:p>
+        </w:tc>
+        <w:tc>
+          <w:tcPr>
+            <w:tcW w:type="dxa" w:w="1080"/>
+          </w:tcPr>
+          <w:p>
+            <w:r>
+              <w:t>8.20</w:t>
+            </w:r>
+          </w:p>
+        </w:tc>
+        <w:tc>
+          <w:tcPr>
+            <w:tcW w:type="dxa" w:w="1080"/>
+          </w:tcPr>
+          <w:p>
+            <w:r>
+              <w:t>9.18</w:t>
+            </w:r>
+          </w:p>
+        </w:tc>
+      </w:tr>
+      <w:tr>
+        <w:tc>
+          <w:tcPr>
+            <w:tcW w:type="dxa" w:w="1080"/>
+          </w:tcPr>
+          <w:p>
+            <w:r>
+              <w:t>lena_color</w:t>
+            </w:r>
+          </w:p>
+        </w:tc>
+        <w:tc>
+          <w:tcPr>
+            <w:tcW w:type="dxa" w:w="1080"/>
+          </w:tcPr>
+          <w:p>
+            <w:r>
+              <w:t>1.92</w:t>
+            </w:r>
+          </w:p>
+        </w:tc>
+        <w:tc>
+          <w:tcPr>
+            <w:tcW w:type="dxa" w:w="1080"/>
+          </w:tcPr>
+          <w:p>
+            <w:r>
+              <w:t>3.77</w:t>
+            </w:r>
+          </w:p>
+        </w:tc>
+        <w:tc>
+          <w:tcPr>
+            <w:tcW w:type="dxa" w:w="1080"/>
+          </w:tcPr>
+          <w:p>
+            <w:r>
+              <w:t>5.36</w:t>
+            </w:r>
+          </w:p>
+        </w:tc>
+        <w:tc>
+          <w:tcPr>
+            <w:tcW w:type="dxa" w:w="1080"/>
+          </w:tcPr>
+          <w:p>
+            <w:r>
+              <w:t>6.29</w:t>
+            </w:r>
+          </w:p>
+        </w:tc>
+        <w:tc>
+          <w:tcPr>
+            <w:tcW w:type="dxa" w:w="1080"/>
+          </w:tcPr>
+          <w:p>
+            <w:r>
+              <w:t>7.33</w:t>
+            </w:r>
+          </w:p>
+        </w:tc>
+        <w:tc>
+          <w:tcPr>
+            <w:tcW w:type="dxa" w:w="1080"/>
+          </w:tcPr>
+          <w:p>
+            <w:r>
+              <w:t>8.21</w:t>
+            </w:r>
+          </w:p>
+        </w:tc>
+        <w:tc>
+          <w:tcPr>
+            <w:tcW w:type="dxa" w:w="1080"/>
+          </w:tcPr>
+          <w:p>
+            <w:r>
+              <w:t>9.03</w:t>
+            </w:r>
+          </w:p>
+        </w:tc>
+      </w:tr>
+      <w:tr>
+        <w:tc>
+          <w:tcPr>
+            <w:tcW w:type="dxa" w:w="1080"/>
+          </w:tcPr>
+          <w:p>
+            <w:r>
+              <w:t>retina2_color</w:t>
+            </w:r>
+          </w:p>
+        </w:tc>
+        <w:tc>
+          <w:tcPr>
+            <w:tcW w:type="dxa" w:w="1080"/>
+          </w:tcPr>
+          <w:p>
+            <w:r>
+              <w:t>1.92</w:t>
+            </w:r>
+          </w:p>
+        </w:tc>
+        <w:tc>
+          <w:tcPr>
+            <w:tcW w:type="dxa" w:w="1080"/>
+          </w:tcPr>
+          <w:p>
+            <w:r>
+              <w:t>3.79</w:t>
+            </w:r>
+          </w:p>
+        </w:tc>
+        <w:tc>
+          <w:tcPr>
+            <w:tcW w:type="dxa" w:w="1080"/>
+          </w:tcPr>
+          <w:p>
+            <w:r>
+              <w:t>5.35</w:t>
+            </w:r>
+          </w:p>
+        </w:tc>
+        <w:tc>
+          <w:tcPr>
+            <w:tcW w:type="dxa" w:w="1080"/>
+          </w:tcPr>
+          <w:p>
+            <w:r>
+              <w:t>6.25</w:t>
+            </w:r>
+          </w:p>
+        </w:tc>
+        <w:tc>
+          <w:tcPr>
+            <w:tcW w:type="dxa" w:w="1080"/>
+          </w:tcPr>
+          <w:p>
+            <w:r>
+              <w:t>7.29</w:t>
+            </w:r>
+          </w:p>
+        </w:tc>
+        <w:tc>
+          <w:tcPr>
+            <w:tcW w:type="dxa" w:w="1080"/>
+          </w:tcPr>
+          <w:p>
+            <w:r>
+              <w:t>8.14</w:t>
+            </w:r>
+          </w:p>
+        </w:tc>
+        <w:tc>
+          <w:tcPr>
+            <w:tcW w:type="dxa" w:w="1080"/>
+          </w:tcPr>
+          <w:p>
+            <w:r>
+              <w:t>9.15</w:t>
+            </w:r>
+          </w:p>
+        </w:tc>
+      </w:tr>
+      <w:tr>
+        <w:tc>
+          <w:tcPr>
+            <w:tcW w:type="dxa" w:w="1080"/>
+          </w:tcPr>
+          <w:p>
+            <w:r>
+              <w:t>brain_pet3_color</w:t>
+            </w:r>
+          </w:p>
+        </w:tc>
+        <w:tc>
+          <w:tcPr>
+            <w:tcW w:type="dxa" w:w="1080"/>
+          </w:tcPr>
+          <w:p>
+            <w:r>
+              <w:t>1.92</w:t>
+            </w:r>
+          </w:p>
+        </w:tc>
+        <w:tc>
+          <w:tcPr>
+            <w:tcW w:type="dxa" w:w="1080"/>
+          </w:tcPr>
+          <w:p>
+            <w:r>
+              <w:t>3.77</w:t>
+            </w:r>
+          </w:p>
+        </w:tc>
+        <w:tc>
+          <w:tcPr>
+            <w:tcW w:type="dxa" w:w="1080"/>
+          </w:tcPr>
+          <w:p>
+            <w:r>
+              <w:t>5.38</w:t>
+            </w:r>
+          </w:p>
+        </w:tc>
+        <w:tc>
+          <w:tcPr>
+            <w:tcW w:type="dxa" w:w="1080"/>
+          </w:tcPr>
+          <w:p>
+            <w:r>
+              <w:t>6.26</w:t>
+            </w:r>
+          </w:p>
+        </w:tc>
+        <w:tc>
+          <w:tcPr>
+            <w:tcW w:type="dxa" w:w="1080"/>
+          </w:tcPr>
+          <w:p>
+            <w:r>
+              <w:t>7.30</w:t>
+            </w:r>
+          </w:p>
+        </w:tc>
+        <w:tc>
+          <w:tcPr>
+            <w:tcW w:type="dxa" w:w="1080"/>
+          </w:tcPr>
+          <w:p>
+            <w:r>
+              <w:t>8.17</w:t>
+            </w:r>
+          </w:p>
+        </w:tc>
+        <w:tc>
+          <w:tcPr>
+            <w:tcW w:type="dxa" w:w="1080"/>
+          </w:tcPr>
+          <w:p>
+            <w:r>
+              <w:t>9.09</w:t>
+            </w:r>
+          </w:p>
+        </w:tc>
+      </w:tr>
+      <w:tr>
+        <w:tc>
+          <w:tcPr>
+            <w:tcW w:type="dxa" w:w="1080"/>
+          </w:tcPr>
+          <w:p>
+            <w:r>
+              <w:t>brain_pet4_color</w:t>
+            </w:r>
+          </w:p>
+        </w:tc>
+        <w:tc>
+          <w:tcPr>
+            <w:tcW w:type="dxa" w:w="1080"/>
+          </w:tcPr>
+          <w:p>
+            <w:r>
+              <w:t>1.91</w:t>
+            </w:r>
+          </w:p>
+        </w:tc>
+        <w:tc>
+          <w:tcPr>
+            <w:tcW w:type="dxa" w:w="1080"/>
+          </w:tcPr>
+          <w:p>
+            <w:r>
+              <w:t>3.76</w:t>
+            </w:r>
+          </w:p>
+        </w:tc>
+        <w:tc>
+          <w:tcPr>
+            <w:tcW w:type="dxa" w:w="1080"/>
+          </w:tcPr>
+          <w:p>
+            <w:r>
+              <w:t>5.35</w:t>
+            </w:r>
+          </w:p>
+        </w:tc>
+        <w:tc>
+          <w:tcPr>
+            <w:tcW w:type="dxa" w:w="1080"/>
+          </w:tcPr>
+          <w:p>
+            <w:r>
+              <w:t>6.26</w:t>
+            </w:r>
+          </w:p>
+        </w:tc>
+        <w:tc>
+          <w:tcPr>
+            <w:tcW w:type="dxa" w:w="1080"/>
+          </w:tcPr>
+          <w:p>
+            <w:r>
+              <w:t>7.31</w:t>
+            </w:r>
+          </w:p>
+        </w:tc>
+        <w:tc>
+          <w:tcPr>
+            <w:tcW w:type="dxa" w:w="1080"/>
+          </w:tcPr>
+          <w:p>
+            <w:r>
+              <w:t>8.20</w:t>
+            </w:r>
+          </w:p>
+        </w:tc>
+        <w:tc>
+          <w:tcPr>
+            <w:tcW w:type="dxa" w:w="1080"/>
+          </w:tcPr>
+          <w:p>
+            <w:r>
+              <w:t>9.09</w:t>
+            </w:r>
+          </w:p>
+        </w:tc>
+      </w:tr>
+    </w:tbl>
+    <w:p/>
+    <w:p>
+      <w:r>
+        <w:rPr>
+          <w:b/>
+        </w:rPr>
+        <w:t>تسارع Total</w:t>
+      </w:r>
+    </w:p>
+    <w:tbl>
+      <w:tblPr>
+        <w:tblStyle w:val="TableGrid"/>
+        <w:tblW w:type="auto" w:w="0"/>
+        <w:tblLook w:firstColumn="1" w:firstRow="1" w:lastColumn="0" w:lastRow="0" w:noHBand="0" w:noVBand="1" w:val="04A0"/>
+      </w:tblPr>
+      <w:tblGrid>
+        <w:gridCol w:w="1080"/>
+        <w:gridCol w:w="1080"/>
+        <w:gridCol w:w="1080"/>
+        <w:gridCol w:w="1080"/>
+        <w:gridCol w:w="1080"/>
+        <w:gridCol w:w="1080"/>
+        <w:gridCol w:w="1080"/>
+        <w:gridCol w:w="1080"/>
+      </w:tblGrid>
+      <w:tr>
+        <w:tc>
+          <w:tcPr>
+            <w:tcW w:type="dxa" w:w="1080"/>
+          </w:tcPr>
+          <w:p>
+            <w:r>
+              <w:t>الصورة</w:t>
+            </w:r>
+          </w:p>
+        </w:tc>
+        <w:tc>
+          <w:tcPr>
+            <w:tcW w:type="dxa" w:w="1080"/>
+          </w:tcPr>
+          <w:p>
+            <w:r>
+              <w:t>np=2</w:t>
+            </w:r>
+          </w:p>
+        </w:tc>
+        <w:tc>
+          <w:tcPr>
+            <w:tcW w:type="dxa" w:w="1080"/>
+          </w:tcPr>
+          <w:p>
+            <w:r>
+              <w:t>np=4</w:t>
+            </w:r>
+          </w:p>
+        </w:tc>
+        <w:tc>
+          <w:tcPr>
+            <w:tcW w:type="dxa" w:w="1080"/>
+          </w:tcPr>
+          <w:p>
+            <w:r>
+              <w:t>np=6</w:t>
+            </w:r>
+          </w:p>
+        </w:tc>
+        <w:tc>
+          <w:tcPr>
+            <w:tcW w:type="dxa" w:w="1080"/>
+          </w:tcPr>
+          <w:p>
+            <w:r>
+              <w:t>np=8</w:t>
+            </w:r>
+          </w:p>
+        </w:tc>
+        <w:tc>
+          <w:tcPr>
+            <w:tcW w:type="dxa" w:w="1080"/>
+          </w:tcPr>
+          <w:p>
+            <w:r>
+              <w:t>np=10</w:t>
+            </w:r>
+          </w:p>
+        </w:tc>
+        <w:tc>
+          <w:tcPr>
+            <w:tcW w:type="dxa" w:w="1080"/>
+          </w:tcPr>
+          <w:p>
+            <w:r>
+              <w:t>np=12</w:t>
+            </w:r>
+          </w:p>
+        </w:tc>
+        <w:tc>
+          <w:tcPr>
+            <w:tcW w:type="dxa" w:w="1080"/>
+          </w:tcPr>
+          <w:p>
+            <w:r>
+              <w:t>np=14</w:t>
+            </w:r>
+          </w:p>
+        </w:tc>
+      </w:tr>
+      <w:tr>
+        <w:tc>
+          <w:tcPr>
+            <w:tcW w:type="dxa" w:w="1080"/>
+          </w:tcPr>
+          <w:p>
+            <w:r>
+              <w:t>gray</w:t>
+            </w:r>
+          </w:p>
+        </w:tc>
+        <w:tc>
+          <w:tcPr>
+            <w:tcW w:type="dxa" w:w="1080"/>
+          </w:tcPr>
+          <w:p>
+            <w:r>
+              <w:t>1.72</w:t>
+            </w:r>
+          </w:p>
+        </w:tc>
+        <w:tc>
+          <w:tcPr>
+            <w:tcW w:type="dxa" w:w="1080"/>
+          </w:tcPr>
+          <w:p>
+            <w:r>
+              <w:t>2.85</w:t>
+            </w:r>
+          </w:p>
+        </w:tc>
+        <w:tc>
+          <w:tcPr>
+            <w:tcW w:type="dxa" w:w="1080"/>
+          </w:tcPr>
+          <w:p>
+            <w:r>
+              <w:t>3.55</w:t>
+            </w:r>
+          </w:p>
+        </w:tc>
+        <w:tc>
+          <w:tcPr>
+            <w:tcW w:type="dxa" w:w="1080"/>
+          </w:tcPr>
+          <w:p>
+            <w:r>
+              <w:t>3.75</w:t>
+            </w:r>
+          </w:p>
+        </w:tc>
+        <w:tc>
+          <w:tcPr>
+            <w:tcW w:type="dxa" w:w="1080"/>
+          </w:tcPr>
+          <w:p>
+            <w:r>
+              <w:t>4.10</w:t>
+            </w:r>
+          </w:p>
+        </w:tc>
+        <w:tc>
+          <w:tcPr>
+            <w:tcW w:type="dxa" w:w="1080"/>
+          </w:tcPr>
+          <w:p>
+            <w:r>
+              <w:t>4.30</w:t>
+            </w:r>
+          </w:p>
+        </w:tc>
+        <w:tc>
+          <w:tcPr>
+            <w:tcW w:type="dxa" w:w="1080"/>
+          </w:tcPr>
+          <w:p>
+            <w:r>
+              <w:t>4.52</w:t>
+            </w:r>
+          </w:p>
+        </w:tc>
+      </w:tr>
+      <w:tr>
+        <w:tc>
+          <w:tcPr>
+            <w:tcW w:type="dxa" w:w="1080"/>
+          </w:tcPr>
+          <w:p>
+            <w:r>
+              <w:t>boat_img</w:t>
+            </w:r>
+          </w:p>
+        </w:tc>
+        <w:tc>
+          <w:tcPr>
+            <w:tcW w:type="dxa" w:w="1080"/>
+          </w:tcPr>
+          <w:p>
+            <w:r>
+              <w:t>1.71</w:t>
+            </w:r>
+          </w:p>
+        </w:tc>
+        <w:tc>
+          <w:tcPr>
+            <w:tcW w:type="dxa" w:w="1080"/>
+          </w:tcPr>
+          <w:p>
+            <w:r>
+              <w:t>2.78</w:t>
+            </w:r>
+          </w:p>
+        </w:tc>
+        <w:tc>
+          <w:tcPr>
+            <w:tcW w:type="dxa" w:w="1080"/>
+          </w:tcPr>
+          <w:p>
+            <w:r>
+              <w:t>3.41</w:t>
+            </w:r>
+          </w:p>
+        </w:tc>
+        <w:tc>
+          <w:tcPr>
+            <w:tcW w:type="dxa" w:w="1080"/>
+          </w:tcPr>
+          <w:p>
+            <w:r>
+              <w:t>3.60</w:t>
+            </w:r>
+          </w:p>
+        </w:tc>
+        <w:tc>
+          <w:tcPr>
+            <w:tcW w:type="dxa" w:w="1080"/>
+          </w:tcPr>
+          <w:p>
+            <w:r>
+              <w:t>3.91</w:t>
+            </w:r>
+          </w:p>
+        </w:tc>
+        <w:tc>
+          <w:tcPr>
+            <w:tcW w:type="dxa" w:w="1080"/>
+          </w:tcPr>
+          <w:p>
+            <w:r>
+              <w:t>4.12</w:t>
+            </w:r>
+          </w:p>
+        </w:tc>
+        <w:tc>
+          <w:tcPr>
+            <w:tcW w:type="dxa" w:w="1080"/>
+          </w:tcPr>
+          <w:p>
+            <w:r>
+              <w:t>4.28</w:t>
+            </w:r>
+          </w:p>
+        </w:tc>
+      </w:tr>
+      <w:tr>
+        <w:tc>
+          <w:tcPr>
+            <w:tcW w:type="dxa" w:w="1080"/>
+          </w:tcPr>
+          <w:p>
+            <w:r>
+              <w:t>cameraman_img</w:t>
+            </w:r>
+          </w:p>
+        </w:tc>
+        <w:tc>
+          <w:tcPr>
+            <w:tcW w:type="dxa" w:w="1080"/>
+          </w:tcPr>
+          <w:p>
+            <w:r>
+              <w:t>1.73</w:t>
+            </w:r>
+          </w:p>
+        </w:tc>
+        <w:tc>
+          <w:tcPr>
+            <w:tcW w:type="dxa" w:w="1080"/>
+          </w:tcPr>
+          <w:p>
+            <w:r>
+              <w:t>2.78</w:t>
+            </w:r>
+          </w:p>
+        </w:tc>
+        <w:tc>
+          <w:tcPr>
+            <w:tcW w:type="dxa" w:w="1080"/>
+          </w:tcPr>
+          <w:p>
+            <w:r>
+              <w:t>3.43</w:t>
+            </w:r>
+          </w:p>
+        </w:tc>
+        <w:tc>
+          <w:tcPr>
+            <w:tcW w:type="dxa" w:w="1080"/>
+          </w:tcPr>
+          <w:p>
+            <w:r>
+              <w:t>3.62</w:t>
+            </w:r>
+          </w:p>
+        </w:tc>
+        <w:tc>
+          <w:tcPr>
+            <w:tcW w:type="dxa" w:w="1080"/>
+          </w:tcPr>
+          <w:p>
+            <w:r>
+              <w:t>3.93</w:t>
+            </w:r>
+          </w:p>
+        </w:tc>
+        <w:tc>
+          <w:tcPr>
+            <w:tcW w:type="dxa" w:w="1080"/>
+          </w:tcPr>
+          <w:p>
+            <w:r>
+              <w:t>4.19</w:t>
+            </w:r>
+          </w:p>
+        </w:tc>
+        <w:tc>
+          <w:tcPr>
+            <w:tcW w:type="dxa" w:w="1080"/>
+          </w:tcPr>
+          <w:p>
+            <w:r>
+              <w:t>4.36</w:t>
+            </w:r>
+          </w:p>
+        </w:tc>
+      </w:tr>
+      <w:tr>
+        <w:tc>
+          <w:tcPr>
+            <w:tcW w:type="dxa" w:w="1080"/>
+          </w:tcPr>
+          <w:p>
+            <w:r>
+              <w:t>peppers_img</w:t>
+            </w:r>
+          </w:p>
+        </w:tc>
+        <w:tc>
+          <w:tcPr>
+            <w:tcW w:type="dxa" w:w="1080"/>
+          </w:tcPr>
+          <w:p>
+            <w:r>
+              <w:t>1.74</w:t>
+            </w:r>
+          </w:p>
+        </w:tc>
+        <w:tc>
+          <w:tcPr>
+            <w:tcW w:type="dxa" w:w="1080"/>
+          </w:tcPr>
+          <w:p>
+            <w:r>
+              <w:t>2.90</w:t>
+            </w:r>
+          </w:p>
+        </w:tc>
+        <w:tc>
+          <w:tcPr>
+            <w:tcW w:type="dxa" w:w="1080"/>
+          </w:tcPr>
+          <w:p>
+            <w:r>
+              <w:t>3.58</w:t>
+            </w:r>
+          </w:p>
+        </w:tc>
+        <w:tc>
+          <w:tcPr>
+            <w:tcW w:type="dxa" w:w="1080"/>
+          </w:tcPr>
+          <w:p>
+            <w:r>
+              <w:t>3.80</w:t>
+            </w:r>
+          </w:p>
+        </w:tc>
+        <w:tc>
+          <w:tcPr>
+            <w:tcW w:type="dxa" w:w="1080"/>
+          </w:tcPr>
+          <w:p>
+            <w:r>
+              <w:t>4.15</w:t>
+            </w:r>
+          </w:p>
+        </w:tc>
+        <w:tc>
+          <w:tcPr>
+            <w:tcW w:type="dxa" w:w="1080"/>
+          </w:tcPr>
+          <w:p>
+            <w:r>
+              <w:t>4.40</w:t>
+            </w:r>
+          </w:p>
+        </w:tc>
+        <w:tc>
+          <w:tcPr>
+            <w:tcW w:type="dxa" w:w="1080"/>
+          </w:tcPr>
+          <w:p>
+            <w:r>
+              <w:t>4.68</w:t>
+            </w:r>
+          </w:p>
+        </w:tc>
+      </w:tr>
+      <w:tr>
+        <w:tc>
+          <w:tcPr>
+            <w:tcW w:type="dxa" w:w="1080"/>
+          </w:tcPr>
+          <w:p>
+            <w:r>
+              <w:t>chest_xray2_img</w:t>
+            </w:r>
+          </w:p>
+        </w:tc>
+        <w:tc>
+          <w:tcPr>
+            <w:tcW w:type="dxa" w:w="1080"/>
+          </w:tcPr>
+          <w:p>
+            <w:r>
+              <w:t>1.72</w:t>
+            </w:r>
+          </w:p>
+        </w:tc>
+        <w:tc>
+          <w:tcPr>
+            <w:tcW w:type="dxa" w:w="1080"/>
+          </w:tcPr>
+          <w:p>
+            <w:r>
+              <w:t>2.81</w:t>
+            </w:r>
+          </w:p>
+        </w:tc>
+        <w:tc>
+          <w:tcPr>
+            <w:tcW w:type="dxa" w:w="1080"/>
+          </w:tcPr>
+          <w:p>
+            <w:r>
+              <w:t>3.41</w:t>
+            </w:r>
+          </w:p>
+        </w:tc>
+        <w:tc>
+          <w:tcPr>
+            <w:tcW w:type="dxa" w:w="1080"/>
+          </w:tcPr>
+          <w:p>
+            <w:r>
+              <w:t>3.57</w:t>
+            </w:r>
+          </w:p>
+        </w:tc>
+        <w:tc>
+          <w:tcPr>
+            <w:tcW w:type="dxa" w:w="1080"/>
+          </w:tcPr>
+          <w:p>
+            <w:r>
+              <w:t>3.87</w:t>
+            </w:r>
+          </w:p>
+        </w:tc>
+        <w:tc>
+          <w:tcPr>
+            <w:tcW w:type="dxa" w:w="1080"/>
+          </w:tcPr>
+          <w:p>
+            <w:r>
+              <w:t>4.12</w:t>
+            </w:r>
+          </w:p>
+        </w:tc>
+        <w:tc>
+          <w:tcPr>
+            <w:tcW w:type="dxa" w:w="1080"/>
+          </w:tcPr>
+          <w:p>
+            <w:r>
+              <w:t>4.35</w:t>
+            </w:r>
+          </w:p>
+        </w:tc>
+      </w:tr>
+      <w:tr>
+        <w:tc>
+          <w:tcPr>
+            <w:tcW w:type="dxa" w:w="1080"/>
+          </w:tcPr>
+          <w:p>
+            <w:r>
+              <w:t>mammo2_img</w:t>
+            </w:r>
+          </w:p>
+        </w:tc>
+        <w:tc>
+          <w:tcPr>
+            <w:tcW w:type="dxa" w:w="1080"/>
+          </w:tcPr>
+          <w:p>
+            <w:r>
+              <w:t>1.70</w:t>
+            </w:r>
+          </w:p>
+        </w:tc>
+        <w:tc>
+          <w:tcPr>
+            <w:tcW w:type="dxa" w:w="1080"/>
+          </w:tcPr>
+          <w:p>
+            <w:r>
+              <w:t>2.73</w:t>
+            </w:r>
+          </w:p>
+        </w:tc>
+        <w:tc>
+          <w:tcPr>
+            <w:tcW w:type="dxa" w:w="1080"/>
+          </w:tcPr>
+          <w:p>
+            <w:r>
+              <w:t>3.36</w:t>
+            </w:r>
+          </w:p>
+        </w:tc>
+        <w:tc>
+          <w:tcPr>
+            <w:tcW w:type="dxa" w:w="1080"/>
+          </w:tcPr>
+          <w:p>
+            <w:r>
+              <w:t>3.48</w:t>
+            </w:r>
+          </w:p>
+        </w:tc>
+        <w:tc>
+          <w:tcPr>
+            <w:tcW w:type="dxa" w:w="1080"/>
+          </w:tcPr>
+          <w:p>
+            <w:r>
+              <w:t>3.79</w:t>
+            </w:r>
+          </w:p>
+        </w:tc>
+        <w:tc>
+          <w:tcPr>
+            <w:tcW w:type="dxa" w:w="1080"/>
+          </w:tcPr>
+          <w:p>
+            <w:r>
+              <w:t>3.95</w:t>
+            </w:r>
+          </w:p>
+        </w:tc>
+        <w:tc>
+          <w:tcPr>
+            <w:tcW w:type="dxa" w:w="1080"/>
+          </w:tcPr>
+          <w:p>
+            <w:r>
+              <w:t>4.17</w:t>
+            </w:r>
+          </w:p>
+        </w:tc>
+      </w:tr>
+      <w:tr>
+        <w:tc>
+          <w:tcPr>
+            <w:tcW w:type="dxa" w:w="1080"/>
+          </w:tcPr>
+          <w:p>
+            <w:r>
+              <w:t>lung_ct2_img</w:t>
+            </w:r>
+          </w:p>
+        </w:tc>
+        <w:tc>
+          <w:tcPr>
+            <w:tcW w:type="dxa" w:w="1080"/>
+          </w:tcPr>
+          <w:p>
+            <w:r>
+              <w:t>1.74</w:t>
+            </w:r>
+          </w:p>
+        </w:tc>
+        <w:tc>
+          <w:tcPr>
+            <w:tcW w:type="dxa" w:w="1080"/>
+          </w:tcPr>
+          <w:p>
+            <w:r>
+              <w:t>2.89</w:t>
+            </w:r>
+          </w:p>
+        </w:tc>
+        <w:tc>
+          <w:tcPr>
+            <w:tcW w:type="dxa" w:w="1080"/>
+          </w:tcPr>
+          <w:p>
+            <w:r>
+              <w:t>3.65</w:t>
+            </w:r>
+          </w:p>
+        </w:tc>
+        <w:tc>
+          <w:tcPr>
+            <w:tcW w:type="dxa" w:w="1080"/>
+          </w:tcPr>
+          <w:p>
+            <w:r>
+              <w:t>3.84</w:t>
+            </w:r>
+          </w:p>
+        </w:tc>
+        <w:tc>
+          <w:tcPr>
+            <w:tcW w:type="dxa" w:w="1080"/>
+          </w:tcPr>
+          <w:p>
+            <w:r>
+              <w:t>4.22</w:t>
+            </w:r>
+          </w:p>
+        </w:tc>
+        <w:tc>
+          <w:tcPr>
+            <w:tcW w:type="dxa" w:w="1080"/>
+          </w:tcPr>
+          <w:p>
+            <w:r>
+              <w:t>4.48</w:t>
+            </w:r>
+          </w:p>
+        </w:tc>
+        <w:tc>
+          <w:tcPr>
+            <w:tcW w:type="dxa" w:w="1080"/>
+          </w:tcPr>
+          <w:p>
+            <w:r>
+              <w:t>4.76</w:t>
+            </w:r>
+          </w:p>
+        </w:tc>
+      </w:tr>
+      <w:tr>
+        <w:tc>
+          <w:tcPr>
+            <w:tcW w:type="dxa" w:w="1080"/>
+          </w:tcPr>
+          <w:p>
+            <w:r>
+              <w:t>brain_mri2_img</w:t>
+            </w:r>
+          </w:p>
+        </w:tc>
+        <w:tc>
+          <w:tcPr>
+            <w:tcW w:type="dxa" w:w="1080"/>
+          </w:tcPr>
+          <w:p>
+            <w:r>
+              <w:t>1.73</w:t>
+            </w:r>
+          </w:p>
+        </w:tc>
+        <w:tc>
+          <w:tcPr>
+            <w:tcW w:type="dxa" w:w="1080"/>
+          </w:tcPr>
+          <w:p>
+            <w:r>
+              <w:t>2.85</w:t>
+            </w:r>
+          </w:p>
+        </w:tc>
+        <w:tc>
+          <w:tcPr>
+            <w:tcW w:type="dxa" w:w="1080"/>
+          </w:tcPr>
+          <w:p>
+            <w:r>
+              <w:t>3.49</w:t>
+            </w:r>
+          </w:p>
+        </w:tc>
+        <w:tc>
+          <w:tcPr>
+            <w:tcW w:type="dxa" w:w="1080"/>
+          </w:tcPr>
+          <w:p>
+            <w:r>
+              <w:t>3.73</w:t>
+            </w:r>
+          </w:p>
+        </w:tc>
+        <w:tc>
+          <w:tcPr>
+            <w:tcW w:type="dxa" w:w="1080"/>
+          </w:tcPr>
+          <w:p>
+            <w:r>
+              <w:t>4.05</w:t>
+            </w:r>
+          </w:p>
+        </w:tc>
+        <w:tc>
+          <w:tcPr>
+            <w:tcW w:type="dxa" w:w="1080"/>
+          </w:tcPr>
+          <w:p>
+            <w:r>
+              <w:t>4.26</w:t>
+            </w:r>
+          </w:p>
+        </w:tc>
+        <w:tc>
+          <w:tcPr>
+            <w:tcW w:type="dxa" w:w="1080"/>
+          </w:tcPr>
+          <w:p>
+            <w:r>
+              <w:t>4.49</w:t>
+            </w:r>
+          </w:p>
+        </w:tc>
+      </w:tr>
+      <w:tr>
+        <w:tc>
+          <w:tcPr>
+            <w:tcW w:type="dxa" w:w="1080"/>
+          </w:tcPr>
+          <w:p>
+            <w:r>
+              <w:t>lena_color</w:t>
+            </w:r>
+          </w:p>
+        </w:tc>
+        <w:tc>
+          <w:tcPr>
+            <w:tcW w:type="dxa" w:w="1080"/>
+          </w:tcPr>
+          <w:p>
+            <w:r>
+              <w:t>1.81</w:t>
+            </w:r>
+          </w:p>
+        </w:tc>
+        <w:tc>
+          <w:tcPr>
+            <w:tcW w:type="dxa" w:w="1080"/>
+          </w:tcPr>
+          <w:p>
+            <w:r>
+              <w:t>3.21</w:t>
+            </w:r>
+          </w:p>
+        </w:tc>
+        <w:tc>
+          <w:tcPr>
+            <w:tcW w:type="dxa" w:w="1080"/>
+          </w:tcPr>
+          <w:p>
+            <w:r>
+              <w:t>4.18</w:t>
+            </w:r>
+          </w:p>
+        </w:tc>
+        <w:tc>
+          <w:tcPr>
+            <w:tcW w:type="dxa" w:w="1080"/>
+          </w:tcPr>
+          <w:p>
+            <w:r>
+              <w:t>4.49</w:t>
+            </w:r>
+          </w:p>
+        </w:tc>
+        <w:tc>
+          <w:tcPr>
+            <w:tcW w:type="dxa" w:w="1080"/>
+          </w:tcPr>
+          <w:p>
+            <w:r>
+              <w:t>5.02</w:t>
+            </w:r>
+          </w:p>
+        </w:tc>
+        <w:tc>
+          <w:tcPr>
+            <w:tcW w:type="dxa" w:w="1080"/>
+          </w:tcPr>
+          <w:p>
+            <w:r>
+              <w:t>5.44</w:t>
+            </w:r>
+          </w:p>
+        </w:tc>
+        <w:tc>
+          <w:tcPr>
+            <w:tcW w:type="dxa" w:w="1080"/>
+          </w:tcPr>
+          <w:p>
+            <w:r>
+              <w:t>5.76</w:t>
+            </w:r>
+          </w:p>
+        </w:tc>
+      </w:tr>
+      <w:tr>
+        <w:tc>
+          <w:tcPr>
+            <w:tcW w:type="dxa" w:w="1080"/>
+          </w:tcPr>
+          <w:p>
+            <w:r>
+              <w:t>retina2_color</w:t>
+            </w:r>
+          </w:p>
+        </w:tc>
+        <w:tc>
+          <w:tcPr>
+            <w:tcW w:type="dxa" w:w="1080"/>
+          </w:tcPr>
+          <w:p>
+            <w:r>
+              <w:t>1.80</w:t>
+            </w:r>
+          </w:p>
+        </w:tc>
+        <w:tc>
+          <w:tcPr>
+            <w:tcW w:type="dxa" w:w="1080"/>
+          </w:tcPr>
+          <w:p>
+            <w:r>
+              <w:t>3.16</w:t>
+            </w:r>
+          </w:p>
+        </w:tc>
+        <w:tc>
+          <w:tcPr>
+            <w:tcW w:type="dxa" w:w="1080"/>
+          </w:tcPr>
+          <w:p>
+            <w:r>
+              <w:t>4.08</w:t>
+            </w:r>
+          </w:p>
+        </w:tc>
+        <w:tc>
+          <w:tcPr>
+            <w:tcW w:type="dxa" w:w="1080"/>
+          </w:tcPr>
+          <w:p>
+            <w:r>
+              <w:t>4.36</w:t>
+            </w:r>
+          </w:p>
+        </w:tc>
+        <w:tc>
+          <w:tcPr>
+            <w:tcW w:type="dxa" w:w="1080"/>
+          </w:tcPr>
+          <w:p>
+            <w:r>
+              <w:t>4.85</w:t>
+            </w:r>
+          </w:p>
+        </w:tc>
+        <w:tc>
+          <w:tcPr>
+            <w:tcW w:type="dxa" w:w="1080"/>
+          </w:tcPr>
+          <w:p>
+            <w:r>
+              <w:t>5.24</w:t>
+            </w:r>
+          </w:p>
+        </w:tc>
+        <w:tc>
+          <w:tcPr>
+            <w:tcW w:type="dxa" w:w="1080"/>
+          </w:tcPr>
+          <w:p>
+            <w:r>
+              <w:t>5.65</w:t>
+            </w:r>
+          </w:p>
+        </w:tc>
+      </w:tr>
+      <w:tr>
+        <w:tc>
+          <w:tcPr>
+            <w:tcW w:type="dxa" w:w="1080"/>
+          </w:tcPr>
+          <w:p>
+            <w:r>
+              <w:t>brain_pet3_color</w:t>
+            </w:r>
+          </w:p>
+        </w:tc>
+        <w:tc>
+          <w:tcPr>
+            <w:tcW w:type="dxa" w:w="1080"/>
+          </w:tcPr>
+          <w:p>
+            <w:r>
+              <w:t>1.81</w:t>
+            </w:r>
+          </w:p>
+        </w:tc>
+        <w:tc>
+          <w:tcPr>
+            <w:tcW w:type="dxa" w:w="1080"/>
+          </w:tcPr>
+          <w:p>
+            <w:r>
+              <w:t>3.23</w:t>
+            </w:r>
+          </w:p>
+        </w:tc>
+        <w:tc>
+          <w:tcPr>
+            <w:tcW w:type="dxa" w:w="1080"/>
+          </w:tcPr>
+          <w:p>
+            <w:r>
+              <w:t>4.21</w:t>
+            </w:r>
+          </w:p>
+        </w:tc>
+        <w:tc>
+          <w:tcPr>
+            <w:tcW w:type="dxa" w:w="1080"/>
+          </w:tcPr>
+          <w:p>
+            <w:r>
+              <w:t>4.54</w:t>
+            </w:r>
+          </w:p>
+        </w:tc>
+        <w:tc>
+          <w:tcPr>
+            <w:tcW w:type="dxa" w:w="1080"/>
+          </w:tcPr>
+          <w:p>
+            <w:r>
+              <w:t>5.08</w:t>
+            </w:r>
+          </w:p>
+        </w:tc>
+        <w:tc>
+          <w:tcPr>
+            <w:tcW w:type="dxa" w:w="1080"/>
+          </w:tcPr>
+          <w:p>
+            <w:r>
+              <w:t>5.47</w:t>
+            </w:r>
+          </w:p>
+        </w:tc>
+        <w:tc>
+          <w:tcPr>
+            <w:tcW w:type="dxa" w:w="1080"/>
+          </w:tcPr>
+          <w:p>
+            <w:r>
+              <w:t>5.91</w:t>
+            </w:r>
+          </w:p>
+        </w:tc>
+      </w:tr>
+      <w:tr>
+        <w:tc>
+          <w:tcPr>
+            <w:tcW w:type="dxa" w:w="1080"/>
+          </w:tcPr>
+          <w:p>
+            <w:r>
+              <w:t>brain_pet4_color</w:t>
+            </w:r>
+          </w:p>
+        </w:tc>
+        <w:tc>
+          <w:tcPr>
+            <w:tcW w:type="dxa" w:w="1080"/>
+          </w:tcPr>
+          <w:p>
+            <w:r>
+              <w:t>1.80</w:t>
+            </w:r>
+          </w:p>
+        </w:tc>
+        <w:tc>
+          <w:tcPr>
+            <w:tcW w:type="dxa" w:w="1080"/>
+          </w:tcPr>
+          <w:p>
+            <w:r>
+              <w:t>3.19</w:t>
+            </w:r>
+          </w:p>
+        </w:tc>
+        <w:tc>
+          <w:tcPr>
+            <w:tcW w:type="dxa" w:w="1080"/>
+          </w:tcPr>
+          <w:p>
+            <w:r>
+              <w:t>4.16</w:t>
+            </w:r>
+          </w:p>
+        </w:tc>
+        <w:tc>
+          <w:tcPr>
+            <w:tcW w:type="dxa" w:w="1080"/>
+          </w:tcPr>
+          <w:p>
+            <w:r>
+              <w:t>4.49</w:t>
+            </w:r>
+          </w:p>
+        </w:tc>
+        <w:tc>
+          <w:tcPr>
+            <w:tcW w:type="dxa" w:w="1080"/>
+          </w:tcPr>
+          <w:p>
+            <w:r>
+              <w:t>5.01</w:t>
+            </w:r>
+          </w:p>
+        </w:tc>
+        <w:tc>
+          <w:tcPr>
+            <w:tcW w:type="dxa" w:w="1080"/>
+          </w:tcPr>
+          <w:p>
+            <w:r>
+              <w:t>5.45</w:t>
+            </w:r>
+          </w:p>
+        </w:tc>
+        <w:tc>
+          <w:tcPr>
+            <w:tcW w:type="dxa" w:w="1080"/>
+          </w:tcPr>
+          <w:p>
+            <w:r>
+              <w:t>5.84</w:t>
+            </w:r>
+          </w:p>
+        </w:tc>
+      </w:tr>
+    </w:tbl>
+    <w:p/>
+    <w:p>
+      <w:r>
+        <w:rPr>
+          <w:b/>
+        </w:rPr>
+        <w:t>الكفاءة %</w:t>
+      </w:r>
+    </w:p>
+    <w:tbl>
+      <w:tblPr>
+        <w:tblStyle w:val="TableGrid"/>
+        <w:tblW w:type="auto" w:w="0"/>
+        <w:tblLook w:firstColumn="1" w:firstRow="1" w:lastColumn="0" w:lastRow="0" w:noHBand="0" w:noVBand="1" w:val="04A0"/>
+      </w:tblPr>
+      <w:tblGrid>
+        <w:gridCol w:w="1080"/>
+        <w:gridCol w:w="1080"/>
+        <w:gridCol w:w="1080"/>
+        <w:gridCol w:w="1080"/>
+        <w:gridCol w:w="1080"/>
+        <w:gridCol w:w="1080"/>
+        <w:gridCol w:w="1080"/>
+        <w:gridCol w:w="1080"/>
+      </w:tblGrid>
+      <w:tr>
+        <w:tc>
+          <w:tcPr>
+            <w:tcW w:type="dxa" w:w="1080"/>
+          </w:tcPr>
+          <w:p>
+            <w:r>
+              <w:t>الصورة</w:t>
+            </w:r>
+          </w:p>
+        </w:tc>
+        <w:tc>
+          <w:tcPr>
+            <w:tcW w:type="dxa" w:w="1080"/>
+          </w:tcPr>
+          <w:p>
+            <w:r>
+              <w:t>np=2</w:t>
+            </w:r>
+          </w:p>
+        </w:tc>
+        <w:tc>
+          <w:tcPr>
+            <w:tcW w:type="dxa" w:w="1080"/>
+          </w:tcPr>
+          <w:p>
+            <w:r>
+              <w:t>np=4</w:t>
+            </w:r>
+          </w:p>
+        </w:tc>
+        <w:tc>
+          <w:tcPr>
+            <w:tcW w:type="dxa" w:w="1080"/>
+          </w:tcPr>
+          <w:p>
+            <w:r>
+              <w:t>np=6</w:t>
+            </w:r>
+          </w:p>
+        </w:tc>
+        <w:tc>
+          <w:tcPr>
+            <w:tcW w:type="dxa" w:w="1080"/>
+          </w:tcPr>
+          <w:p>
+            <w:r>
+              <w:t>np=8</w:t>
+            </w:r>
+          </w:p>
+        </w:tc>
+        <w:tc>
+          <w:tcPr>
+            <w:tcW w:type="dxa" w:w="1080"/>
+          </w:tcPr>
+          <w:p>
+            <w:r>
+              <w:t>np=10</w:t>
+            </w:r>
+          </w:p>
+        </w:tc>
+        <w:tc>
+          <w:tcPr>
+            <w:tcW w:type="dxa" w:w="1080"/>
+          </w:tcPr>
+          <w:p>
+            <w:r>
+              <w:t>np=12</w:t>
+            </w:r>
+          </w:p>
+        </w:tc>
+        <w:tc>
+          <w:tcPr>
+            <w:tcW w:type="dxa" w:w="1080"/>
+          </w:tcPr>
+          <w:p>
+            <w:r>
+              <w:t>np=14</w:t>
+            </w:r>
+          </w:p>
+        </w:tc>
+      </w:tr>
+      <w:tr>
+        <w:tc>
+          <w:tcPr>
+            <w:tcW w:type="dxa" w:w="1080"/>
+          </w:tcPr>
+          <w:p>
+            <w:r>
+              <w:t>gray</w:t>
+            </w:r>
+          </w:p>
+        </w:tc>
+        <w:tc>
+          <w:tcPr>
+            <w:tcW w:type="dxa" w:w="1080"/>
+          </w:tcPr>
+          <w:p>
+            <w:r>
+              <w:t>96</w:t>
+            </w:r>
+          </w:p>
+        </w:tc>
+        <w:tc>
+          <w:tcPr>
+            <w:tcW w:type="dxa" w:w="1080"/>
+          </w:tcPr>
+          <w:p>
+            <w:r>
+              <w:t>94</w:t>
+            </w:r>
+          </w:p>
+        </w:tc>
+        <w:tc>
+          <w:tcPr>
+            <w:tcW w:type="dxa" w:w="1080"/>
+          </w:tcPr>
+          <w:p>
+            <w:r>
+              <w:t>89</w:t>
+            </w:r>
+          </w:p>
+        </w:tc>
+        <w:tc>
+          <w:tcPr>
+            <w:tcW w:type="dxa" w:w="1080"/>
+          </w:tcPr>
+          <w:p>
+            <w:r>
+              <w:t>78</w:t>
+            </w:r>
+          </w:p>
+        </w:tc>
+        <w:tc>
+          <w:tcPr>
+            <w:tcW w:type="dxa" w:w="1080"/>
+          </w:tcPr>
+          <w:p>
+            <w:r>
+              <w:t>73</w:t>
+            </w:r>
+          </w:p>
+        </w:tc>
+        <w:tc>
+          <w:tcPr>
+            <w:tcW w:type="dxa" w:w="1080"/>
+          </w:tcPr>
+          <w:p>
+            <w:r>
+              <w:t>68</w:t>
+            </w:r>
+          </w:p>
+        </w:tc>
+        <w:tc>
+          <w:tcPr>
+            <w:tcW w:type="dxa" w:w="1080"/>
+          </w:tcPr>
+          <w:p>
+            <w:r>
+              <w:t>65</w:t>
+            </w:r>
+          </w:p>
+        </w:tc>
+      </w:tr>
+      <w:tr>
+        <w:tc>
+          <w:tcPr>
+            <w:tcW w:type="dxa" w:w="1080"/>
+          </w:tcPr>
+          <w:p>
+            <w:r>
+              <w:t>boat_img</w:t>
+            </w:r>
+          </w:p>
+        </w:tc>
+        <w:tc>
+          <w:tcPr>
+            <w:tcW w:type="dxa" w:w="1080"/>
+          </w:tcPr>
+          <w:p>
+            <w:r>
+              <w:t>96</w:t>
+            </w:r>
+          </w:p>
+        </w:tc>
+        <w:tc>
+          <w:tcPr>
+            <w:tcW w:type="dxa" w:w="1080"/>
+          </w:tcPr>
+          <w:p>
+            <w:r>
+              <w:t>94</w:t>
+            </w:r>
+          </w:p>
+        </w:tc>
+        <w:tc>
+          <w:tcPr>
+            <w:tcW w:type="dxa" w:w="1080"/>
+          </w:tcPr>
+          <w:p>
+            <w:r>
+              <w:t>90</w:t>
+            </w:r>
+          </w:p>
+        </w:tc>
+        <w:tc>
+          <w:tcPr>
+            <w:tcW w:type="dxa" w:w="1080"/>
+          </w:tcPr>
+          <w:p>
+            <w:r>
+              <w:t>78</w:t>
+            </w:r>
+          </w:p>
+        </w:tc>
+        <w:tc>
+          <w:tcPr>
+            <w:tcW w:type="dxa" w:w="1080"/>
+          </w:tcPr>
+          <w:p>
+            <w:r>
+              <w:t>73</w:t>
+            </w:r>
+          </w:p>
+        </w:tc>
+        <w:tc>
+          <w:tcPr>
+            <w:tcW w:type="dxa" w:w="1080"/>
+          </w:tcPr>
+          <w:p>
+            <w:r>
+              <w:t>68</w:t>
+            </w:r>
+          </w:p>
+        </w:tc>
+        <w:tc>
+          <w:tcPr>
+            <w:tcW w:type="dxa" w:w="1080"/>
+          </w:tcPr>
+          <w:p>
+            <w:r>
+              <w:t>65</w:t>
+            </w:r>
+          </w:p>
+        </w:tc>
+      </w:tr>
+      <w:tr>
+        <w:tc>
+          <w:tcPr>
+            <w:tcW w:type="dxa" w:w="1080"/>
+          </w:tcPr>
+          <w:p>
+            <w:r>
+              <w:t>cameraman_img</w:t>
+            </w:r>
+          </w:p>
+        </w:tc>
+        <w:tc>
+          <w:tcPr>
+            <w:tcW w:type="dxa" w:w="1080"/>
+          </w:tcPr>
+          <w:p>
+            <w:r>
+              <w:t>96</w:t>
+            </w:r>
+          </w:p>
+        </w:tc>
+        <w:tc>
+          <w:tcPr>
+            <w:tcW w:type="dxa" w:w="1080"/>
+          </w:tcPr>
+          <w:p>
+            <w:r>
+              <w:t>93</w:t>
+            </w:r>
+          </w:p>
+        </w:tc>
+        <w:tc>
+          <w:tcPr>
+            <w:tcW w:type="dxa" w:w="1080"/>
+          </w:tcPr>
+          <w:p>
+            <w:r>
+              <w:t>90</w:t>
+            </w:r>
+          </w:p>
+        </w:tc>
+        <w:tc>
+          <w:tcPr>
+            <w:tcW w:type="dxa" w:w="1080"/>
+          </w:tcPr>
+          <w:p>
+            <w:r>
+              <w:t>78</w:t>
+            </w:r>
+          </w:p>
+        </w:tc>
+        <w:tc>
+          <w:tcPr>
+            <w:tcW w:type="dxa" w:w="1080"/>
+          </w:tcPr>
+          <w:p>
+            <w:r>
+              <w:t>73</w:t>
+            </w:r>
+          </w:p>
+        </w:tc>
+        <w:tc>
+          <w:tcPr>
+            <w:tcW w:type="dxa" w:w="1080"/>
+          </w:tcPr>
+          <w:p>
+            <w:r>
+              <w:t>68</w:t>
+            </w:r>
+          </w:p>
+        </w:tc>
+        <w:tc>
+          <w:tcPr>
+            <w:tcW w:type="dxa" w:w="1080"/>
+          </w:tcPr>
+          <w:p>
+            <w:r>
+              <w:t>65</w:t>
+            </w:r>
+          </w:p>
+        </w:tc>
+      </w:tr>
+      <w:tr>
+        <w:tc>
+          <w:tcPr>
+            <w:tcW w:type="dxa" w:w="1080"/>
+          </w:tcPr>
+          <w:p>
+            <w:r>
+              <w:t>peppers_img</w:t>
+            </w:r>
+          </w:p>
+        </w:tc>
+        <w:tc>
+          <w:tcPr>
+            <w:tcW w:type="dxa" w:w="1080"/>
+          </w:tcPr>
+          <w:p>
+            <w:r>
+              <w:t>96</w:t>
+            </w:r>
+          </w:p>
+        </w:tc>
+        <w:tc>
+          <w:tcPr>
+            <w:tcW w:type="dxa" w:w="1080"/>
+          </w:tcPr>
+          <w:p>
+            <w:r>
+              <w:t>94</w:t>
+            </w:r>
+          </w:p>
+        </w:tc>
+        <w:tc>
+          <w:tcPr>
+            <w:tcW w:type="dxa" w:w="1080"/>
+          </w:tcPr>
+          <w:p>
+            <w:r>
+              <w:t>90</w:t>
+            </w:r>
+          </w:p>
+        </w:tc>
+        <w:tc>
+          <w:tcPr>
+            <w:tcW w:type="dxa" w:w="1080"/>
+          </w:tcPr>
+          <w:p>
+            <w:r>
+              <w:t>79</w:t>
+            </w:r>
+          </w:p>
+        </w:tc>
+        <w:tc>
+          <w:tcPr>
+            <w:tcW w:type="dxa" w:w="1080"/>
+          </w:tcPr>
+          <w:p>
+            <w:r>
+              <w:t>73</w:t>
+            </w:r>
+          </w:p>
+        </w:tc>
+        <w:tc>
+          <w:tcPr>
+            <w:tcW w:type="dxa" w:w="1080"/>
+          </w:tcPr>
+          <w:p>
+            <w:r>
+              <w:t>68</w:t>
+            </w:r>
+          </w:p>
+        </w:tc>
+        <w:tc>
+          <w:tcPr>
+            <w:tcW w:type="dxa" w:w="1080"/>
+          </w:tcPr>
+          <w:p>
+            <w:r>
+              <w:t>66</w:t>
+            </w:r>
+          </w:p>
+        </w:tc>
+      </w:tr>
+      <w:tr>
+        <w:tc>
+          <w:tcPr>
+            <w:tcW w:type="dxa" w:w="1080"/>
+          </w:tcPr>
+          <w:p>
+            <w:r>
+              <w:t>chest_xray2_img</w:t>
+            </w:r>
+          </w:p>
+        </w:tc>
+        <w:tc>
+          <w:tcPr>
+            <w:tcW w:type="dxa" w:w="1080"/>
+          </w:tcPr>
+          <w:p>
+            <w:r>
+              <w:t>96</w:t>
+            </w:r>
+          </w:p>
+        </w:tc>
+        <w:tc>
+          <w:tcPr>
+            <w:tcW w:type="dxa" w:w="1080"/>
+          </w:tcPr>
+          <w:p>
+            <w:r>
+              <w:t>94</w:t>
+            </w:r>
+          </w:p>
+        </w:tc>
+        <w:tc>
+          <w:tcPr>
+            <w:tcW w:type="dxa" w:w="1080"/>
+          </w:tcPr>
+          <w:p>
+            <w:r>
+              <w:t>90</w:t>
+            </w:r>
+          </w:p>
+        </w:tc>
+        <w:tc>
+          <w:tcPr>
+            <w:tcW w:type="dxa" w:w="1080"/>
+          </w:tcPr>
+          <w:p>
+            <w:r>
+              <w:t>79</w:t>
+            </w:r>
+          </w:p>
+        </w:tc>
+        <w:tc>
+          <w:tcPr>
+            <w:tcW w:type="dxa" w:w="1080"/>
+          </w:tcPr>
+          <w:p>
+            <w:r>
+              <w:t>73</w:t>
+            </w:r>
+          </w:p>
+        </w:tc>
+        <w:tc>
+          <w:tcPr>
+            <w:tcW w:type="dxa" w:w="1080"/>
+          </w:tcPr>
+          <w:p>
+            <w:r>
+              <w:t>68</w:t>
+            </w:r>
+          </w:p>
+        </w:tc>
+        <w:tc>
+          <w:tcPr>
+            <w:tcW w:type="dxa" w:w="1080"/>
+          </w:tcPr>
+          <w:p>
+            <w:r>
+              <w:t>65</w:t>
+            </w:r>
+          </w:p>
+        </w:tc>
+      </w:tr>
+      <w:tr>
+        <w:tc>
+          <w:tcPr>
+            <w:tcW w:type="dxa" w:w="1080"/>
+          </w:tcPr>
+          <w:p>
+            <w:r>
+              <w:t>mammo2_img</w:t>
+            </w:r>
+          </w:p>
+        </w:tc>
+        <w:tc>
+          <w:tcPr>
+            <w:tcW w:type="dxa" w:w="1080"/>
+          </w:tcPr>
+          <w:p>
+            <w:r>
+              <w:t>96</w:t>
+            </w:r>
+          </w:p>
+        </w:tc>
+        <w:tc>
+          <w:tcPr>
+            <w:tcW w:type="dxa" w:w="1080"/>
+          </w:tcPr>
+          <w:p>
+            <w:r>
+              <w:t>94</w:t>
+            </w:r>
+          </w:p>
+        </w:tc>
+        <w:tc>
+          <w:tcPr>
+            <w:tcW w:type="dxa" w:w="1080"/>
+          </w:tcPr>
+          <w:p>
+            <w:r>
+              <w:t>90</w:t>
+            </w:r>
+          </w:p>
+        </w:tc>
+        <w:tc>
+          <w:tcPr>
+            <w:tcW w:type="dxa" w:w="1080"/>
+          </w:tcPr>
+          <w:p>
+            <w:r>
+              <w:t>79</w:t>
+            </w:r>
+          </w:p>
+        </w:tc>
+        <w:tc>
+          <w:tcPr>
+            <w:tcW w:type="dxa" w:w="1080"/>
+          </w:tcPr>
+          <w:p>
+            <w:r>
+              <w:t>73</w:t>
+            </w:r>
+          </w:p>
+        </w:tc>
+        <w:tc>
+          <w:tcPr>
+            <w:tcW w:type="dxa" w:w="1080"/>
+          </w:tcPr>
+          <w:p>
+            <w:r>
+              <w:t>68</w:t>
+            </w:r>
+          </w:p>
+        </w:tc>
+        <w:tc>
+          <w:tcPr>
+            <w:tcW w:type="dxa" w:w="1080"/>
+          </w:tcPr>
+          <w:p>
+            <w:r>
+              <w:t>65</w:t>
+            </w:r>
+          </w:p>
+        </w:tc>
+      </w:tr>
+      <w:tr>
+        <w:tc>
+          <w:tcPr>
+            <w:tcW w:type="dxa" w:w="1080"/>
+          </w:tcPr>
+          <w:p>
+            <w:r>
+              <w:t>lung_ct2_img</w:t>
+            </w:r>
+          </w:p>
+        </w:tc>
+        <w:tc>
+          <w:tcPr>
+            <w:tcW w:type="dxa" w:w="1080"/>
+          </w:tcPr>
+          <w:p>
+            <w:r>
+              <w:t>96</w:t>
+            </w:r>
+          </w:p>
+        </w:tc>
+        <w:tc>
+          <w:tcPr>
+            <w:tcW w:type="dxa" w:w="1080"/>
+          </w:tcPr>
+          <w:p>
+            <w:r>
+              <w:t>93</w:t>
+            </w:r>
+          </w:p>
+        </w:tc>
+        <w:tc>
+          <w:tcPr>
+            <w:tcW w:type="dxa" w:w="1080"/>
+          </w:tcPr>
+          <w:p>
+            <w:r>
+              <w:t>89</w:t>
+            </w:r>
+          </w:p>
+        </w:tc>
+        <w:tc>
+          <w:tcPr>
+            <w:tcW w:type="dxa" w:w="1080"/>
+          </w:tcPr>
+          <w:p>
+            <w:r>
+              <w:t>78</w:t>
+            </w:r>
+          </w:p>
+        </w:tc>
+        <w:tc>
+          <w:tcPr>
+            <w:tcW w:type="dxa" w:w="1080"/>
+          </w:tcPr>
+          <w:p>
+            <w:r>
+              <w:t>73</w:t>
+            </w:r>
+          </w:p>
+        </w:tc>
+        <w:tc>
+          <w:tcPr>
+            <w:tcW w:type="dxa" w:w="1080"/>
+          </w:tcPr>
+          <w:p>
+            <w:r>
+              <w:t>68</w:t>
+            </w:r>
+          </w:p>
+        </w:tc>
+        <w:tc>
+          <w:tcPr>
+            <w:tcW w:type="dxa" w:w="1080"/>
+          </w:tcPr>
+          <w:p>
+            <w:r>
+              <w:t>65</w:t>
+            </w:r>
+          </w:p>
+        </w:tc>
+      </w:tr>
+      <w:tr>
+        <w:tc>
+          <w:tcPr>
+            <w:tcW w:type="dxa" w:w="1080"/>
+          </w:tcPr>
+          <w:p>
+            <w:r>
+              <w:t>brain_mri2_img</w:t>
+            </w:r>
+          </w:p>
+        </w:tc>
+        <w:tc>
+          <w:tcPr>
+            <w:tcW w:type="dxa" w:w="1080"/>
+          </w:tcPr>
+          <w:p>
+            <w:r>
+              <w:t>96</w:t>
+            </w:r>
+          </w:p>
+        </w:tc>
+        <w:tc>
+          <w:tcPr>
+            <w:tcW w:type="dxa" w:w="1080"/>
+          </w:tcPr>
+          <w:p>
+            <w:r>
+              <w:t>94</w:t>
+            </w:r>
+          </w:p>
+        </w:tc>
+        <w:tc>
+          <w:tcPr>
+            <w:tcW w:type="dxa" w:w="1080"/>
+          </w:tcPr>
+          <w:p>
+            <w:r>
+              <w:t>89</w:t>
+            </w:r>
+          </w:p>
+        </w:tc>
+        <w:tc>
+          <w:tcPr>
+            <w:tcW w:type="dxa" w:w="1080"/>
+          </w:tcPr>
+          <w:p>
+            <w:r>
+              <w:t>79</w:t>
+            </w:r>
+          </w:p>
+        </w:tc>
+        <w:tc>
+          <w:tcPr>
+            <w:tcW w:type="dxa" w:w="1080"/>
+          </w:tcPr>
+          <w:p>
+            <w:r>
+              <w:t>73</w:t>
+            </w:r>
+          </w:p>
+        </w:tc>
+        <w:tc>
+          <w:tcPr>
+            <w:tcW w:type="dxa" w:w="1080"/>
+          </w:tcPr>
+          <w:p>
+            <w:r>
+              <w:t>68</w:t>
+            </w:r>
+          </w:p>
+        </w:tc>
+        <w:tc>
+          <w:tcPr>
+            <w:tcW w:type="dxa" w:w="1080"/>
+          </w:tcPr>
+          <w:p>
+            <w:r>
+              <w:t>66</w:t>
+            </w:r>
+          </w:p>
+        </w:tc>
+      </w:tr>
+      <w:tr>
+        <w:tc>
+          <w:tcPr>
+            <w:tcW w:type="dxa" w:w="1080"/>
+          </w:tcPr>
+          <w:p>
+            <w:r>
+              <w:t>lena_color</w:t>
+            </w:r>
+          </w:p>
+        </w:tc>
+        <w:tc>
+          <w:tcPr>
+            <w:tcW w:type="dxa" w:w="1080"/>
+          </w:tcPr>
+          <w:p>
+            <w:r>
+              <w:t>96</w:t>
+            </w:r>
+          </w:p>
+        </w:tc>
+        <w:tc>
+          <w:tcPr>
+            <w:tcW w:type="dxa" w:w="1080"/>
+          </w:tcPr>
+          <w:p>
+            <w:r>
+              <w:t>94</w:t>
+            </w:r>
+          </w:p>
+        </w:tc>
+        <w:tc>
+          <w:tcPr>
+            <w:tcW w:type="dxa" w:w="1080"/>
+          </w:tcPr>
+          <w:p>
+            <w:r>
+              <w:t>89</w:t>
+            </w:r>
+          </w:p>
+        </w:tc>
+        <w:tc>
+          <w:tcPr>
+            <w:tcW w:type="dxa" w:w="1080"/>
+          </w:tcPr>
+          <w:p>
+            <w:r>
+              <w:t>79</w:t>
+            </w:r>
+          </w:p>
+        </w:tc>
+        <w:tc>
+          <w:tcPr>
+            <w:tcW w:type="dxa" w:w="1080"/>
+          </w:tcPr>
+          <w:p>
+            <w:r>
+              <w:t>73</w:t>
+            </w:r>
+          </w:p>
+        </w:tc>
+        <w:tc>
+          <w:tcPr>
+            <w:tcW w:type="dxa" w:w="1080"/>
+          </w:tcPr>
+          <w:p>
+            <w:r>
+              <w:t>68</w:t>
+            </w:r>
+          </w:p>
+        </w:tc>
+        <w:tc>
+          <w:tcPr>
+            <w:tcW w:type="dxa" w:w="1080"/>
+          </w:tcPr>
+          <w:p>
+            <w:r>
+              <w:t>65</w:t>
+            </w:r>
+          </w:p>
+        </w:tc>
+      </w:tr>
+      <w:tr>
+        <w:tc>
+          <w:tcPr>
+            <w:tcW w:type="dxa" w:w="1080"/>
+          </w:tcPr>
+          <w:p>
+            <w:r>
+              <w:t>retina2_color</w:t>
+            </w:r>
+          </w:p>
+        </w:tc>
+        <w:tc>
+          <w:tcPr>
+            <w:tcW w:type="dxa" w:w="1080"/>
+          </w:tcPr>
+          <w:p>
+            <w:r>
+              <w:t>96</w:t>
+            </w:r>
+          </w:p>
+        </w:tc>
+        <w:tc>
+          <w:tcPr>
+            <w:tcW w:type="dxa" w:w="1080"/>
+          </w:tcPr>
+          <w:p>
+            <w:r>
+              <w:t>95</w:t>
+            </w:r>
+          </w:p>
+        </w:tc>
+        <w:tc>
+          <w:tcPr>
+            <w:tcW w:type="dxa" w:w="1080"/>
+          </w:tcPr>
+          <w:p>
+            <w:r>
+              <w:t>89</w:t>
+            </w:r>
+          </w:p>
+        </w:tc>
+        <w:tc>
+          <w:tcPr>
+            <w:tcW w:type="dxa" w:w="1080"/>
+          </w:tcPr>
+          <w:p>
+            <w:r>
+              <w:t>78</w:t>
+            </w:r>
+          </w:p>
+        </w:tc>
+        <w:tc>
+          <w:tcPr>
+            <w:tcW w:type="dxa" w:w="1080"/>
+          </w:tcPr>
+          <w:p>
+            <w:r>
+              <w:t>73</w:t>
+            </w:r>
+          </w:p>
+        </w:tc>
+        <w:tc>
+          <w:tcPr>
+            <w:tcW w:type="dxa" w:w="1080"/>
+          </w:tcPr>
+          <w:p>
+            <w:r>
+              <w:t>68</w:t>
+            </w:r>
+          </w:p>
+        </w:tc>
+        <w:tc>
+          <w:tcPr>
+            <w:tcW w:type="dxa" w:w="1080"/>
+          </w:tcPr>
+          <w:p>
+            <w:r>
+              <w:t>65</w:t>
+            </w:r>
+          </w:p>
+        </w:tc>
+      </w:tr>
+      <w:tr>
+        <w:tc>
+          <w:tcPr>
+            <w:tcW w:type="dxa" w:w="1080"/>
+          </w:tcPr>
+          <w:p>
+            <w:r>
+              <w:t>brain_pet3_color</w:t>
+            </w:r>
+          </w:p>
+        </w:tc>
+        <w:tc>
+          <w:tcPr>
+            <w:tcW w:type="dxa" w:w="1080"/>
+          </w:tcPr>
+          <w:p>
+            <w:r>
+              <w:t>96</w:t>
+            </w:r>
+          </w:p>
+        </w:tc>
+        <w:tc>
+          <w:tcPr>
+            <w:tcW w:type="dxa" w:w="1080"/>
+          </w:tcPr>
+          <w:p>
+            <w:r>
+              <w:t>94</w:t>
+            </w:r>
+          </w:p>
+        </w:tc>
+        <w:tc>
+          <w:tcPr>
+            <w:tcW w:type="dxa" w:w="1080"/>
+          </w:tcPr>
+          <w:p>
+            <w:r>
+              <w:t>90</w:t>
+            </w:r>
+          </w:p>
+        </w:tc>
+        <w:tc>
+          <w:tcPr>
+            <w:tcW w:type="dxa" w:w="1080"/>
+          </w:tcPr>
+          <w:p>
+            <w:r>
+              <w:t>78</w:t>
+            </w:r>
+          </w:p>
+        </w:tc>
+        <w:tc>
+          <w:tcPr>
+            <w:tcW w:type="dxa" w:w="1080"/>
+          </w:tcPr>
+          <w:p>
+            <w:r>
+              <w:t>73</w:t>
+            </w:r>
+          </w:p>
+        </w:tc>
+        <w:tc>
+          <w:tcPr>
+            <w:tcW w:type="dxa" w:w="1080"/>
+          </w:tcPr>
+          <w:p>
+            <w:r>
+              <w:t>68</w:t>
+            </w:r>
+          </w:p>
+        </w:tc>
+        <w:tc>
+          <w:tcPr>
+            <w:tcW w:type="dxa" w:w="1080"/>
+          </w:tcPr>
+          <w:p>
+            <w:r>
+              <w:t>65</w:t>
+            </w:r>
+          </w:p>
+        </w:tc>
+      </w:tr>
+      <w:tr>
+        <w:tc>
+          <w:tcPr>
+            <w:tcW w:type="dxa" w:w="1080"/>
+          </w:tcPr>
+          <w:p>
+            <w:r>
+              <w:t>brain_pet4_color</w:t>
+            </w:r>
+          </w:p>
+        </w:tc>
+        <w:tc>
+          <w:tcPr>
+            <w:tcW w:type="dxa" w:w="1080"/>
+          </w:tcPr>
+          <w:p>
+            <w:r>
+              <w:t>96</w:t>
+            </w:r>
+          </w:p>
+        </w:tc>
+        <w:tc>
+          <w:tcPr>
+            <w:tcW w:type="dxa" w:w="1080"/>
+          </w:tcPr>
+          <w:p>
+            <w:r>
+              <w:t>94</w:t>
+            </w:r>
+          </w:p>
+        </w:tc>
+        <w:tc>
+          <w:tcPr>
+            <w:tcW w:type="dxa" w:w="1080"/>
+          </w:tcPr>
+          <w:p>
+            <w:r>
+              <w:t>89</w:t>
+            </w:r>
+          </w:p>
+        </w:tc>
+        <w:tc>
+          <w:tcPr>
+            <w:tcW w:type="dxa" w:w="1080"/>
+          </w:tcPr>
+          <w:p>
+            <w:r>
+              <w:t>78</w:t>
+            </w:r>
+          </w:p>
+        </w:tc>
+        <w:tc>
+          <w:tcPr>
+            <w:tcW w:type="dxa" w:w="1080"/>
+          </w:tcPr>
+          <w:p>
+            <w:r>
+              <w:t>73</w:t>
+            </w:r>
+          </w:p>
+        </w:tc>
+        <w:tc>
+          <w:tcPr>
+            <w:tcW w:type="dxa" w:w="1080"/>
+          </w:tcPr>
+          <w:p>
+            <w:r>
+              <w:t>68</w:t>
+            </w:r>
+          </w:p>
+        </w:tc>
+        <w:tc>
+          <w:tcPr>
+            <w:tcW w:type="dxa" w:w="1080"/>
+          </w:tcPr>
+          <w:p>
+            <w:r>
+              <w:t>65</w:t>
+            </w:r>
+          </w:p>
+        </w:tc>
+      </w:tr>
+    </w:tbl>
+    <w:p/>
+    <w:p>
+      <w:r>
+        <w:rPr>
+          <w:b/>
+        </w:rPr>
+        <w:t>الزمن المطلق (ثانية): المتسلسل (LBG / Total) و np=14 (LBG / Total)</w:t>
+      </w:r>
+    </w:p>
+    <w:tbl>
+      <w:tblPr>
+        <w:tblStyle w:val="TableGrid"/>
+        <w:tblW w:type="auto" w:w="0"/>
+        <w:tblLook w:firstColumn="1" w:firstRow="1" w:lastColumn="0" w:lastRow="0" w:noHBand="0" w:noVBand="1" w:val="04A0"/>
+      </w:tblPr>
+      <w:tblGrid>
+        <w:gridCol w:w="1728"/>
+        <w:gridCol w:w="1728"/>
+        <w:gridCol w:w="1728"/>
+        <w:gridCol w:w="1728"/>
+        <w:gridCol w:w="1728"/>
+      </w:tblGrid>
+      <w:tr>
+        <w:tc>
+          <w:tcPr>
+            <w:tcW w:type="dxa" w:w="1728"/>
+          </w:tcPr>
+          <w:p>
+            <w:r>
+              <w:t>الصورة</w:t>
+            </w:r>
+          </w:p>
+        </w:tc>
+        <w:tc>
+          <w:tcPr>
+            <w:tcW w:type="dxa" w:w="1728"/>
+          </w:tcPr>
+          <w:p>
+            <w:r>
+              <w:t>LBG متسلسل</w:t>
+            </w:r>
+          </w:p>
+        </w:tc>
+        <w:tc>
+          <w:tcPr>
+            <w:tcW w:type="dxa" w:w="1728"/>
+          </w:tcPr>
+          <w:p>
+            <w:r>
+              <w:t>Total متسلسل</w:t>
+            </w:r>
+          </w:p>
+        </w:tc>
+        <w:tc>
+          <w:tcPr>
+            <w:tcW w:type="dxa" w:w="1728"/>
+          </w:tcPr>
+          <w:p>
+            <w:r>
+              <w:t>LBG np=14</w:t>
+            </w:r>
+          </w:p>
+        </w:tc>
+        <w:tc>
+          <w:tcPr>
+            <w:tcW w:type="dxa" w:w="1728"/>
+          </w:tcPr>
+          <w:p>
+            <w:r>
+              <w:t>Total np=14</w:t>
+            </w:r>
+          </w:p>
+        </w:tc>
+      </w:tr>
+      <w:tr>
+        <w:tc>
+          <w:tcPr>
+            <w:tcW w:type="dxa" w:w="1728"/>
+          </w:tcPr>
+          <w:p>
+            <w:r>
+              <w:t>gray</w:t>
+            </w:r>
+          </w:p>
+        </w:tc>
+        <w:tc>
+          <w:tcPr>
+            <w:tcW w:type="dxa" w:w="1728"/>
+          </w:tcPr>
+          <w:p>
+            <w:r>
+              <w:t>0.2639</w:t>
+            </w:r>
+          </w:p>
+        </w:tc>
+        <w:tc>
+          <w:tcPr>
+            <w:tcW w:type="dxa" w:w="1728"/>
+          </w:tcPr>
+          <w:p>
+            <w:r>
+              <w:t>0.3483</w:t>
+            </w:r>
+          </w:p>
+        </w:tc>
+        <w:tc>
+          <w:tcPr>
+            <w:tcW w:type="dxa" w:w="1728"/>
+          </w:tcPr>
+          <w:p>
+            <w:r>
+              <w:t>0.0288</w:t>
+            </w:r>
+          </w:p>
+        </w:tc>
+        <w:tc>
+          <w:tcPr>
+            <w:tcW w:type="dxa" w:w="1728"/>
+          </w:tcPr>
+          <w:p>
+            <w:r>
+              <w:t>0.077</w:t>
+            </w:r>
+          </w:p>
+        </w:tc>
+      </w:tr>
+      <w:tr>
+        <w:tc>
+          <w:tcPr>
+            <w:tcW w:type="dxa" w:w="1728"/>
+          </w:tcPr>
+          <w:p>
+            <w:r>
+              <w:t>boat_img</w:t>
+            </w:r>
+          </w:p>
+        </w:tc>
+        <w:tc>
+          <w:tcPr>
+            <w:tcW w:type="dxa" w:w="1728"/>
+          </w:tcPr>
+          <w:p>
+            <w:r>
+              <w:t>0.2322</w:t>
+            </w:r>
+          </w:p>
+        </w:tc>
+        <w:tc>
+          <w:tcPr>
+            <w:tcW w:type="dxa" w:w="1728"/>
+          </w:tcPr>
+          <w:p>
+            <w:r>
+              <w:t>0.3169</w:t>
+            </w:r>
+          </w:p>
+        </w:tc>
+        <w:tc>
+          <w:tcPr>
+            <w:tcW w:type="dxa" w:w="1728"/>
+          </w:tcPr>
+          <w:p>
+            <w:r>
+              <w:t>0.0256</w:t>
+            </w:r>
+          </w:p>
+        </w:tc>
+        <w:tc>
+          <w:tcPr>
+            <w:tcW w:type="dxa" w:w="1728"/>
+          </w:tcPr>
+          <w:p>
+            <w:r>
+              <w:t>0.074</w:t>
+            </w:r>
+          </w:p>
+        </w:tc>
+      </w:tr>
+      <w:tr>
+        <w:tc>
+          <w:tcPr>
+            <w:tcW w:type="dxa" w:w="1728"/>
+          </w:tcPr>
+          <w:p>
+            <w:r>
+              <w:t>cameraman_img</w:t>
+            </w:r>
+          </w:p>
+        </w:tc>
+        <w:tc>
+          <w:tcPr>
+            <w:tcW w:type="dxa" w:w="1728"/>
+          </w:tcPr>
+          <w:p>
+            <w:r>
+              <w:t>0.2374</w:t>
+            </w:r>
+          </w:p>
+        </w:tc>
+        <w:tc>
+          <w:tcPr>
+            <w:tcW w:type="dxa" w:w="1728"/>
+          </w:tcPr>
+          <w:p>
+            <w:r>
+              <w:t>0.3226</w:t>
+            </w:r>
+          </w:p>
+        </w:tc>
+        <w:tc>
+          <w:tcPr>
+            <w:tcW w:type="dxa" w:w="1728"/>
+          </w:tcPr>
+          <w:p>
+            <w:r>
+              <w:t>0.0262</w:t>
+            </w:r>
+          </w:p>
+        </w:tc>
+        <w:tc>
+          <w:tcPr>
+            <w:tcW w:type="dxa" w:w="1728"/>
+          </w:tcPr>
+          <w:p>
+            <w:r>
+              <w:t>0.074</w:t>
+            </w:r>
+          </w:p>
+        </w:tc>
+      </w:tr>
+      <w:tr>
+        <w:tc>
+          <w:tcPr>
+            <w:tcW w:type="dxa" w:w="1728"/>
+          </w:tcPr>
+          <w:p>
+            <w:r>
+              <w:t>peppers_img</w:t>
+            </w:r>
+          </w:p>
+        </w:tc>
+        <w:tc>
+          <w:tcPr>
+            <w:tcW w:type="dxa" w:w="1728"/>
+          </w:tcPr>
+          <w:p>
+            <w:r>
+              <w:t>0.2808</w:t>
+            </w:r>
+          </w:p>
+        </w:tc>
+        <w:tc>
+          <w:tcPr>
+            <w:tcW w:type="dxa" w:w="1728"/>
+          </w:tcPr>
+          <w:p>
+            <w:r>
+              <w:t>0.3651</w:t>
+            </w:r>
+          </w:p>
+        </w:tc>
+        <w:tc>
+          <w:tcPr>
+            <w:tcW w:type="dxa" w:w="1728"/>
+          </w:tcPr>
+          <w:p>
+            <w:r>
+              <w:t>0.0306</w:t>
+            </w:r>
+          </w:p>
+        </w:tc>
+        <w:tc>
+          <w:tcPr>
+            <w:tcW w:type="dxa" w:w="1728"/>
+          </w:tcPr>
+          <w:p>
+            <w:r>
+              <w:t>0.078</w:t>
+            </w:r>
+          </w:p>
+        </w:tc>
+      </w:tr>
+      <w:tr>
+        <w:tc>
+          <w:tcPr>
+            <w:tcW w:type="dxa" w:w="1728"/>
+          </w:tcPr>
+          <w:p>
+            <w:r>
+              <w:t>chest_xray2_img</w:t>
+            </w:r>
+          </w:p>
+        </w:tc>
+        <w:tc>
+          <w:tcPr>
+            <w:tcW w:type="dxa" w:w="1728"/>
+          </w:tcPr>
+          <w:p>
+            <w:r>
+              <w:t>0.2331</w:t>
+            </w:r>
+          </w:p>
+        </w:tc>
+        <w:tc>
+          <w:tcPr>
+            <w:tcW w:type="dxa" w:w="1728"/>
+          </w:tcPr>
+          <w:p>
+            <w:r>
+              <w:t>0.3175</w:t>
+            </w:r>
+          </w:p>
+        </w:tc>
+        <w:tc>
+          <w:tcPr>
+            <w:tcW w:type="dxa" w:w="1728"/>
+          </w:tcPr>
+          <w:p>
+            <w:r>
+              <w:t>0.0257</w:t>
+            </w:r>
+          </w:p>
+        </w:tc>
+        <w:tc>
+          <w:tcPr>
+            <w:tcW w:type="dxa" w:w="1728"/>
+          </w:tcPr>
+          <w:p>
+            <w:r>
+              <w:t>0.073</w:t>
+            </w:r>
+          </w:p>
+        </w:tc>
+      </w:tr>
+      <w:tr>
+        <w:tc>
+          <w:tcPr>
+            <w:tcW w:type="dxa" w:w="1728"/>
+          </w:tcPr>
+          <w:p>
+            <w:r>
+              <w:t>mammo2_img</w:t>
+            </w:r>
+          </w:p>
+        </w:tc>
+        <w:tc>
+          <w:tcPr>
+            <w:tcW w:type="dxa" w:w="1728"/>
+          </w:tcPr>
+          <w:p>
+            <w:r>
+              <w:t>0.2086</w:t>
+            </w:r>
+          </w:p>
+        </w:tc>
+        <w:tc>
+          <w:tcPr>
+            <w:tcW w:type="dxa" w:w="1728"/>
+          </w:tcPr>
+          <w:p>
+            <w:r>
+              <w:t>0.2922</w:t>
+            </w:r>
+          </w:p>
+        </w:tc>
+        <w:tc>
+          <w:tcPr>
+            <w:tcW w:type="dxa" w:w="1728"/>
+          </w:tcPr>
+          <w:p>
+            <w:r>
+              <w:t>0.0228</w:t>
+            </w:r>
+          </w:p>
+        </w:tc>
+        <w:tc>
+          <w:tcPr>
+            <w:tcW w:type="dxa" w:w="1728"/>
+          </w:tcPr>
+          <w:p>
+            <w:r>
+              <w:t>0.070</w:t>
+            </w:r>
+          </w:p>
+        </w:tc>
+      </w:tr>
+      <w:tr>
+        <w:tc>
+          <w:tcPr>
+            <w:tcW w:type="dxa" w:w="1728"/>
+          </w:tcPr>
+          <w:p>
+            <w:r>
+              <w:t>lung_ct2_img</w:t>
+            </w:r>
+          </w:p>
+        </w:tc>
+        <w:tc>
+          <w:tcPr>
+            <w:tcW w:type="dxa" w:w="1728"/>
+          </w:tcPr>
+          <w:p>
+            <w:r>
+              <w:t>0.2909</w:t>
+            </w:r>
+          </w:p>
+        </w:tc>
+        <w:tc>
+          <w:tcPr>
+            <w:tcW w:type="dxa" w:w="1728"/>
+          </w:tcPr>
+          <w:p>
+            <w:r>
+              <w:t>0.3760</w:t>
+            </w:r>
+          </w:p>
+        </w:tc>
+        <w:tc>
+          <w:tcPr>
+            <w:tcW w:type="dxa" w:w="1728"/>
+          </w:tcPr>
+          <w:p>
+            <w:r>
+              <w:t>0.0318</w:t>
+            </w:r>
+          </w:p>
+        </w:tc>
+        <w:tc>
+          <w:tcPr>
+            <w:tcW w:type="dxa" w:w="1728"/>
+          </w:tcPr>
+          <w:p>
+            <w:r>
+              <w:t>0.079</w:t>
+            </w:r>
+          </w:p>
+        </w:tc>
+      </w:tr>
+      <w:tr>
+        <w:tc>
+          <w:tcPr>
+            <w:tcW w:type="dxa" w:w="1728"/>
+          </w:tcPr>
+          <w:p>
+            <w:r>
+              <w:t>brain_mri2_img</w:t>
+            </w:r>
+          </w:p>
+        </w:tc>
+        <w:tc>
+          <w:tcPr>
+            <w:tcW w:type="dxa" w:w="1728"/>
+          </w:tcPr>
+          <w:p>
+            <w:r>
+              <w:t>0.2452</w:t>
+            </w:r>
+          </w:p>
+        </w:tc>
+        <w:tc>
+          <w:tcPr>
+            <w:tcW w:type="dxa" w:w="1728"/>
+          </w:tcPr>
+          <w:p>
+            <w:r>
+              <w:t>0.3281</w:t>
+            </w:r>
+          </w:p>
+        </w:tc>
+        <w:tc>
+          <w:tcPr>
+            <w:tcW w:type="dxa" w:w="1728"/>
+          </w:tcPr>
+          <w:p>
+            <w:r>
+              <w:t>0.0267</w:t>
+            </w:r>
+          </w:p>
+        </w:tc>
+        <w:tc>
+          <w:tcPr>
+            <w:tcW w:type="dxa" w:w="1728"/>
+          </w:tcPr>
+          <w:p>
+            <w:r>
+              <w:t>0.073</w:t>
+            </w:r>
+          </w:p>
+        </w:tc>
+      </w:tr>
+      <w:tr>
+        <w:tc>
+          <w:tcPr>
+            <w:tcW w:type="dxa" w:w="1728"/>
+          </w:tcPr>
+          <w:p>
+            <w:r>
+              <w:t>lena_color</w:t>
+            </w:r>
+          </w:p>
+        </w:tc>
+        <w:tc>
+          <w:tcPr>
+            <w:tcW w:type="dxa" w:w="1728"/>
+          </w:tcPr>
+          <w:p>
+            <w:r>
+              <w:t>0.7677</w:t>
+            </w:r>
+          </w:p>
+        </w:tc>
+        <w:tc>
+          <w:tcPr>
+            <w:tcW w:type="dxa" w:w="1728"/>
+          </w:tcPr>
+          <w:p>
+            <w:r>
+              <w:t>0.9741</w:t>
+            </w:r>
+          </w:p>
+        </w:tc>
+        <w:tc>
+          <w:tcPr>
+            <w:tcW w:type="dxa" w:w="1728"/>
+          </w:tcPr>
+          <w:p>
+            <w:r>
+              <w:t>0.0850</w:t>
+            </w:r>
+          </w:p>
+        </w:tc>
+        <w:tc>
+          <w:tcPr>
+            <w:tcW w:type="dxa" w:w="1728"/>
+          </w:tcPr>
+          <w:p>
+            <w:r>
+              <w:t>0.169</w:t>
+            </w:r>
+          </w:p>
+        </w:tc>
+      </w:tr>
+      <w:tr>
+        <w:tc>
+          <w:tcPr>
+            <w:tcW w:type="dxa" w:w="1728"/>
+          </w:tcPr>
+          <w:p>
+            <w:r>
+              <w:t>retina2_color</w:t>
+            </w:r>
+          </w:p>
+        </w:tc>
+        <w:tc>
+          <w:tcPr>
+            <w:tcW w:type="dxa" w:w="1728"/>
+          </w:tcPr>
+          <w:p>
+            <w:r>
+              <w:t>0.6573</w:t>
+            </w:r>
+          </w:p>
+        </w:tc>
+        <w:tc>
+          <w:tcPr>
+            <w:tcW w:type="dxa" w:w="1728"/>
+          </w:tcPr>
+          <w:p>
+            <w:r>
+              <w:t>0.8640</w:t>
+            </w:r>
+          </w:p>
+        </w:tc>
+        <w:tc>
+          <w:tcPr>
+            <w:tcW w:type="dxa" w:w="1728"/>
+          </w:tcPr>
+          <w:p>
+            <w:r>
+              <w:t>0.0718</w:t>
+            </w:r>
+          </w:p>
+        </w:tc>
+        <w:tc>
+          <w:tcPr>
+            <w:tcW w:type="dxa" w:w="1728"/>
+          </w:tcPr>
+          <w:p>
+            <w:r>
+              <w:t>0.153</w:t>
+            </w:r>
+          </w:p>
+        </w:tc>
+      </w:tr>
+      <w:tr>
+        <w:tc>
+          <w:tcPr>
+            <w:tcW w:type="dxa" w:w="1728"/>
+          </w:tcPr>
+          <w:p>
+            <w:r>
+              <w:t>brain_pet3_color</w:t>
+            </w:r>
+          </w:p>
+        </w:tc>
+        <w:tc>
+          <w:tcPr>
+            <w:tcW w:type="dxa" w:w="1728"/>
+          </w:tcPr>
+          <w:p>
+            <w:r>
+              <w:t>0.8050</w:t>
+            </w:r>
+          </w:p>
+        </w:tc>
+        <w:tc>
+          <w:tcPr>
+            <w:tcW w:type="dxa" w:w="1728"/>
+          </w:tcPr>
+          <w:p>
+            <w:r>
+              <w:t>1.0114</w:t>
+            </w:r>
+          </w:p>
+        </w:tc>
+        <w:tc>
+          <w:tcPr>
+            <w:tcW w:type="dxa" w:w="1728"/>
+          </w:tcPr>
+          <w:p>
+            <w:r>
+              <w:t>0.0886</w:t>
+            </w:r>
+          </w:p>
+        </w:tc>
+        <w:tc>
+          <w:tcPr>
+            <w:tcW w:type="dxa" w:w="1728"/>
+          </w:tcPr>
+          <w:p>
+            <w:r>
+              <w:t>0.171</w:t>
+            </w:r>
+          </w:p>
+        </w:tc>
+      </w:tr>
+      <w:tr>
+        <w:tc>
+          <w:tcPr>
+            <w:tcW w:type="dxa" w:w="1728"/>
+          </w:tcPr>
+          <w:p>
+            <w:r>
+              <w:t>brain_pet4_color</w:t>
+            </w:r>
+          </w:p>
+        </w:tc>
+        <w:tc>
+          <w:tcPr>
+            <w:tcW w:type="dxa" w:w="1728"/>
+          </w:tcPr>
+          <w:p>
+            <w:r>
+              <w:t>0.7811</w:t>
+            </w:r>
+          </w:p>
+        </w:tc>
+        <w:tc>
+          <w:tcPr>
+            <w:tcW w:type="dxa" w:w="1728"/>
+          </w:tcPr>
+          <w:p>
+            <w:r>
+              <w:t>0.9869</w:t>
+            </w:r>
+          </w:p>
+        </w:tc>
+        <w:tc>
+          <w:tcPr>
+            <w:tcW w:type="dxa" w:w="1728"/>
+          </w:tcPr>
+          <w:p>
+            <w:r>
+              <w:t>0.0859</w:t>
+            </w:r>
+          </w:p>
+        </w:tc>
+        <w:tc>
+          <w:tcPr>
+            <w:tcW w:type="dxa" w:w="1728"/>
+          </w:tcPr>
+          <w:p>
+            <w:r>
+              <w:t>0.169</w:t>
+            </w:r>
+          </w:p>
+        </w:tc>
+      </w:tr>
+    </w:tbl>
     <w:sectPr>
       <w:pgSz w:w="12240" w:h="15840"/>
       <w:pgMar w:top="1440" w:right="1800" w:bottom="1440" w:left="1800" w:header="720" w:footer="720" w:gutter="0"/>

</xml_diff>

<commit_message>
Add Chapter 4 review and replacement tables; correct overstated 9.3x 'theoretical limit' wording
Co-Authored-By: Claude Sonnet 5.5 <noreply@anthropic.com>
Claude-Session: https://claude.ai/code/session_01T6gEewJ8YaCdmnsfS34RJd
</commit_message>
<xml_diff>
--- a/results/NOTES_FINAL.docx
+++ b/results/NOTES_FINAL.docx
@@ -1376,7 +1376,7 @@
         <w:rPr>
           <w:rtl/>
         </w:rPr>
-        <w:t>النموذج: السرعات الحقيقية P≈274–276 وE≈176.5 مليون مقارنة/ثانية. أقصى كسب نظري للتوزيع الموزون على المتساوي ≈1.24×، فالحد الأعلى لتسارع LBG عند np=14 ≈9.3×. المقاس ≈9.1–9.2× قريب من الحد.</w:t>
+        <w:t>النموذج: السرعات المقاسة P≈274–276 وE≈176.5 مليون مقارنة/ثانية. تشغيل Equal عند np=14 يعطي 7.56×؛ والتوزيع الموزون المثالي يرفعه بنحو 1.24× إلى ≈9.3× (تقدير نموذجي وليس حداً نظرياً). المقاس 9.1–9.2× قريب من هذا التقدير. الحد المبني على سرعات النوى فقط ≈11.1×، والمحقق ≈82% منه؛ الفرق يعود إلى Allreduce والأجزاء المتسلسلة وتنافس الذاكرة ولم يُفصل بالقياس.</w:t>
       </w:r>
     </w:p>
     <w:p>
@@ -3687,7 +3687,7 @@
         <w:rPr>
           <w:rtl/>
         </w:rPr>
-        <w:t>تسارع LBG عند np=14: 9.03–9.18 على كل الصور (معدل 9.12)، قريب من الحد النظري ≈9.3 للمعالج الهجين. التباين بين الصور صغير جداً (±0.1) لأن الحمل متناسب مع عدد التكرارات.</w:t>
+        <w:t>تسارع LBG عند np=14: 9.03–9.18 على كل الصور (معدل 9.12). التباين بين الصور صغير جداً (±0.1) لأن الحمل متناسب مع عدد التكرارات. تصحيح: الرقم 9.3 تقدير من نموذج التوازن المبني على تشغيل Equal، وليس حداً نظرياً؛ الحد المبني على سرعات النوى فقط (6 P + 8 E بنسبة 0.642) ≈11.1، فالمحقق ≈82% منه.</w:t>
       </w:r>
     </w:p>
     <w:p>

</xml_diff>

<commit_message>
Add Equal vs Adaptive results (v4, 12 images), model check, IMGS override in run_eq_ad.sh
Co-Authored-By: Claude Sonnet 5.5 <noreply@anthropic.com>
Claude-Session: https://claude.ai/code/session_01T6gEewJ8YaCdmnsfS34RJd
</commit_message>
<xml_diff>
--- a/results/NOTES_FINAL.docx
+++ b/results/NOTES_FINAL.docx
@@ -7736,6 +7736,497 @@
         </w:tc>
       </w:tr>
     </w:tbl>
+    <w:p>
+      <w:pPr>
+        <w:pStyle w:val="Heading1"/>
+        <w:bidi/>
+      </w:pPr>
+      <w:r>
+        <w:rPr>
+          <w:rtl/>
+        </w:rPr>
+        <w:t>11. Equal مقابل Adaptive (pam_v4، تشغيل إجباري بالتناوب، وسيط 5، 12 صورة)</w:t>
+      </w:r>
+    </w:p>
+    <w:tbl>
+      <w:tblPr>
+        <w:tblStyle w:val="TableGrid"/>
+        <w:tblW w:type="auto" w:w="0"/>
+        <w:tblLook w:firstColumn="1" w:firstRow="1" w:lastColumn="0" w:lastRow="0" w:noHBand="0" w:noVBand="1" w:val="04A0"/>
+      </w:tblPr>
+      <w:tblGrid>
+        <w:gridCol w:w="1728"/>
+        <w:gridCol w:w="1728"/>
+        <w:gridCol w:w="1728"/>
+        <w:gridCol w:w="1728"/>
+        <w:gridCol w:w="1728"/>
+      </w:tblGrid>
+      <w:tr>
+        <w:tc>
+          <w:tcPr>
+            <w:tcW w:type="dxa" w:w="1728"/>
+          </w:tcPr>
+          <w:p>
+            <w:r>
+              <w:t>np</w:t>
+            </w:r>
+          </w:p>
+        </w:tc>
+        <w:tc>
+          <w:tcPr>
+            <w:tcW w:type="dxa" w:w="1728"/>
+          </w:tcPr>
+          <w:p>
+            <w:r>
+              <w:t>متوسط كسب Adaptive %</w:t>
+            </w:r>
+          </w:p>
+        </w:tc>
+        <w:tc>
+          <w:tcPr>
+            <w:tcW w:type="dxa" w:w="1728"/>
+          </w:tcPr>
+          <w:p>
+            <w:r>
+              <w:t>أدنى</w:t>
+            </w:r>
+          </w:p>
+        </w:tc>
+        <w:tc>
+          <w:tcPr>
+            <w:tcW w:type="dxa" w:w="1728"/>
+          </w:tcPr>
+          <w:p>
+            <w:r>
+              <w:t>أعلى</w:t>
+            </w:r>
+          </w:p>
+        </w:tc>
+        <w:tc>
+          <w:tcPr>
+            <w:tcW w:type="dxa" w:w="1728"/>
+          </w:tcPr>
+          <w:p>
+            <w:r>
+              <w:t>النموذج %</w:t>
+            </w:r>
+          </w:p>
+        </w:tc>
+      </w:tr>
+      <w:tr>
+        <w:tc>
+          <w:tcPr>
+            <w:tcW w:type="dxa" w:w="1728"/>
+          </w:tcPr>
+          <w:p>
+            <w:r>
+              <w:t>2</w:t>
+            </w:r>
+          </w:p>
+        </w:tc>
+        <w:tc>
+          <w:tcPr>
+            <w:tcW w:type="dxa" w:w="1728"/>
+          </w:tcPr>
+          <w:p>
+            <w:r>
+              <w:t>-0.1</w:t>
+            </w:r>
+          </w:p>
+        </w:tc>
+        <w:tc>
+          <w:tcPr>
+            <w:tcW w:type="dxa" w:w="1728"/>
+          </w:tcPr>
+          <w:p>
+            <w:r>
+              <w:t>-0.5</w:t>
+            </w:r>
+          </w:p>
+        </w:tc>
+        <w:tc>
+          <w:tcPr>
+            <w:tcW w:type="dxa" w:w="1728"/>
+          </w:tcPr>
+          <w:p>
+            <w:r>
+              <w:t>0.2</w:t>
+            </w:r>
+          </w:p>
+        </w:tc>
+        <w:tc>
+          <w:tcPr>
+            <w:tcW w:type="dxa" w:w="1728"/>
+          </w:tcPr>
+          <w:p>
+            <w:r>
+              <w:t>0</w:t>
+            </w:r>
+          </w:p>
+        </w:tc>
+      </w:tr>
+      <w:tr>
+        <w:tc>
+          <w:tcPr>
+            <w:tcW w:type="dxa" w:w="1728"/>
+          </w:tcPr>
+          <w:p>
+            <w:r>
+              <w:t>4</w:t>
+            </w:r>
+          </w:p>
+        </w:tc>
+        <w:tc>
+          <w:tcPr>
+            <w:tcW w:type="dxa" w:w="1728"/>
+          </w:tcPr>
+          <w:p>
+            <w:r>
+              <w:t>-0.2*</w:t>
+            </w:r>
+          </w:p>
+        </w:tc>
+        <w:tc>
+          <w:tcPr>
+            <w:tcW w:type="dxa" w:w="1728"/>
+          </w:tcPr>
+          <w:p>
+            <w:r>
+              <w:t>-0.8</w:t>
+            </w:r>
+          </w:p>
+        </w:tc>
+        <w:tc>
+          <w:tcPr>
+            <w:tcW w:type="dxa" w:w="1728"/>
+          </w:tcPr>
+          <w:p>
+            <w:r>
+              <w:t>0.5</w:t>
+            </w:r>
+          </w:p>
+        </w:tc>
+        <w:tc>
+          <w:tcPr>
+            <w:tcW w:type="dxa" w:w="1728"/>
+          </w:tcPr>
+          <w:p>
+            <w:r>
+              <w:t>0</w:t>
+            </w:r>
+          </w:p>
+        </w:tc>
+      </w:tr>
+      <w:tr>
+        <w:tc>
+          <w:tcPr>
+            <w:tcW w:type="dxa" w:w="1728"/>
+          </w:tcPr>
+          <w:p>
+            <w:r>
+              <w:t>6</w:t>
+            </w:r>
+          </w:p>
+        </w:tc>
+        <w:tc>
+          <w:tcPr>
+            <w:tcW w:type="dxa" w:w="1728"/>
+          </w:tcPr>
+          <w:p>
+            <w:r>
+              <w:t>-0.3*</w:t>
+            </w:r>
+          </w:p>
+        </w:tc>
+        <w:tc>
+          <w:tcPr>
+            <w:tcW w:type="dxa" w:w="1728"/>
+          </w:tcPr>
+          <w:p>
+            <w:r>
+              <w:t>-1.3</w:t>
+            </w:r>
+          </w:p>
+        </w:tc>
+        <w:tc>
+          <w:tcPr>
+            <w:tcW w:type="dxa" w:w="1728"/>
+          </w:tcPr>
+          <w:p>
+            <w:r>
+              <w:t>0.1</w:t>
+            </w:r>
+          </w:p>
+        </w:tc>
+        <w:tc>
+          <w:tcPr>
+            <w:tcW w:type="dxa" w:w="1728"/>
+          </w:tcPr>
+          <w:p>
+            <w:r>
+              <w:t>0</w:t>
+            </w:r>
+          </w:p>
+        </w:tc>
+      </w:tr>
+      <w:tr>
+        <w:tc>
+          <w:tcPr>
+            <w:tcW w:type="dxa" w:w="1728"/>
+          </w:tcPr>
+          <w:p>
+            <w:r>
+              <w:t>8</w:t>
+            </w:r>
+          </w:p>
+        </w:tc>
+        <w:tc>
+          <w:tcPr>
+            <w:tcW w:type="dxa" w:w="1728"/>
+          </w:tcPr>
+          <w:p>
+            <w:r>
+              <w:t>28.5*</w:t>
+            </w:r>
+          </w:p>
+        </w:tc>
+        <w:tc>
+          <w:tcPr>
+            <w:tcW w:type="dxa" w:w="1728"/>
+          </w:tcPr>
+          <w:p>
+            <w:r>
+              <w:t>28.2</w:t>
+            </w:r>
+          </w:p>
+        </w:tc>
+        <w:tc>
+          <w:tcPr>
+            <w:tcW w:type="dxa" w:w="1728"/>
+          </w:tcPr>
+          <w:p>
+            <w:r>
+              <w:t>28.8</w:t>
+            </w:r>
+          </w:p>
+        </w:tc>
+        <w:tc>
+          <w:tcPr>
+            <w:tcW w:type="dxa" w:w="1728"/>
+          </w:tcPr>
+          <w:p>
+            <w:r>
+              <w:t>29.5</w:t>
+            </w:r>
+          </w:p>
+        </w:tc>
+      </w:tr>
+      <w:tr>
+        <w:tc>
+          <w:tcPr>
+            <w:tcW w:type="dxa" w:w="1728"/>
+          </w:tcPr>
+          <w:p>
+            <w:r>
+              <w:t>10</w:t>
+            </w:r>
+          </w:p>
+        </w:tc>
+        <w:tc>
+          <w:tcPr>
+            <w:tcW w:type="dxa" w:w="1728"/>
+          </w:tcPr>
+          <w:p>
+            <w:r>
+              <w:t>24.1*</w:t>
+            </w:r>
+          </w:p>
+        </w:tc>
+        <w:tc>
+          <w:tcPr>
+            <w:tcW w:type="dxa" w:w="1728"/>
+          </w:tcPr>
+          <w:p>
+            <w:r>
+              <w:t>23.7</w:t>
+            </w:r>
+          </w:p>
+        </w:tc>
+        <w:tc>
+          <w:tcPr>
+            <w:tcW w:type="dxa" w:w="1728"/>
+          </w:tcPr>
+          <w:p>
+            <w:r>
+              <w:t>24.4</w:t>
+            </w:r>
+          </w:p>
+        </w:tc>
+        <w:tc>
+          <w:tcPr>
+            <w:tcW w:type="dxa" w:w="1728"/>
+          </w:tcPr>
+          <w:p>
+            <w:r>
+              <w:t>25.1</w:t>
+            </w:r>
+          </w:p>
+        </w:tc>
+      </w:tr>
+      <w:tr>
+        <w:tc>
+          <w:tcPr>
+            <w:tcW w:type="dxa" w:w="1728"/>
+          </w:tcPr>
+          <w:p>
+            <w:r>
+              <w:t>12</w:t>
+            </w:r>
+          </w:p>
+        </w:tc>
+        <w:tc>
+          <w:tcPr>
+            <w:tcW w:type="dxa" w:w="1728"/>
+          </w:tcPr>
+          <w:p>
+            <w:r>
+              <w:t>20.6</w:t>
+            </w:r>
+          </w:p>
+        </w:tc>
+        <w:tc>
+          <w:tcPr>
+            <w:tcW w:type="dxa" w:w="1728"/>
+          </w:tcPr>
+          <w:p>
+            <w:r>
+              <w:t>20.2</w:t>
+            </w:r>
+          </w:p>
+        </w:tc>
+        <w:tc>
+          <w:tcPr>
+            <w:tcW w:type="dxa" w:w="1728"/>
+          </w:tcPr>
+          <w:p>
+            <w:r>
+              <w:t>20.9</w:t>
+            </w:r>
+          </w:p>
+        </w:tc>
+        <w:tc>
+          <w:tcPr>
+            <w:tcW w:type="dxa" w:w="1728"/>
+          </w:tcPr>
+          <w:p>
+            <w:r>
+              <w:t>21.8</w:t>
+            </w:r>
+          </w:p>
+        </w:tc>
+      </w:tr>
+      <w:tr>
+        <w:tc>
+          <w:tcPr>
+            <w:tcW w:type="dxa" w:w="1728"/>
+          </w:tcPr>
+          <w:p>
+            <w:r>
+              <w:t>14</w:t>
+            </w:r>
+          </w:p>
+        </w:tc>
+        <w:tc>
+          <w:tcPr>
+            <w:tcW w:type="dxa" w:w="1728"/>
+          </w:tcPr>
+          <w:p>
+            <w:r>
+              <w:t>17.7</w:t>
+            </w:r>
+          </w:p>
+        </w:tc>
+        <w:tc>
+          <w:tcPr>
+            <w:tcW w:type="dxa" w:w="1728"/>
+          </w:tcPr>
+          <w:p>
+            <w:r>
+              <w:t>15.0</w:t>
+            </w:r>
+          </w:p>
+        </w:tc>
+        <w:tc>
+          <w:tcPr>
+            <w:tcW w:type="dxa" w:w="1728"/>
+          </w:tcPr>
+          <w:p>
+            <w:r>
+              <w:t>18.2</w:t>
+            </w:r>
+          </w:p>
+        </w:tc>
+        <w:tc>
+          <w:tcPr>
+            <w:tcW w:type="dxa" w:w="1728"/>
+          </w:tcPr>
+          <w:p>
+            <w:r>
+              <w:t>19.3</w:t>
+            </w:r>
+          </w:p>
+        </w:tc>
+      </w:tr>
+    </w:tbl>
+    <w:p/>
+    <w:p>
+      <w:pPr>
+        <w:pStyle w:val="ListBullet"/>
+        <w:bidi/>
+      </w:pPr>
+      <w:r>
+        <w:rPr>
+          <w:rtl/>
+        </w:rPr>
+        <w:t>(*) بدون صورة Retina: نتائجها عند np=4 و6 و8 و10 مشبوهة (Equal بطيء بـ21% و18% عند np=4 و6 حيث لا فرق متوقع)، وإعادة قياسها معلّقة.</w:t>
+      </w:r>
+    </w:p>
+    <w:p>
+      <w:pPr>
+        <w:pStyle w:val="ListBullet"/>
+        <w:bidi/>
+      </w:pPr>
+      <w:r>
+        <w:rPr>
+          <w:rtl/>
+        </w:rPr>
+        <w:t>np ≤ 6: لا فرق بين الاستراتيجيتين (±1.3%)، وهذا متوقع لأن كل الرتب على نوى P المتساوية. هذا يبرر استعمال Equal افتراضياً حتى np=4 ويُنهي النتيجة الشاذة السابقة عند np=6.</w:t>
+      </w:r>
+    </w:p>
+    <w:p>
+      <w:pPr>
+        <w:pStyle w:val="ListBullet"/>
+        <w:bidi/>
+      </w:pPr>
+      <w:r>
+        <w:rPr>
+          <w:rtl/>
+        </w:rPr>
+        <w:t>np ≥ 8: Adaptive أسرع في 12 من 12 صورة، بكسب 28.5% عند np=8 ينخفض إلى 17.7% عند np=14، والتباين بين الصور صغير جداً.</w:t>
+      </w:r>
+    </w:p>
+    <w:p>
+      <w:pPr>
+        <w:pStyle w:val="ListBullet"/>
+        <w:bidi/>
+      </w:pPr>
+      <w:r>
+        <w:rPr>
+          <w:rtl/>
+        </w:rPr>
+        <w:t>النموذج: كسب Adaptive = 1 − np·r/(6 + (np−6)·r) مع r = سرعة E/سرعة P = 0.642 (من المعايرة) يتنبأ بالقيم المقاسة بفرق نحو 1 نقطة (النموذج أعلى قليلاً لأنه يهمل الكلفة الثابتة). أي أن الكسب يُفسَّر بنسبة السرعات وحدها دون معاملات مضبوطة على النتائج.</w:t>
+      </w:r>
+    </w:p>
     <w:sectPr>
       <w:pgSz w:w="12240" w:h="15840"/>
       <w:pgMar w:top="1440" w:right="1800" w:bottom="1440" w:left="1800" w:header="720" w:footer="720" w:gutter="0"/>

</xml_diff>

<commit_message>
Replace Retina Equal/Adaptive rows with rerun; finalize summary
Co-Authored-By: Claude Sonnet 5.5 <noreply@anthropic.com>
Claude-Session: https://claude.ai/code/session_01T6gEewJ8YaCdmnsfS34RJd
</commit_message>
<xml_diff>
--- a/results/NOTES_FINAL.docx
+++ b/results/NOTES_FINAL.docx
@@ -7755,16 +7755,17 @@
         <w:tblLook w:firstColumn="1" w:firstRow="1" w:lastColumn="0" w:lastRow="0" w:noHBand="0" w:noVBand="1" w:val="04A0"/>
       </w:tblPr>
       <w:tblGrid>
-        <w:gridCol w:w="1728"/>
-        <w:gridCol w:w="1728"/>
-        <w:gridCol w:w="1728"/>
-        <w:gridCol w:w="1728"/>
-        <w:gridCol w:w="1728"/>
+        <w:gridCol w:w="1440"/>
+        <w:gridCol w:w="1440"/>
+        <w:gridCol w:w="1440"/>
+        <w:gridCol w:w="1440"/>
+        <w:gridCol w:w="1440"/>
+        <w:gridCol w:w="1440"/>
       </w:tblGrid>
       <w:tr>
         <w:tc>
           <w:tcPr>
-            <w:tcW w:type="dxa" w:w="1728"/>
+            <w:tcW w:type="dxa" w:w="1440"/>
           </w:tcPr>
           <w:p>
             <w:r>
@@ -7774,7 +7775,7 @@
         </w:tc>
         <w:tc>
           <w:tcPr>
-            <w:tcW w:type="dxa" w:w="1728"/>
+            <w:tcW w:type="dxa" w:w="1440"/>
           </w:tcPr>
           <w:p>
             <w:r>
@@ -7784,7 +7785,7 @@
         </w:tc>
         <w:tc>
           <w:tcPr>
-            <w:tcW w:type="dxa" w:w="1728"/>
+            <w:tcW w:type="dxa" w:w="1440"/>
           </w:tcPr>
           <w:p>
             <w:r>
@@ -7794,7 +7795,7 @@
         </w:tc>
         <w:tc>
           <w:tcPr>
-            <w:tcW w:type="dxa" w:w="1728"/>
+            <w:tcW w:type="dxa" w:w="1440"/>
           </w:tcPr>
           <w:p>
             <w:r>
@@ -7804,7 +7805,17 @@
         </w:tc>
         <w:tc>
           <w:tcPr>
-            <w:tcW w:type="dxa" w:w="1728"/>
+            <w:tcW w:type="dxa" w:w="1440"/>
+          </w:tcPr>
+          <w:p>
+            <w:r>
+              <w:t>صور يفوز فيها Adaptive</w:t>
+            </w:r>
+          </w:p>
+        </w:tc>
+        <w:tc>
+          <w:tcPr>
+            <w:tcW w:type="dxa" w:w="1440"/>
           </w:tcPr>
           <w:p>
             <w:r>
@@ -7816,7 +7827,7 @@
       <w:tr>
         <w:tc>
           <w:tcPr>
-            <w:tcW w:type="dxa" w:w="1728"/>
+            <w:tcW w:type="dxa" w:w="1440"/>
           </w:tcPr>
           <w:p>
             <w:r>
@@ -7826,17 +7837,17 @@
         </w:tc>
         <w:tc>
           <w:tcPr>
-            <w:tcW w:type="dxa" w:w="1728"/>
-          </w:tcPr>
-          <w:p>
-            <w:r>
-              <w:t>-0.1</w:t>
-            </w:r>
-          </w:p>
-        </w:tc>
-        <w:tc>
-          <w:tcPr>
-            <w:tcW w:type="dxa" w:w="1728"/>
+            <w:tcW w:type="dxa" w:w="1440"/>
+          </w:tcPr>
+          <w:p>
+            <w:r>
+              <w:t>-0.2</w:t>
+            </w:r>
+          </w:p>
+        </w:tc>
+        <w:tc>
+          <w:tcPr>
+            <w:tcW w:type="dxa" w:w="1440"/>
           </w:tcPr>
           <w:p>
             <w:r>
@@ -7846,7 +7857,7 @@
         </w:tc>
         <w:tc>
           <w:tcPr>
-            <w:tcW w:type="dxa" w:w="1728"/>
+            <w:tcW w:type="dxa" w:w="1440"/>
           </w:tcPr>
           <w:p>
             <w:r>
@@ -7856,7 +7867,17 @@
         </w:tc>
         <w:tc>
           <w:tcPr>
-            <w:tcW w:type="dxa" w:w="1728"/>
+            <w:tcW w:type="dxa" w:w="1440"/>
+          </w:tcPr>
+          <w:p>
+            <w:r>
+              <w:t>0 من 12</w:t>
+            </w:r>
+          </w:p>
+        </w:tc>
+        <w:tc>
+          <w:tcPr>
+            <w:tcW w:type="dxa" w:w="1440"/>
           </w:tcPr>
           <w:p>
             <w:r>
@@ -7868,7 +7889,7 @@
       <w:tr>
         <w:tc>
           <w:tcPr>
-            <w:tcW w:type="dxa" w:w="1728"/>
+            <w:tcW w:type="dxa" w:w="1440"/>
           </w:tcPr>
           <w:p>
             <w:r>
@@ -7878,17 +7899,17 @@
         </w:tc>
         <w:tc>
           <w:tcPr>
-            <w:tcW w:type="dxa" w:w="1728"/>
-          </w:tcPr>
-          <w:p>
-            <w:r>
-              <w:t>-0.2*</w:t>
-            </w:r>
-          </w:p>
-        </w:tc>
-        <w:tc>
-          <w:tcPr>
-            <w:tcW w:type="dxa" w:w="1728"/>
+            <w:tcW w:type="dxa" w:w="1440"/>
+          </w:tcPr>
+          <w:p>
+            <w:r>
+              <w:t>-0.2</w:t>
+            </w:r>
+          </w:p>
+        </w:tc>
+        <w:tc>
+          <w:tcPr>
+            <w:tcW w:type="dxa" w:w="1440"/>
           </w:tcPr>
           <w:p>
             <w:r>
@@ -7898,7 +7919,7 @@
         </w:tc>
         <w:tc>
           <w:tcPr>
-            <w:tcW w:type="dxa" w:w="1728"/>
+            <w:tcW w:type="dxa" w:w="1440"/>
           </w:tcPr>
           <w:p>
             <w:r>
@@ -7908,7 +7929,17 @@
         </w:tc>
         <w:tc>
           <w:tcPr>
-            <w:tcW w:type="dxa" w:w="1728"/>
+            <w:tcW w:type="dxa" w:w="1440"/>
+          </w:tcPr>
+          <w:p>
+            <w:r>
+              <w:t>0 من 12</w:t>
+            </w:r>
+          </w:p>
+        </w:tc>
+        <w:tc>
+          <w:tcPr>
+            <w:tcW w:type="dxa" w:w="1440"/>
           </w:tcPr>
           <w:p>
             <w:r>
@@ -7920,7 +7951,7 @@
       <w:tr>
         <w:tc>
           <w:tcPr>
-            <w:tcW w:type="dxa" w:w="1728"/>
+            <w:tcW w:type="dxa" w:w="1440"/>
           </w:tcPr>
           <w:p>
             <w:r>
@@ -7930,17 +7961,17 @@
         </w:tc>
         <w:tc>
           <w:tcPr>
-            <w:tcW w:type="dxa" w:w="1728"/>
-          </w:tcPr>
-          <w:p>
-            <w:r>
-              <w:t>-0.3*</w:t>
-            </w:r>
-          </w:p>
-        </w:tc>
-        <w:tc>
-          <w:tcPr>
-            <w:tcW w:type="dxa" w:w="1728"/>
+            <w:tcW w:type="dxa" w:w="1440"/>
+          </w:tcPr>
+          <w:p>
+            <w:r>
+              <w:t>-0.3</w:t>
+            </w:r>
+          </w:p>
+        </w:tc>
+        <w:tc>
+          <w:tcPr>
+            <w:tcW w:type="dxa" w:w="1440"/>
           </w:tcPr>
           <w:p>
             <w:r>
@@ -7950,7 +7981,7 @@
         </w:tc>
         <w:tc>
           <w:tcPr>
-            <w:tcW w:type="dxa" w:w="1728"/>
+            <w:tcW w:type="dxa" w:w="1440"/>
           </w:tcPr>
           <w:p>
             <w:r>
@@ -7960,7 +7991,17 @@
         </w:tc>
         <w:tc>
           <w:tcPr>
-            <w:tcW w:type="dxa" w:w="1728"/>
+            <w:tcW w:type="dxa" w:w="1440"/>
+          </w:tcPr>
+          <w:p>
+            <w:r>
+              <w:t>0 من 12</w:t>
+            </w:r>
+          </w:p>
+        </w:tc>
+        <w:tc>
+          <w:tcPr>
+            <w:tcW w:type="dxa" w:w="1440"/>
           </w:tcPr>
           <w:p>
             <w:r>
@@ -7972,7 +8013,7 @@
       <w:tr>
         <w:tc>
           <w:tcPr>
-            <w:tcW w:type="dxa" w:w="1728"/>
+            <w:tcW w:type="dxa" w:w="1440"/>
           </w:tcPr>
           <w:p>
             <w:r>
@@ -7982,17 +8023,17 @@
         </w:tc>
         <w:tc>
           <w:tcPr>
-            <w:tcW w:type="dxa" w:w="1728"/>
-          </w:tcPr>
-          <w:p>
-            <w:r>
-              <w:t>28.5*</w:t>
-            </w:r>
-          </w:p>
-        </w:tc>
-        <w:tc>
-          <w:tcPr>
-            <w:tcW w:type="dxa" w:w="1728"/>
+            <w:tcW w:type="dxa" w:w="1440"/>
+          </w:tcPr>
+          <w:p>
+            <w:r>
+              <w:t>28.5</w:t>
+            </w:r>
+          </w:p>
+        </w:tc>
+        <w:tc>
+          <w:tcPr>
+            <w:tcW w:type="dxa" w:w="1440"/>
           </w:tcPr>
           <w:p>
             <w:r>
@@ -8002,7 +8043,7 @@
         </w:tc>
         <w:tc>
           <w:tcPr>
-            <w:tcW w:type="dxa" w:w="1728"/>
+            <w:tcW w:type="dxa" w:w="1440"/>
           </w:tcPr>
           <w:p>
             <w:r>
@@ -8012,7 +8053,17 @@
         </w:tc>
         <w:tc>
           <w:tcPr>
-            <w:tcW w:type="dxa" w:w="1728"/>
+            <w:tcW w:type="dxa" w:w="1440"/>
+          </w:tcPr>
+          <w:p>
+            <w:r>
+              <w:t>12 من 12</w:t>
+            </w:r>
+          </w:p>
+        </w:tc>
+        <w:tc>
+          <w:tcPr>
+            <w:tcW w:type="dxa" w:w="1440"/>
           </w:tcPr>
           <w:p>
             <w:r>
@@ -8024,7 +8075,7 @@
       <w:tr>
         <w:tc>
           <w:tcPr>
-            <w:tcW w:type="dxa" w:w="1728"/>
+            <w:tcW w:type="dxa" w:w="1440"/>
           </w:tcPr>
           <w:p>
             <w:r>
@@ -8034,17 +8085,17 @@
         </w:tc>
         <w:tc>
           <w:tcPr>
-            <w:tcW w:type="dxa" w:w="1728"/>
-          </w:tcPr>
-          <w:p>
-            <w:r>
-              <w:t>24.1*</w:t>
-            </w:r>
-          </w:p>
-        </w:tc>
-        <w:tc>
-          <w:tcPr>
-            <w:tcW w:type="dxa" w:w="1728"/>
+            <w:tcW w:type="dxa" w:w="1440"/>
+          </w:tcPr>
+          <w:p>
+            <w:r>
+              <w:t>24.1</w:t>
+            </w:r>
+          </w:p>
+        </w:tc>
+        <w:tc>
+          <w:tcPr>
+            <w:tcW w:type="dxa" w:w="1440"/>
           </w:tcPr>
           <w:p>
             <w:r>
@@ -8054,7 +8105,7 @@
         </w:tc>
         <w:tc>
           <w:tcPr>
-            <w:tcW w:type="dxa" w:w="1728"/>
+            <w:tcW w:type="dxa" w:w="1440"/>
           </w:tcPr>
           <w:p>
             <w:r>
@@ -8064,7 +8115,17 @@
         </w:tc>
         <w:tc>
           <w:tcPr>
-            <w:tcW w:type="dxa" w:w="1728"/>
+            <w:tcW w:type="dxa" w:w="1440"/>
+          </w:tcPr>
+          <w:p>
+            <w:r>
+              <w:t>12 من 12</w:t>
+            </w:r>
+          </w:p>
+        </w:tc>
+        <w:tc>
+          <w:tcPr>
+            <w:tcW w:type="dxa" w:w="1440"/>
           </w:tcPr>
           <w:p>
             <w:r>
@@ -8076,7 +8137,7 @@
       <w:tr>
         <w:tc>
           <w:tcPr>
-            <w:tcW w:type="dxa" w:w="1728"/>
+            <w:tcW w:type="dxa" w:w="1440"/>
           </w:tcPr>
           <w:p>
             <w:r>
@@ -8086,7 +8147,7 @@
         </w:tc>
         <w:tc>
           <w:tcPr>
-            <w:tcW w:type="dxa" w:w="1728"/>
+            <w:tcW w:type="dxa" w:w="1440"/>
           </w:tcPr>
           <w:p>
             <w:r>
@@ -8096,7 +8157,7 @@
         </w:tc>
         <w:tc>
           <w:tcPr>
-            <w:tcW w:type="dxa" w:w="1728"/>
+            <w:tcW w:type="dxa" w:w="1440"/>
           </w:tcPr>
           <w:p>
             <w:r>
@@ -8106,7 +8167,7 @@
         </w:tc>
         <w:tc>
           <w:tcPr>
-            <w:tcW w:type="dxa" w:w="1728"/>
+            <w:tcW w:type="dxa" w:w="1440"/>
           </w:tcPr>
           <w:p>
             <w:r>
@@ -8116,7 +8177,17 @@
         </w:tc>
         <w:tc>
           <w:tcPr>
-            <w:tcW w:type="dxa" w:w="1728"/>
+            <w:tcW w:type="dxa" w:w="1440"/>
+          </w:tcPr>
+          <w:p>
+            <w:r>
+              <w:t>12 من 12</w:t>
+            </w:r>
+          </w:p>
+        </w:tc>
+        <w:tc>
+          <w:tcPr>
+            <w:tcW w:type="dxa" w:w="1440"/>
           </w:tcPr>
           <w:p>
             <w:r>
@@ -8128,7 +8199,7 @@
       <w:tr>
         <w:tc>
           <w:tcPr>
-            <w:tcW w:type="dxa" w:w="1728"/>
+            <w:tcW w:type="dxa" w:w="1440"/>
           </w:tcPr>
           <w:p>
             <w:r>
@@ -8138,7 +8209,7 @@
         </w:tc>
         <w:tc>
           <w:tcPr>
-            <w:tcW w:type="dxa" w:w="1728"/>
+            <w:tcW w:type="dxa" w:w="1440"/>
           </w:tcPr>
           <w:p>
             <w:r>
@@ -8148,7 +8219,7 @@
         </w:tc>
         <w:tc>
           <w:tcPr>
-            <w:tcW w:type="dxa" w:w="1728"/>
+            <w:tcW w:type="dxa" w:w="1440"/>
           </w:tcPr>
           <w:p>
             <w:r>
@@ -8158,7 +8229,7 @@
         </w:tc>
         <w:tc>
           <w:tcPr>
-            <w:tcW w:type="dxa" w:w="1728"/>
+            <w:tcW w:type="dxa" w:w="1440"/>
           </w:tcPr>
           <w:p>
             <w:r>
@@ -8168,7 +8239,17 @@
         </w:tc>
         <w:tc>
           <w:tcPr>
-            <w:tcW w:type="dxa" w:w="1728"/>
+            <w:tcW w:type="dxa" w:w="1440"/>
+          </w:tcPr>
+          <w:p>
+            <w:r>
+              <w:t>12 من 12</w:t>
+            </w:r>
+          </w:p>
+        </w:tc>
+        <w:tc>
+          <w:tcPr>
+            <w:tcW w:type="dxa" w:w="1440"/>
           </w:tcPr>
           <w:p>
             <w:r>
@@ -8188,7 +8269,7 @@
         <w:rPr>
           <w:rtl/>
         </w:rPr>
-        <w:t>(*) بدون صورة Retina: نتائجها عند np=4 و6 و8 و10 مشبوهة (Equal بطيء بـ21% و18% عند np=4 و6 حيث لا فرق متوقع)، وإعادة قياسها معلّقة.</w:t>
+        <w:t>np ≤ 6: لا فرق بين الاستراتيجيتين (حدود ±1.3%)، متوقع لأن كل الرتب على نوى P المتساوية. هذا يبرر Equal افتراضياً حتى np=4، ويُنهي النتيجة الشاذة السابقة عند np=6.</w:t>
       </w:r>
     </w:p>
     <w:p>
@@ -8200,7 +8281,7 @@
         <w:rPr>
           <w:rtl/>
         </w:rPr>
-        <w:t>np ≤ 6: لا فرق بين الاستراتيجيتين (±1.3%)، وهذا متوقع لأن كل الرتب على نوى P المتساوية. هذا يبرر استعمال Equal افتراضياً حتى np=4 ويُنهي النتيجة الشاذة السابقة عند np=6.</w:t>
+        <w:t>np ≥ 8: Adaptive أسرع في 12 من 12 صورة، بكسب 28.3% عند np=8 ينخفض إلى 17.7% عند np=14. التباين بين الصور صغير (±0.3 نقطة عند np=8 و12).</w:t>
       </w:r>
     </w:p>
     <w:p>
@@ -8212,7 +8293,7 @@
         <w:rPr>
           <w:rtl/>
         </w:rPr>
-        <w:t>np ≥ 8: Adaptive أسرع في 12 من 12 صورة، بكسب 28.5% عند np=8 ينخفض إلى 17.7% عند np=14، والتباين بين الصور صغير جداً.</w:t>
+        <w:t>النموذج: كسب Adaptive = 1 − np·r/(6 + (np−6)·r) مع r = سرعة E/سرعة P = 0.642 من المعايرة، يتنبأ بالمقاس بفرق نحو 1 إلى 1.6 نقطة، والنموذج أعلى لأنه يهمل الكلفة الثابتة. التفسير بنسبة السرعات وحدها بلا معاملات مضبوطة على النتائج.</w:t>
       </w:r>
     </w:p>
     <w:p>
@@ -8224,7 +8305,19 @@
         <w:rPr>
           <w:rtl/>
         </w:rPr>
-        <w:t>النموذج: كسب Adaptive = 1 − np·r/(6 + (np−6)·r) مع r = سرعة E/سرعة P = 0.642 (من المعايرة) يتنبأ بالقيم المقاسة بفرق نحو 1 نقطة (النموذج أعلى قليلاً لأنه يهمل الكلفة الثابتة). أي أن الكسب يُفسَّر بنسبة السرعات وحدها دون معاملات مضبوطة على النتائج.</w:t>
+        <w:t>صورة Retina أُعيد قياسها بعد أن ظهرت قيم مشبوهة بالتشغيلة الأولى (تدخل خارجي بالجهاز على الأرجح)؛ الجدول يستعمل الإعادة.</w:t>
+      </w:r>
+    </w:p>
+    <w:p>
+      <w:pPr>
+        <w:pStyle w:val="ListBullet"/>
+        <w:bidi/>
+      </w:pPr>
+      <w:r>
+        <w:rPr>
+          <w:rtl/>
+        </w:rPr>
+        <w:t>ملف الأزمنة الخام eq_ad_raw.csv محفوظ عند الباحثة ويُرفق كدليل.</w:t>
       </w:r>
     </w:p>
     <w:sectPr>

</xml_diff>

<commit_message>
Add pending-items list to notes
Co-Authored-By: Claude Sonnet 5.5 <noreply@anthropic.com>
Claude-Session: https://claude.ai/code/session_01T6gEewJ8YaCdmnsfS34RJd
</commit_message>
<xml_diff>
--- a/results/NOTES_FINAL.docx
+++ b/results/NOTES_FINAL.docx
@@ -8318,6 +8318,150 @@
           <w:rtl/>
         </w:rPr>
         <w:t>ملف الأزمنة الخام eq_ad_raw.csv محفوظ عند الباحثة ويُرفق كدليل.</w:t>
+      </w:r>
+    </w:p>
+    <w:p>
+      <w:pPr>
+        <w:pStyle w:val="Heading1"/>
+        <w:bidi/>
+      </w:pPr>
+      <w:r>
+        <w:rPr>
+          <w:rtl/>
+        </w:rPr>
+        <w:t>12. بنود معلّقة (لا تُنسى)</w:t>
+      </w:r>
+    </w:p>
+    <w:p>
+      <w:pPr>
+        <w:pStyle w:val="ListBullet"/>
+        <w:bidi/>
+      </w:pPr>
+      <w:r>
+        <w:rPr>
+          <w:rtl/>
+        </w:rPr>
+        <w:t>Throughput: نعرّفه N×I/T_LBG (متجه/ثانية) ونرسمه من الـ xlsx بلا تشغيل جديد؛ علماً أن نسبته المتوازي/المتسلسل = التسارع، فهو عرض آخر لنفس المعلومة.</w:t>
+      </w:r>
+    </w:p>
+    <w:p>
+      <w:pPr>
+        <w:pStyle w:val="ListBullet"/>
+        <w:bidi/>
+      </w:pPr>
+      <w:r>
+        <w:rPr>
+          <w:rtl/>
+        </w:rPr>
+        <w:t>Entropy: يحتاج اسم الملف الأولي الذي يحسبه. يُقبل فقط إذا ولّدته النسخة النهائية على الصور النهائية، ويُقاس فعلاً (مؤشرات VQ أو تيار الدلتا). يسمح بتفسير اختلاف CR بين الصور.</w:t>
+      </w:r>
+    </w:p>
+    <w:p>
+      <w:pPr>
+        <w:pStyle w:val="ListBullet"/>
+        <w:bidi/>
+      </w:pPr>
+      <w:r>
+        <w:rPr>
+          <w:rtl/>
+        </w:rPr>
+        <w:t>جدول الورقة الأولى لسبب اختيار عدد الكودبوك (K=64) وحجم البلوك (4×4) وطول المتجه (16): يُرسَل لنكتب تبريره؛ وإن كانت أرقامه من نسخة أقدم نعيد توليده أو نذكر مصدره صراحة.</w:t>
+      </w:r>
+    </w:p>
+    <w:p>
+      <w:pPr>
+        <w:pStyle w:val="ListBullet"/>
+        <w:bidi/>
+      </w:pPr>
+      <w:r>
+        <w:rPr>
+          <w:rtl/>
+        </w:rPr>
+        <w:t>حملة Equal/Adaptive بالزمن الكلي (run_eq_ad_total.sh): اختيارية، تُشغَّل بعد الكتابة، وإن شُغّلت تُعتمد جداولها الجديدة بدل 4.12 و4.13 كاملةً.</w:t>
+      </w:r>
+    </w:p>
+    <w:p>
+      <w:pPr>
+        <w:pStyle w:val="ListBullet"/>
+        <w:bidi/>
+      </w:pPr>
+      <w:r>
+        <w:rPr>
+          <w:rtl/>
+        </w:rPr>
+        <w:t>القسم 4.8 (تطابق المتسلسل والمتوازي بكل الصور) ثم خلاصة الفصل الرابع.</w:t>
+      </w:r>
+    </w:p>
+    <w:p>
+      <w:pPr>
+        <w:pStyle w:val="ListBullet"/>
+        <w:bidi/>
+      </w:pPr>
+      <w:r>
+        <w:rPr>
+          <w:rtl/>
+        </w:rPr>
+        <w:t>حسم اسم الصورتين الملونتين (MRI أم PET) وتوحيده بالفصلين الثالث والرابع وورقة الـ xlsx.</w:t>
+      </w:r>
+    </w:p>
+    <w:p>
+      <w:pPr>
+        <w:pStyle w:val="ListBullet"/>
+        <w:bidi/>
+      </w:pPr>
+      <w:r>
+        <w:rPr>
+          <w:rtl/>
+        </w:rPr>
+        <w:t>تعديلات الفصل الثالث: معاملات الفلتر النهائية، شرط التقارب ≤، حذف جملة التوقيت القديمة بـ 3.5.1، تسمية الصور الملونة، تعريفات القياس بـ 3.5.3، double precision، إصلاح Dprev بالخوارزمية 3.1.</w:t>
+      </w:r>
+    </w:p>
+    <w:p>
+      <w:pPr>
+        <w:pStyle w:val="ListBullet"/>
+        <w:bidi/>
+      </w:pPr>
+      <w:r>
+        <w:rPr>
+          <w:rtl/>
+        </w:rPr>
+        <w:t>تعديل إحالة 4.5 من "Section 4.9" إلى "Section 4.7".</w:t>
+      </w:r>
+    </w:p>
+    <w:p>
+      <w:pPr>
+        <w:pStyle w:val="ListBullet"/>
+        <w:bidi/>
+      </w:pPr>
+      <w:r>
+        <w:rPr>
+          <w:rtl/>
+        </w:rPr>
+        <w:t>حملة ثانية بيوم آخر لتقرير المدى بين الجلسات (اختيارية).</w:t>
+      </w:r>
+    </w:p>
+    <w:p>
+      <w:pPr>
+        <w:pStyle w:val="ListBullet"/>
+        <w:bidi/>
+      </w:pPr>
+      <w:r>
+        <w:rPr>
+          <w:rtl/>
+        </w:rPr>
+        <w:t>حفظ ملفات الأزمنة الخام: eq_ad_raw.csv وeq_ad_retina_raw.csv وملفات حملة التوقيت.</w:t>
+      </w:r>
+    </w:p>
+    <w:p>
+      <w:pPr>
+        <w:pStyle w:val="ListBullet"/>
+        <w:bidi/>
+      </w:pPr>
+      <w:r>
+        <w:rPr>
+          <w:rtl/>
+        </w:rPr>
+        <w:t>التحقق المتقاطع للفلتر (leave-one-out) أو ذكر القيد بالحدود.</w:t>
       </w:r>
     </w:p>
     <w:sectPr>

</xml_diff>

<commit_message>
Update notes with unified Equal/Adaptive results; add entropy script
Co-Authored-By: Claude Sonnet 5.5 <noreply@anthropic.com>
Claude-Session: https://claude.ai/code/session_01T6gEewJ8YaCdmnsfS34RJd
</commit_message>
<xml_diff>
--- a/results/NOTES_FINAL.docx
+++ b/results/NOTES_FINAL.docx
@@ -7748,6 +7748,17 @@
         <w:t>11. Equal مقابل Adaptive (pam_v4، تشغيل إجباري بالتناوب، وسيط 5، 12 صورة)</w:t>
       </w:r>
     </w:p>
+    <w:p>
+      <w:pPr>
+        <w:bidi/>
+      </w:pPr>
+      <w:r>
+        <w:rPr>
+          <w:rtl/>
+        </w:rPr>
+        <w:t>الحملة الموحدة (pam_v4، تشغيل إجباري بالتناوب، وسيط 5، LBG والزمن الكلي من نفس التشغيلات). نُقل هذا القسم ليحل محل نتائج الجلسة الأولى (LBG فقط، ورقة EqAd session1).</w:t>
+      </w:r>
+    </w:p>
     <w:tbl>
       <w:tblPr>
         <w:tblStyle w:val="TableGrid"/>
@@ -7755,17 +7766,19 @@
         <w:tblLook w:firstColumn="1" w:firstRow="1" w:lastColumn="0" w:lastRow="0" w:noHBand="0" w:noVBand="1" w:val="04A0"/>
       </w:tblPr>
       <w:tblGrid>
-        <w:gridCol w:w="1440"/>
-        <w:gridCol w:w="1440"/>
-        <w:gridCol w:w="1440"/>
-        <w:gridCol w:w="1440"/>
-        <w:gridCol w:w="1440"/>
-        <w:gridCol w:w="1440"/>
+        <w:gridCol w:w="1080"/>
+        <w:gridCol w:w="1080"/>
+        <w:gridCol w:w="1080"/>
+        <w:gridCol w:w="1080"/>
+        <w:gridCol w:w="1080"/>
+        <w:gridCol w:w="1080"/>
+        <w:gridCol w:w="1080"/>
+        <w:gridCol w:w="1080"/>
       </w:tblGrid>
       <w:tr>
         <w:tc>
           <w:tcPr>
-            <w:tcW w:type="dxa" w:w="1440"/>
+            <w:tcW w:type="dxa" w:w="1080"/>
           </w:tcPr>
           <w:p>
             <w:r>
@@ -7775,17 +7788,17 @@
         </w:tc>
         <w:tc>
           <w:tcPr>
-            <w:tcW w:type="dxa" w:w="1440"/>
-          </w:tcPr>
-          <w:p>
-            <w:r>
-              <w:t>متوسط كسب Adaptive %</w:t>
-            </w:r>
-          </w:p>
-        </w:tc>
-        <w:tc>
-          <w:tcPr>
-            <w:tcW w:type="dxa" w:w="1440"/>
+            <w:tcW w:type="dxa" w:w="1080"/>
+          </w:tcPr>
+          <w:p>
+            <w:r>
+              <w:t>كسب LBG %</w:t>
+            </w:r>
+          </w:p>
+        </w:tc>
+        <w:tc>
+          <w:tcPr>
+            <w:tcW w:type="dxa" w:w="1080"/>
           </w:tcPr>
           <w:p>
             <w:r>
@@ -7795,7 +7808,7 @@
         </w:tc>
         <w:tc>
           <w:tcPr>
-            <w:tcW w:type="dxa" w:w="1440"/>
+            <w:tcW w:type="dxa" w:w="1080"/>
           </w:tcPr>
           <w:p>
             <w:r>
@@ -7805,21 +7818,41 @@
         </w:tc>
         <w:tc>
           <w:tcPr>
-            <w:tcW w:type="dxa" w:w="1440"/>
-          </w:tcPr>
-          <w:p>
-            <w:r>
-              <w:t>صور يفوز فيها Adaptive</w:t>
-            </w:r>
-          </w:p>
-        </w:tc>
-        <w:tc>
-          <w:tcPr>
-            <w:tcW w:type="dxa" w:w="1440"/>
-          </w:tcPr>
-          <w:p>
-            <w:r>
-              <w:t>النموذج %</w:t>
+            <w:tcW w:type="dxa" w:w="1080"/>
+          </w:tcPr>
+          <w:p>
+            <w:r>
+              <w:t>كسب Total %</w:t>
+            </w:r>
+          </w:p>
+        </w:tc>
+        <w:tc>
+          <w:tcPr>
+            <w:tcW w:type="dxa" w:w="1080"/>
+          </w:tcPr>
+          <w:p>
+            <w:r>
+              <w:t>أدنى</w:t>
+            </w:r>
+          </w:p>
+        </w:tc>
+        <w:tc>
+          <w:tcPr>
+            <w:tcW w:type="dxa" w:w="1080"/>
+          </w:tcPr>
+          <w:p>
+            <w:r>
+              <w:t>أعلى</w:t>
+            </w:r>
+          </w:p>
+        </w:tc>
+        <w:tc>
+          <w:tcPr>
+            <w:tcW w:type="dxa" w:w="1080"/>
+          </w:tcPr>
+          <w:p>
+            <w:r>
+              <w:t>صور بكسب Total&gt;1%</w:t>
             </w:r>
           </w:p>
         </w:tc>
@@ -7827,7 +7860,7 @@
       <w:tr>
         <w:tc>
           <w:tcPr>
-            <w:tcW w:type="dxa" w:w="1440"/>
+            <w:tcW w:type="dxa" w:w="1080"/>
           </w:tcPr>
           <w:p>
             <w:r>
@@ -7837,7 +7870,7 @@
         </w:tc>
         <w:tc>
           <w:tcPr>
-            <w:tcW w:type="dxa" w:w="1440"/>
+            <w:tcW w:type="dxa" w:w="1080"/>
           </w:tcPr>
           <w:p>
             <w:r>
@@ -7847,41 +7880,61 @@
         </w:tc>
         <w:tc>
           <w:tcPr>
-            <w:tcW w:type="dxa" w:w="1440"/>
-          </w:tcPr>
-          <w:p>
-            <w:r>
-              <w:t>-0.5</w:t>
-            </w:r>
-          </w:p>
-        </w:tc>
-        <w:tc>
-          <w:tcPr>
-            <w:tcW w:type="dxa" w:w="1440"/>
-          </w:tcPr>
-          <w:p>
-            <w:r>
-              <w:t>0.2</w:t>
-            </w:r>
-          </w:p>
-        </w:tc>
-        <w:tc>
-          <w:tcPr>
-            <w:tcW w:type="dxa" w:w="1440"/>
+            <w:tcW w:type="dxa" w:w="1080"/>
+          </w:tcPr>
+          <w:p>
+            <w:r>
+              <w:t>-0.4</w:t>
+            </w:r>
+          </w:p>
+        </w:tc>
+        <w:tc>
+          <w:tcPr>
+            <w:tcW w:type="dxa" w:w="1080"/>
+          </w:tcPr>
+          <w:p>
+            <w:r>
+              <w:t>0.1</w:t>
+            </w:r>
+          </w:p>
+        </w:tc>
+        <w:tc>
+          <w:tcPr>
+            <w:tcW w:type="dxa" w:w="1080"/>
+          </w:tcPr>
+          <w:p>
+            <w:r>
+              <w:t>-0.4</w:t>
+            </w:r>
+          </w:p>
+        </w:tc>
+        <w:tc>
+          <w:tcPr>
+            <w:tcW w:type="dxa" w:w="1080"/>
+          </w:tcPr>
+          <w:p>
+            <w:r>
+              <w:t>-1.1</w:t>
+            </w:r>
+          </w:p>
+        </w:tc>
+        <w:tc>
+          <w:tcPr>
+            <w:tcW w:type="dxa" w:w="1080"/>
+          </w:tcPr>
+          <w:p>
+            <w:r>
+              <w:t>0.0</w:t>
+            </w:r>
+          </w:p>
+        </w:tc>
+        <w:tc>
+          <w:tcPr>
+            <w:tcW w:type="dxa" w:w="1080"/>
           </w:tcPr>
           <w:p>
             <w:r>
               <w:t>0 من 12</w:t>
-            </w:r>
-          </w:p>
-        </w:tc>
-        <w:tc>
-          <w:tcPr>
-            <w:tcW w:type="dxa" w:w="1440"/>
-          </w:tcPr>
-          <w:p>
-            <w:r>
-              <w:t>0</w:t>
             </w:r>
           </w:p>
         </w:tc>
@@ -7889,7 +7942,7 @@
       <w:tr>
         <w:tc>
           <w:tcPr>
-            <w:tcW w:type="dxa" w:w="1440"/>
+            <w:tcW w:type="dxa" w:w="1080"/>
           </w:tcPr>
           <w:p>
             <w:r>
@@ -7899,7 +7952,7 @@
         </w:tc>
         <w:tc>
           <w:tcPr>
-            <w:tcW w:type="dxa" w:w="1440"/>
+            <w:tcW w:type="dxa" w:w="1080"/>
           </w:tcPr>
           <w:p>
             <w:r>
@@ -7909,7 +7962,7 @@
         </w:tc>
         <w:tc>
           <w:tcPr>
-            <w:tcW w:type="dxa" w:w="1440"/>
+            <w:tcW w:type="dxa" w:w="1080"/>
           </w:tcPr>
           <w:p>
             <w:r>
@@ -7919,31 +7972,51 @@
         </w:tc>
         <w:tc>
           <w:tcPr>
-            <w:tcW w:type="dxa" w:w="1440"/>
-          </w:tcPr>
-          <w:p>
-            <w:r>
-              <w:t>0.5</w:t>
-            </w:r>
-          </w:p>
-        </w:tc>
-        <w:tc>
-          <w:tcPr>
-            <w:tcW w:type="dxa" w:w="1440"/>
+            <w:tcW w:type="dxa" w:w="1080"/>
+          </w:tcPr>
+          <w:p>
+            <w:r>
+              <w:t>0.2</w:t>
+            </w:r>
+          </w:p>
+        </w:tc>
+        <w:tc>
+          <w:tcPr>
+            <w:tcW w:type="dxa" w:w="1080"/>
+          </w:tcPr>
+          <w:p>
+            <w:r>
+              <w:t>-0.4</w:t>
+            </w:r>
+          </w:p>
+        </w:tc>
+        <w:tc>
+          <w:tcPr>
+            <w:tcW w:type="dxa" w:w="1080"/>
+          </w:tcPr>
+          <w:p>
+            <w:r>
+              <w:t>-0.9</w:t>
+            </w:r>
+          </w:p>
+        </w:tc>
+        <w:tc>
+          <w:tcPr>
+            <w:tcW w:type="dxa" w:w="1080"/>
+          </w:tcPr>
+          <w:p>
+            <w:r>
+              <w:t>0.0</w:t>
+            </w:r>
+          </w:p>
+        </w:tc>
+        <w:tc>
+          <w:tcPr>
+            <w:tcW w:type="dxa" w:w="1080"/>
           </w:tcPr>
           <w:p>
             <w:r>
               <w:t>0 من 12</w:t>
-            </w:r>
-          </w:p>
-        </w:tc>
-        <w:tc>
-          <w:tcPr>
-            <w:tcW w:type="dxa" w:w="1440"/>
-          </w:tcPr>
-          <w:p>
-            <w:r>
-              <w:t>0</w:t>
             </w:r>
           </w:p>
         </w:tc>
@@ -7951,7 +8024,7 @@
       <w:tr>
         <w:tc>
           <w:tcPr>
-            <w:tcW w:type="dxa" w:w="1440"/>
+            <w:tcW w:type="dxa" w:w="1080"/>
           </w:tcPr>
           <w:p>
             <w:r>
@@ -7961,51 +8034,71 @@
         </w:tc>
         <w:tc>
           <w:tcPr>
-            <w:tcW w:type="dxa" w:w="1440"/>
-          </w:tcPr>
-          <w:p>
-            <w:r>
-              <w:t>-0.3</w:t>
-            </w:r>
-          </w:p>
-        </w:tc>
-        <w:tc>
-          <w:tcPr>
-            <w:tcW w:type="dxa" w:w="1440"/>
-          </w:tcPr>
-          <w:p>
-            <w:r>
-              <w:t>-1.3</w:t>
-            </w:r>
-          </w:p>
-        </w:tc>
-        <w:tc>
-          <w:tcPr>
-            <w:tcW w:type="dxa" w:w="1440"/>
-          </w:tcPr>
-          <w:p>
-            <w:r>
-              <w:t>0.1</w:t>
-            </w:r>
-          </w:p>
-        </w:tc>
-        <w:tc>
-          <w:tcPr>
-            <w:tcW w:type="dxa" w:w="1440"/>
+            <w:tcW w:type="dxa" w:w="1080"/>
+          </w:tcPr>
+          <w:p>
+            <w:r>
+              <w:t>-0.1</w:t>
+            </w:r>
+          </w:p>
+        </w:tc>
+        <w:tc>
+          <w:tcPr>
+            <w:tcW w:type="dxa" w:w="1080"/>
+          </w:tcPr>
+          <w:p>
+            <w:r>
+              <w:t>-1.1</w:t>
+            </w:r>
+          </w:p>
+        </w:tc>
+        <w:tc>
+          <w:tcPr>
+            <w:tcW w:type="dxa" w:w="1080"/>
+          </w:tcPr>
+          <w:p>
+            <w:r>
+              <w:t>1.1</w:t>
+            </w:r>
+          </w:p>
+        </w:tc>
+        <w:tc>
+          <w:tcPr>
+            <w:tcW w:type="dxa" w:w="1080"/>
+          </w:tcPr>
+          <w:p>
+            <w:r>
+              <w:t>-0.5</w:t>
+            </w:r>
+          </w:p>
+        </w:tc>
+        <w:tc>
+          <w:tcPr>
+            <w:tcW w:type="dxa" w:w="1080"/>
+          </w:tcPr>
+          <w:p>
+            <w:r>
+              <w:t>-1.1</w:t>
+            </w:r>
+          </w:p>
+        </w:tc>
+        <w:tc>
+          <w:tcPr>
+            <w:tcW w:type="dxa" w:w="1080"/>
+          </w:tcPr>
+          <w:p>
+            <w:r>
+              <w:t>0.0</w:t>
+            </w:r>
+          </w:p>
+        </w:tc>
+        <w:tc>
+          <w:tcPr>
+            <w:tcW w:type="dxa" w:w="1080"/>
           </w:tcPr>
           <w:p>
             <w:r>
               <w:t>0 من 12</w:t>
-            </w:r>
-          </w:p>
-        </w:tc>
-        <w:tc>
-          <w:tcPr>
-            <w:tcW w:type="dxa" w:w="1440"/>
-          </w:tcPr>
-          <w:p>
-            <w:r>
-              <w:t>0</w:t>
             </w:r>
           </w:p>
         </w:tc>
@@ -8013,7 +8106,7 @@
       <w:tr>
         <w:tc>
           <w:tcPr>
-            <w:tcW w:type="dxa" w:w="1440"/>
+            <w:tcW w:type="dxa" w:w="1080"/>
           </w:tcPr>
           <w:p>
             <w:r>
@@ -8023,51 +8116,71 @@
         </w:tc>
         <w:tc>
           <w:tcPr>
-            <w:tcW w:type="dxa" w:w="1440"/>
-          </w:tcPr>
-          <w:p>
-            <w:r>
-              <w:t>28.5</w:t>
-            </w:r>
-          </w:p>
-        </w:tc>
-        <w:tc>
-          <w:tcPr>
-            <w:tcW w:type="dxa" w:w="1440"/>
-          </w:tcPr>
-          <w:p>
-            <w:r>
-              <w:t>28.2</w:t>
-            </w:r>
-          </w:p>
-        </w:tc>
-        <w:tc>
-          <w:tcPr>
-            <w:tcW w:type="dxa" w:w="1440"/>
-          </w:tcPr>
-          <w:p>
-            <w:r>
-              <w:t>28.8</w:t>
-            </w:r>
-          </w:p>
-        </w:tc>
-        <w:tc>
-          <w:tcPr>
-            <w:tcW w:type="dxa" w:w="1440"/>
+            <w:tcW w:type="dxa" w:w="1080"/>
+          </w:tcPr>
+          <w:p>
+            <w:r>
+              <w:t>28.4</w:t>
+            </w:r>
+          </w:p>
+        </w:tc>
+        <w:tc>
+          <w:tcPr>
+            <w:tcW w:type="dxa" w:w="1080"/>
+          </w:tcPr>
+          <w:p>
+            <w:r>
+              <w:t>26.1</w:t>
+            </w:r>
+          </w:p>
+        </w:tc>
+        <w:tc>
+          <w:tcPr>
+            <w:tcW w:type="dxa" w:w="1080"/>
+          </w:tcPr>
+          <w:p>
+            <w:r>
+              <w:t>28.9</w:t>
+            </w:r>
+          </w:p>
+        </w:tc>
+        <w:tc>
+          <w:tcPr>
+            <w:tcW w:type="dxa" w:w="1080"/>
+          </w:tcPr>
+          <w:p>
+            <w:r>
+              <w:t>15.2</w:t>
+            </w:r>
+          </w:p>
+        </w:tc>
+        <w:tc>
+          <w:tcPr>
+            <w:tcW w:type="dxa" w:w="1080"/>
+          </w:tcPr>
+          <w:p>
+            <w:r>
+              <w:t>12.5</w:t>
+            </w:r>
+          </w:p>
+        </w:tc>
+        <w:tc>
+          <w:tcPr>
+            <w:tcW w:type="dxa" w:w="1080"/>
+          </w:tcPr>
+          <w:p>
+            <w:r>
+              <w:t>18.3</w:t>
+            </w:r>
+          </w:p>
+        </w:tc>
+        <w:tc>
+          <w:tcPr>
+            <w:tcW w:type="dxa" w:w="1080"/>
           </w:tcPr>
           <w:p>
             <w:r>
               <w:t>12 من 12</w:t>
-            </w:r>
-          </w:p>
-        </w:tc>
-        <w:tc>
-          <w:tcPr>
-            <w:tcW w:type="dxa" w:w="1440"/>
-          </w:tcPr>
-          <w:p>
-            <w:r>
-              <w:t>29.5</w:t>
             </w:r>
           </w:p>
         </w:tc>
@@ -8075,7 +8188,7 @@
       <w:tr>
         <w:tc>
           <w:tcPr>
-            <w:tcW w:type="dxa" w:w="1440"/>
+            <w:tcW w:type="dxa" w:w="1080"/>
           </w:tcPr>
           <w:p>
             <w:r>
@@ -8085,7 +8198,7 @@
         </w:tc>
         <w:tc>
           <w:tcPr>
-            <w:tcW w:type="dxa" w:w="1440"/>
+            <w:tcW w:type="dxa" w:w="1080"/>
           </w:tcPr>
           <w:p>
             <w:r>
@@ -8095,7 +8208,7 @@
         </w:tc>
         <w:tc>
           <w:tcPr>
-            <w:tcW w:type="dxa" w:w="1440"/>
+            <w:tcW w:type="dxa" w:w="1080"/>
           </w:tcPr>
           <w:p>
             <w:r>
@@ -8105,31 +8218,51 @@
         </w:tc>
         <w:tc>
           <w:tcPr>
-            <w:tcW w:type="dxa" w:w="1440"/>
-          </w:tcPr>
-          <w:p>
-            <w:r>
-              <w:t>24.4</w:t>
-            </w:r>
-          </w:p>
-        </w:tc>
-        <w:tc>
-          <w:tcPr>
-            <w:tcW w:type="dxa" w:w="1440"/>
+            <w:tcW w:type="dxa" w:w="1080"/>
+          </w:tcPr>
+          <w:p>
+            <w:r>
+              <w:t>24.3</w:t>
+            </w:r>
+          </w:p>
+        </w:tc>
+        <w:tc>
+          <w:tcPr>
+            <w:tcW w:type="dxa" w:w="1080"/>
+          </w:tcPr>
+          <w:p>
+            <w:r>
+              <w:t>11.8</w:t>
+            </w:r>
+          </w:p>
+        </w:tc>
+        <w:tc>
+          <w:tcPr>
+            <w:tcW w:type="dxa" w:w="1080"/>
+          </w:tcPr>
+          <w:p>
+            <w:r>
+              <w:t>9.4</w:t>
+            </w:r>
+          </w:p>
+        </w:tc>
+        <w:tc>
+          <w:tcPr>
+            <w:tcW w:type="dxa" w:w="1080"/>
+          </w:tcPr>
+          <w:p>
+            <w:r>
+              <w:t>14.6</w:t>
+            </w:r>
+          </w:p>
+        </w:tc>
+        <w:tc>
+          <w:tcPr>
+            <w:tcW w:type="dxa" w:w="1080"/>
           </w:tcPr>
           <w:p>
             <w:r>
               <w:t>12 من 12</w:t>
-            </w:r>
-          </w:p>
-        </w:tc>
-        <w:tc>
-          <w:tcPr>
-            <w:tcW w:type="dxa" w:w="1440"/>
-          </w:tcPr>
-          <w:p>
-            <w:r>
-              <w:t>25.1</w:t>
             </w:r>
           </w:p>
         </w:tc>
@@ -8137,7 +8270,7 @@
       <w:tr>
         <w:tc>
           <w:tcPr>
-            <w:tcW w:type="dxa" w:w="1440"/>
+            <w:tcW w:type="dxa" w:w="1080"/>
           </w:tcPr>
           <w:p>
             <w:r>
@@ -8147,51 +8280,71 @@
         </w:tc>
         <w:tc>
           <w:tcPr>
-            <w:tcW w:type="dxa" w:w="1440"/>
-          </w:tcPr>
-          <w:p>
-            <w:r>
-              <w:t>20.6</w:t>
-            </w:r>
-          </w:p>
-        </w:tc>
-        <w:tc>
-          <w:tcPr>
-            <w:tcW w:type="dxa" w:w="1440"/>
-          </w:tcPr>
-          <w:p>
-            <w:r>
-              <w:t>20.2</w:t>
-            </w:r>
-          </w:p>
-        </w:tc>
-        <w:tc>
-          <w:tcPr>
-            <w:tcW w:type="dxa" w:w="1440"/>
-          </w:tcPr>
-          <w:p>
-            <w:r>
-              <w:t>20.9</w:t>
-            </w:r>
-          </w:p>
-        </w:tc>
-        <w:tc>
-          <w:tcPr>
-            <w:tcW w:type="dxa" w:w="1440"/>
+            <w:tcW w:type="dxa" w:w="1080"/>
+          </w:tcPr>
+          <w:p>
+            <w:r>
+              <w:t>20.1</w:t>
+            </w:r>
+          </w:p>
+        </w:tc>
+        <w:tc>
+          <w:tcPr>
+            <w:tcW w:type="dxa" w:w="1080"/>
+          </w:tcPr>
+          <w:p>
+            <w:r>
+              <w:t>15.6</w:t>
+            </w:r>
+          </w:p>
+        </w:tc>
+        <w:tc>
+          <w:tcPr>
+            <w:tcW w:type="dxa" w:w="1080"/>
+          </w:tcPr>
+          <w:p>
+            <w:r>
+              <w:t>20.8</w:t>
+            </w:r>
+          </w:p>
+        </w:tc>
+        <w:tc>
+          <w:tcPr>
+            <w:tcW w:type="dxa" w:w="1080"/>
+          </w:tcPr>
+          <w:p>
+            <w:r>
+              <w:t>8.8</w:t>
+            </w:r>
+          </w:p>
+        </w:tc>
+        <w:tc>
+          <w:tcPr>
+            <w:tcW w:type="dxa" w:w="1080"/>
+          </w:tcPr>
+          <w:p>
+            <w:r>
+              <w:t>6.0</w:t>
+            </w:r>
+          </w:p>
+        </w:tc>
+        <w:tc>
+          <w:tcPr>
+            <w:tcW w:type="dxa" w:w="1080"/>
+          </w:tcPr>
+          <w:p>
+            <w:r>
+              <w:t>12.1</w:t>
+            </w:r>
+          </w:p>
+        </w:tc>
+        <w:tc>
+          <w:tcPr>
+            <w:tcW w:type="dxa" w:w="1080"/>
           </w:tcPr>
           <w:p>
             <w:r>
               <w:t>12 من 12</w:t>
-            </w:r>
-          </w:p>
-        </w:tc>
-        <w:tc>
-          <w:tcPr>
-            <w:tcW w:type="dxa" w:w="1440"/>
-          </w:tcPr>
-          <w:p>
-            <w:r>
-              <w:t>21.8</w:t>
             </w:r>
           </w:p>
         </w:tc>
@@ -8199,7 +8352,7 @@
       <w:tr>
         <w:tc>
           <w:tcPr>
-            <w:tcW w:type="dxa" w:w="1440"/>
+            <w:tcW w:type="dxa" w:w="1080"/>
           </w:tcPr>
           <w:p>
             <w:r>
@@ -8209,57 +8362,76 @@
         </w:tc>
         <w:tc>
           <w:tcPr>
-            <w:tcW w:type="dxa" w:w="1440"/>
-          </w:tcPr>
-          <w:p>
-            <w:r>
-              <w:t>17.7</w:t>
-            </w:r>
-          </w:p>
-        </w:tc>
-        <w:tc>
-          <w:tcPr>
-            <w:tcW w:type="dxa" w:w="1440"/>
-          </w:tcPr>
-          <w:p>
-            <w:r>
-              <w:t>15.0</w:t>
-            </w:r>
-          </w:p>
-        </w:tc>
-        <w:tc>
-          <w:tcPr>
-            <w:tcW w:type="dxa" w:w="1440"/>
-          </w:tcPr>
-          <w:p>
-            <w:r>
-              <w:t>18.2</w:t>
-            </w:r>
-          </w:p>
-        </w:tc>
-        <w:tc>
-          <w:tcPr>
-            <w:tcW w:type="dxa" w:w="1440"/>
+            <w:tcW w:type="dxa" w:w="1080"/>
+          </w:tcPr>
+          <w:p>
+            <w:r>
+              <w:t>16.6</w:t>
+            </w:r>
+          </w:p>
+        </w:tc>
+        <w:tc>
+          <w:tcPr>
+            <w:tcW w:type="dxa" w:w="1080"/>
+          </w:tcPr>
+          <w:p>
+            <w:r>
+              <w:t>12.2</w:t>
+            </w:r>
+          </w:p>
+        </w:tc>
+        <w:tc>
+          <w:tcPr>
+            <w:tcW w:type="dxa" w:w="1080"/>
+          </w:tcPr>
+          <w:p>
+            <w:r>
+              <w:t>18.0</w:t>
+            </w:r>
+          </w:p>
+        </w:tc>
+        <w:tc>
+          <w:tcPr>
+            <w:tcW w:type="dxa" w:w="1080"/>
+          </w:tcPr>
+          <w:p>
+            <w:r>
+              <w:t>6.8</w:t>
+            </w:r>
+          </w:p>
+        </w:tc>
+        <w:tc>
+          <w:tcPr>
+            <w:tcW w:type="dxa" w:w="1080"/>
+          </w:tcPr>
+          <w:p>
+            <w:r>
+              <w:t>4.0</w:t>
+            </w:r>
+          </w:p>
+        </w:tc>
+        <w:tc>
+          <w:tcPr>
+            <w:tcW w:type="dxa" w:w="1080"/>
+          </w:tcPr>
+          <w:p>
+            <w:r>
+              <w:t>9.6</w:t>
+            </w:r>
+          </w:p>
+        </w:tc>
+        <w:tc>
+          <w:tcPr>
+            <w:tcW w:type="dxa" w:w="1080"/>
           </w:tcPr>
           <w:p>
             <w:r>
               <w:t>12 من 12</w:t>
-            </w:r>
-          </w:p>
-        </w:tc>
-        <w:tc>
-          <w:tcPr>
-            <w:tcW w:type="dxa" w:w="1440"/>
-          </w:tcPr>
-          <w:p>
-            <w:r>
-              <w:t>19.3</w:t>
             </w:r>
           </w:p>
         </w:tc>
       </w:tr>
     </w:tbl>
-    <w:p/>
     <w:p>
       <w:pPr>
         <w:pStyle w:val="ListBullet"/>
@@ -8269,7 +8441,7 @@
         <w:rPr>
           <w:rtl/>
         </w:rPr>
-        <w:t>np ≤ 6: لا فرق بين الاستراتيجيتين (حدود ±1.3%)، متوقع لأن كل الرتب على نوى P المتساوية. هذا يبرر Equal افتراضياً حتى np=4، ويُنهي النتيجة الشاذة السابقة عند np=6.</w:t>
+        <w:t>np ≤ 6: لا فرق بـ LBG؛ والزمن الكلي أبطأ قليلاً بـ Adaptive (0.4–0.5%) بحدود دقة الطباعة (1 ms) وتتسق مع كلفة المعايرة الداخلة بالزمن الكلي.</w:t>
       </w:r>
     </w:p>
     <w:p>
@@ -8281,7 +8453,7 @@
         <w:rPr>
           <w:rtl/>
         </w:rPr>
-        <w:t>np ≥ 8: Adaptive أسرع في 12 من 12 صورة، بكسب 28.3% عند np=8 ينخفض إلى 17.7% عند np=14. التباين بين الصور صغير (±0.3 نقطة عند np=8 و12).</w:t>
+        <w:t>np ≥ 8: Adaptive أسرع بكل الصور الـ12 بـ LBG والزمن الكلي معاً. كسب Total من 15.2% (P=8) إلى 6.8% (P=14). الملون أعلى (17.9→9.4) من الرمادي (13.8→5.5).</w:t>
       </w:r>
     </w:p>
     <w:p>
@@ -8293,7 +8465,7 @@
         <w:rPr>
           <w:rtl/>
         </w:rPr>
-        <w:t>النموذج: كسب Adaptive = 1 − np·r/(6 + (np−6)·r) مع r = سرعة E/سرعة P = 0.642 من المعايرة، يتنبأ بالمقاس بفرق نحو 1 إلى 1.6 نقطة، والنموذج أعلى لأنه يهمل الكلفة الثابتة. التفسير بنسبة السرعات وحدها بلا معاملات مضبوطة على النتائج.</w:t>
+        <w:t>التخفيض المطلق بالزمن الكلي قريب جداً من تخفيض LBG (مثلاً رمادي P=8: 15 ms مقابل 15.6 ms)، فكلفة المعايرة صغيرة نسبةً للكسب.</w:t>
       </w:r>
     </w:p>
     <w:p>
@@ -8305,7 +8477,7 @@
         <w:rPr>
           <w:rtl/>
         </w:rPr>
-        <w:t>صورة Retina أُعيد قياسها بعد أن ظهرت قيم مشبوهة بالتشغيلة الأولى (تدخل خارجي بالجهاز على الأرجح)؛ الجدول يستعمل الإعادة.</w:t>
+        <w:t>تكرارية: جلسة سابقة (LBG فقط) أعطت كسباً متوسطاً 28.5/24.1/20.6/17.7 عند P=8/10/12/14 مقابل 28.4/24.1/20.1/16.6 هنا (فرق ≤1.1 نقطة). بعض الخلايا (Lung CT وChest X-ray وMammogram عند P=12-14 وPeppers عند P=8) كان Adaptive فيها أبطأ مما بالجلسة السابقة، والسبب غير محقق.</w:t>
       </w:r>
     </w:p>
     <w:p>
@@ -8317,7 +8489,7 @@
         <w:rPr>
           <w:rtl/>
         </w:rPr>
-        <w:t>ملف الأزمنة الخام eq_ad_raw.csv محفوظ عند الباحثة ويُرفق كدليل.</w:t>
+        <w:t>النموذج (r=0.642) يتنبأ بكسب LBG 29.5/25.1/21.8/19.3 مقابل المقاس 28.4/24.1/20.1/16.6 (فرق 1.0–2.7 نقطة).</w:t>
       </w:r>
     </w:p>
     <w:p>

</xml_diff>

<commit_message>
Update notes: throughput, entropy and total-time campaign done
</commit_message>
<xml_diff>
--- a/results/NOTES_FINAL.docx
+++ b/results/NOTES_FINAL.docx
@@ -8513,7 +8513,7 @@
         <w:rPr>
           <w:rtl/>
         </w:rPr>
-        <w:t>Throughput: نعرّفه N×I/T_LBG (متجه/ثانية) ونرسمه من الـ xlsx بلا تشغيل جديد؛ علماً أن نسبته المتوازي/المتسلسل = التسارع، فهو عرض آخر لنفس المعلومة.</w:t>
+        <w:t>Throughput: أُنجز. معرّف N×I/T_LBG ومحسوب من الأزمنة المقاسة (ورقة Throughput وجدول 4.16 الاختياري). نسبته إلى المتسلسل تساوي التسارع.</w:t>
       </w:r>
     </w:p>
     <w:p>
@@ -8525,7 +8525,7 @@
         <w:rPr>
           <w:rtl/>
         </w:rPr>
-        <w:t>Entropy: يحتاج اسم الملف الأولي الذي يحسبه. يُقبل فقط إذا ولّدته النسخة النهائية على الصور النهائية، ويُقاس فعلاً (مؤشرات VQ أو تيار الدلتا). يسمح بتفسير اختلاف CR بين الصور.</w:t>
+        <w:t>Entropy: أُنجز للصور الرمادية (جدول 4.17 وفقرته). الدلتا خفّضته لكل الصور (0.19–2.13 بت)، وترتيب CR يطابق ترتيب entropy بعد الدلتا. الملون لا يحسبه الكود.</w:t>
       </w:r>
     </w:p>
     <w:p>
@@ -8549,7 +8549,7 @@
         <w:rPr>
           <w:rtl/>
         </w:rPr>
-        <w:t>حملة Equal/Adaptive بالزمن الكلي (run_eq_ad_total.sh): اختيارية، تُشغَّل بعد الكتابة، وإن شُغّلت تُعتمد جداولها الجديدة بدل 4.12 و4.13 كاملةً.</w:t>
+        <w:t>حملة Equal/Adaptive بالزمن الكلي: أُنجزت (موحدة، LBG والكلي معاً)؛ Adaptive أفضل بالنظام الكامل من P=8 (15.2% إلى 6.8%). الخلايا الخمس الشاذة أُعيد قياسها (جدول 4.15): لم تتكرر، والمعايرة لا تفسرها.</w:t>
       </w:r>
     </w:p>
     <w:p>

</xml_diff>